<commit_message>
Added documentation for use cases
Signed-off-by: tanahia <sofi.bookfan@gmail.com>
</commit_message>
<xml_diff>
--- a/report/report.docx
+++ b/report/report.docx
@@ -19514,6 +19514,3217 @@
       </w:tr>
     </w:tbl>
     <w:p/>
+    <w:p>
+      <w:pPr>
+        <w:pStyle w:val="Heading1"/>
+      </w:pPr>
+      <w:r>
+        <w:t>Use-case model</w:t>
+      </w:r>
+      <w:r>
+        <w:t>:</w:t>
+      </w:r>
+    </w:p>
+    <w:p>
+      <w:pPr>
+        <w:pStyle w:val="Heading2"/>
+      </w:pPr>
+      <w:r>
+        <w:t>Use-case catalogue:</w:t>
+      </w:r>
+    </w:p>
+    <w:tbl>
+      <w:tblPr>
+        <w:tblW w:w="0" w:type="dxa"/>
+        <w:tblBorders>
+          <w:top w:val="outset" w:sz="6" w:space="0" w:color="auto"/>
+          <w:left w:val="outset" w:sz="6" w:space="0" w:color="auto"/>
+          <w:bottom w:val="outset" w:sz="6" w:space="0" w:color="auto"/>
+          <w:right w:val="outset" w:sz="6" w:space="0" w:color="auto"/>
+        </w:tblBorders>
+        <w:tblCellMar>
+          <w:left w:w="0" w:type="dxa"/>
+          <w:right w:w="0" w:type="dxa"/>
+        </w:tblCellMar>
+        <w:tblLook w:val="04A0" w:firstRow="1" w:lastRow="0" w:firstColumn="1" w:lastColumn="0" w:noHBand="0" w:noVBand="1"/>
+      </w:tblPr>
+      <w:tblGrid>
+        <w:gridCol w:w="1800"/>
+        <w:gridCol w:w="1800"/>
+        <w:gridCol w:w="1800"/>
+        <w:gridCol w:w="1800"/>
+        <w:gridCol w:w="1800"/>
+      </w:tblGrid>
+      <w:tr>
+        <w:trPr>
+          <w:trHeight w:val="285"/>
+        </w:trPr>
+        <w:tc>
+          <w:tcPr>
+            <w:tcW w:w="1800" w:type="dxa"/>
+            <w:tcBorders>
+              <w:top w:val="single" w:sz="6" w:space="0" w:color="000000"/>
+              <w:left w:val="single" w:sz="6" w:space="0" w:color="000000"/>
+              <w:bottom w:val="single" w:sz="6" w:space="0" w:color="000000"/>
+              <w:right w:val="single" w:sz="6" w:space="0" w:color="000000"/>
+            </w:tcBorders>
+            <w:hideMark/>
+          </w:tcPr>
+          <w:p>
+            <w:pPr>
+              <w:rPr>
+                <w:lang w:val="en-US"/>
+              </w:rPr>
+            </w:pPr>
+            <w:r>
+              <w:t>Use case</w:t>
+            </w:r>
+            <w:r>
+              <w:rPr>
+                <w:lang w:val="en-US"/>
+              </w:rPr>
+              <w:t> </w:t>
+            </w:r>
+          </w:p>
+        </w:tc>
+        <w:tc>
+          <w:tcPr>
+            <w:tcW w:w="1800" w:type="dxa"/>
+            <w:tcBorders>
+              <w:top w:val="single" w:sz="6" w:space="0" w:color="000000"/>
+              <w:left w:val="single" w:sz="6" w:space="0" w:color="000000"/>
+              <w:bottom w:val="single" w:sz="6" w:space="0" w:color="000000"/>
+              <w:right w:val="single" w:sz="6" w:space="0" w:color="000000"/>
+            </w:tcBorders>
+            <w:hideMark/>
+          </w:tcPr>
+          <w:p>
+            <w:pPr>
+              <w:rPr>
+                <w:lang w:val="en-US"/>
+              </w:rPr>
+            </w:pPr>
+            <w:r>
+              <w:t>Primary actor</w:t>
+            </w:r>
+            <w:r>
+              <w:rPr>
+                <w:lang w:val="en-US"/>
+              </w:rPr>
+              <w:t> </w:t>
+            </w:r>
+          </w:p>
+        </w:tc>
+        <w:tc>
+          <w:tcPr>
+            <w:tcW w:w="1800" w:type="dxa"/>
+            <w:tcBorders>
+              <w:top w:val="single" w:sz="6" w:space="0" w:color="000000"/>
+              <w:left w:val="single" w:sz="6" w:space="0" w:color="000000"/>
+              <w:bottom w:val="single" w:sz="6" w:space="0" w:color="000000"/>
+              <w:right w:val="single" w:sz="6" w:space="0" w:color="000000"/>
+            </w:tcBorders>
+            <w:hideMark/>
+          </w:tcPr>
+          <w:p>
+            <w:pPr>
+              <w:rPr>
+                <w:lang w:val="en-US"/>
+              </w:rPr>
+            </w:pPr>
+            <w:r>
+              <w:t>Goal</w:t>
+            </w:r>
+            <w:r>
+              <w:rPr>
+                <w:lang w:val="en-US"/>
+              </w:rPr>
+              <w:t> </w:t>
+            </w:r>
+          </w:p>
+        </w:tc>
+        <w:tc>
+          <w:tcPr>
+            <w:tcW w:w="1800" w:type="dxa"/>
+            <w:tcBorders>
+              <w:top w:val="single" w:sz="6" w:space="0" w:color="000000"/>
+              <w:left w:val="single" w:sz="6" w:space="0" w:color="000000"/>
+              <w:bottom w:val="single" w:sz="6" w:space="0" w:color="000000"/>
+              <w:right w:val="single" w:sz="6" w:space="0" w:color="000000"/>
+            </w:tcBorders>
+            <w:hideMark/>
+          </w:tcPr>
+          <w:p>
+            <w:pPr>
+              <w:rPr>
+                <w:lang w:val="en-US"/>
+              </w:rPr>
+            </w:pPr>
+            <w:r>
+              <w:t>Related requirements</w:t>
+            </w:r>
+            <w:r>
+              <w:rPr>
+                <w:lang w:val="en-US"/>
+              </w:rPr>
+              <w:t> </w:t>
+            </w:r>
+          </w:p>
+        </w:tc>
+        <w:tc>
+          <w:tcPr>
+            <w:tcW w:w="1800" w:type="dxa"/>
+            <w:tcBorders>
+              <w:top w:val="single" w:sz="6" w:space="0" w:color="000000"/>
+              <w:left w:val="single" w:sz="6" w:space="0" w:color="000000"/>
+              <w:bottom w:val="single" w:sz="6" w:space="0" w:color="000000"/>
+              <w:right w:val="single" w:sz="6" w:space="0" w:color="000000"/>
+            </w:tcBorders>
+            <w:hideMark/>
+          </w:tcPr>
+          <w:p>
+            <w:pPr>
+              <w:rPr>
+                <w:lang w:val="en-US"/>
+              </w:rPr>
+            </w:pPr>
+            <w:r>
+              <w:t>Related problem</w:t>
+            </w:r>
+            <w:r>
+              <w:rPr>
+                <w:lang w:val="en-US"/>
+              </w:rPr>
+              <w:t> </w:t>
+            </w:r>
+          </w:p>
+        </w:tc>
+      </w:tr>
+      <w:tr>
+        <w:trPr>
+          <w:trHeight w:val="285"/>
+        </w:trPr>
+        <w:tc>
+          <w:tcPr>
+            <w:tcW w:w="1800" w:type="dxa"/>
+            <w:tcBorders>
+              <w:top w:val="single" w:sz="6" w:space="0" w:color="000000"/>
+              <w:left w:val="single" w:sz="6" w:space="0" w:color="000000"/>
+              <w:bottom w:val="single" w:sz="6" w:space="0" w:color="000000"/>
+              <w:right w:val="single" w:sz="6" w:space="0" w:color="000000"/>
+            </w:tcBorders>
+            <w:hideMark/>
+          </w:tcPr>
+          <w:p>
+            <w:pPr>
+              <w:rPr>
+                <w:lang w:val="en-US"/>
+              </w:rPr>
+            </w:pPr>
+            <w:r>
+              <w:t>U1 – Record an unavailable space</w:t>
+            </w:r>
+            <w:r>
+              <w:rPr>
+                <w:lang w:val="en-US"/>
+              </w:rPr>
+              <w:t> </w:t>
+            </w:r>
+          </w:p>
+        </w:tc>
+        <w:tc>
+          <w:tcPr>
+            <w:tcW w:w="1800" w:type="dxa"/>
+            <w:tcBorders>
+              <w:top w:val="single" w:sz="6" w:space="0" w:color="000000"/>
+              <w:left w:val="single" w:sz="6" w:space="0" w:color="000000"/>
+              <w:bottom w:val="single" w:sz="6" w:space="0" w:color="000000"/>
+              <w:right w:val="single" w:sz="6" w:space="0" w:color="000000"/>
+            </w:tcBorders>
+            <w:hideMark/>
+          </w:tcPr>
+          <w:p>
+            <w:pPr>
+              <w:rPr>
+                <w:lang w:val="en-US"/>
+              </w:rPr>
+            </w:pPr>
+            <w:r>
+              <w:t>Staff member</w:t>
+            </w:r>
+            <w:r>
+              <w:rPr>
+                <w:lang w:val="en-US"/>
+              </w:rPr>
+              <w:t> </w:t>
+            </w:r>
+          </w:p>
+        </w:tc>
+        <w:tc>
+          <w:tcPr>
+            <w:tcW w:w="1800" w:type="dxa"/>
+            <w:tcBorders>
+              <w:top w:val="single" w:sz="6" w:space="0" w:color="000000"/>
+              <w:left w:val="single" w:sz="6" w:space="0" w:color="000000"/>
+              <w:bottom w:val="single" w:sz="6" w:space="0" w:color="000000"/>
+              <w:right w:val="single" w:sz="6" w:space="0" w:color="000000"/>
+            </w:tcBorders>
+            <w:hideMark/>
+          </w:tcPr>
+          <w:p>
+            <w:pPr>
+              <w:rPr>
+                <w:lang w:val="en-US"/>
+              </w:rPr>
+            </w:pPr>
+            <w:r>
+              <w:t>Record a single space as unavailable for a date and time range with a reason without closing the whole facility.</w:t>
+            </w:r>
+            <w:r>
+              <w:rPr>
+                <w:lang w:val="en-US"/>
+              </w:rPr>
+              <w:t> </w:t>
+            </w:r>
+          </w:p>
+        </w:tc>
+        <w:tc>
+          <w:tcPr>
+            <w:tcW w:w="1800" w:type="dxa"/>
+            <w:tcBorders>
+              <w:top w:val="single" w:sz="6" w:space="0" w:color="000000"/>
+              <w:left w:val="single" w:sz="6" w:space="0" w:color="000000"/>
+              <w:bottom w:val="single" w:sz="6" w:space="0" w:color="000000"/>
+              <w:right w:val="single" w:sz="6" w:space="0" w:color="000000"/>
+            </w:tcBorders>
+            <w:hideMark/>
+          </w:tcPr>
+          <w:p>
+            <w:pPr>
+              <w:rPr>
+                <w:lang w:val="en-US"/>
+              </w:rPr>
+            </w:pPr>
+            <w:r>
+              <w:t>FR1</w:t>
+            </w:r>
+            <w:r>
+              <w:rPr>
+                <w:lang w:val="en-US"/>
+              </w:rPr>
+              <w:t> </w:t>
+            </w:r>
+          </w:p>
+        </w:tc>
+        <w:tc>
+          <w:tcPr>
+            <w:tcW w:w="1800" w:type="dxa"/>
+            <w:tcBorders>
+              <w:top w:val="single" w:sz="6" w:space="0" w:color="000000"/>
+              <w:left w:val="single" w:sz="6" w:space="0" w:color="000000"/>
+              <w:bottom w:val="single" w:sz="6" w:space="0" w:color="000000"/>
+              <w:right w:val="single" w:sz="6" w:space="0" w:color="000000"/>
+            </w:tcBorders>
+            <w:hideMark/>
+          </w:tcPr>
+          <w:p>
+            <w:pPr>
+              <w:rPr>
+                <w:lang w:val="en-US"/>
+              </w:rPr>
+            </w:pPr>
+            <w:r>
+              <w:t>P1</w:t>
+            </w:r>
+            <w:r>
+              <w:rPr>
+                <w:lang w:val="en-US"/>
+              </w:rPr>
+              <w:t> </w:t>
+            </w:r>
+          </w:p>
+        </w:tc>
+      </w:tr>
+      <w:tr>
+        <w:trPr>
+          <w:trHeight w:val="2010"/>
+        </w:trPr>
+        <w:tc>
+          <w:tcPr>
+            <w:tcW w:w="1800" w:type="dxa"/>
+            <w:tcBorders>
+              <w:top w:val="single" w:sz="6" w:space="0" w:color="000000"/>
+              <w:left w:val="single" w:sz="6" w:space="0" w:color="000000"/>
+              <w:bottom w:val="single" w:sz="6" w:space="0" w:color="000000"/>
+              <w:right w:val="single" w:sz="6" w:space="0" w:color="000000"/>
+            </w:tcBorders>
+            <w:hideMark/>
+          </w:tcPr>
+          <w:p>
+            <w:pPr>
+              <w:rPr>
+                <w:lang w:val="en-US"/>
+              </w:rPr>
+            </w:pPr>
+            <w:r>
+              <w:t>U2 – Record unavailable equipment</w:t>
+            </w:r>
+            <w:r>
+              <w:rPr>
+                <w:lang w:val="en-US"/>
+              </w:rPr>
+              <w:t> </w:t>
+            </w:r>
+          </w:p>
+        </w:tc>
+        <w:tc>
+          <w:tcPr>
+            <w:tcW w:w="1800" w:type="dxa"/>
+            <w:tcBorders>
+              <w:top w:val="single" w:sz="6" w:space="0" w:color="000000"/>
+              <w:left w:val="single" w:sz="6" w:space="0" w:color="000000"/>
+              <w:bottom w:val="single" w:sz="6" w:space="0" w:color="000000"/>
+              <w:right w:val="single" w:sz="6" w:space="0" w:color="000000"/>
+            </w:tcBorders>
+            <w:hideMark/>
+          </w:tcPr>
+          <w:p>
+            <w:pPr>
+              <w:rPr>
+                <w:lang w:val="en-US"/>
+              </w:rPr>
+            </w:pPr>
+            <w:r>
+              <w:t>Staff member</w:t>
+            </w:r>
+            <w:r>
+              <w:rPr>
+                <w:lang w:val="en-US"/>
+              </w:rPr>
+              <w:t> </w:t>
+            </w:r>
+          </w:p>
+        </w:tc>
+        <w:tc>
+          <w:tcPr>
+            <w:tcW w:w="1800" w:type="dxa"/>
+            <w:tcBorders>
+              <w:top w:val="single" w:sz="6" w:space="0" w:color="000000"/>
+              <w:left w:val="single" w:sz="6" w:space="0" w:color="000000"/>
+              <w:bottom w:val="single" w:sz="6" w:space="0" w:color="000000"/>
+              <w:right w:val="single" w:sz="6" w:space="0" w:color="000000"/>
+            </w:tcBorders>
+            <w:hideMark/>
+          </w:tcPr>
+          <w:p>
+            <w:pPr>
+              <w:rPr>
+                <w:lang w:val="en-US"/>
+              </w:rPr>
+            </w:pPr>
+            <w:r>
+              <w:t>Record a single equipment item as unavailable for a date and time range with a reason.</w:t>
+            </w:r>
+            <w:r>
+              <w:rPr>
+                <w:lang w:val="en-US"/>
+              </w:rPr>
+              <w:t> </w:t>
+            </w:r>
+          </w:p>
+        </w:tc>
+        <w:tc>
+          <w:tcPr>
+            <w:tcW w:w="1800" w:type="dxa"/>
+            <w:tcBorders>
+              <w:top w:val="single" w:sz="6" w:space="0" w:color="000000"/>
+              <w:left w:val="single" w:sz="6" w:space="0" w:color="000000"/>
+              <w:bottom w:val="single" w:sz="6" w:space="0" w:color="000000"/>
+              <w:right w:val="single" w:sz="6" w:space="0" w:color="000000"/>
+            </w:tcBorders>
+            <w:hideMark/>
+          </w:tcPr>
+          <w:p>
+            <w:pPr>
+              <w:rPr>
+                <w:lang w:val="en-US"/>
+              </w:rPr>
+            </w:pPr>
+            <w:r>
+              <w:rPr>
+                <w:lang w:val="en-US"/>
+              </w:rPr>
+              <w:t> </w:t>
+            </w:r>
+          </w:p>
+        </w:tc>
+        <w:tc>
+          <w:tcPr>
+            <w:tcW w:w="1800" w:type="dxa"/>
+            <w:tcBorders>
+              <w:top w:val="single" w:sz="6" w:space="0" w:color="000000"/>
+              <w:left w:val="single" w:sz="6" w:space="0" w:color="000000"/>
+              <w:bottom w:val="single" w:sz="6" w:space="0" w:color="000000"/>
+              <w:right w:val="single" w:sz="6" w:space="0" w:color="000000"/>
+            </w:tcBorders>
+            <w:hideMark/>
+          </w:tcPr>
+          <w:p>
+            <w:pPr>
+              <w:rPr>
+                <w:lang w:val="en-US"/>
+              </w:rPr>
+            </w:pPr>
+            <w:r>
+              <w:rPr>
+                <w:lang w:val="en-US"/>
+              </w:rPr>
+              <w:t> </w:t>
+            </w:r>
+          </w:p>
+        </w:tc>
+      </w:tr>
+      <w:tr>
+        <w:trPr>
+          <w:trHeight w:val="285"/>
+        </w:trPr>
+        <w:tc>
+          <w:tcPr>
+            <w:tcW w:w="1800" w:type="dxa"/>
+            <w:tcBorders>
+              <w:top w:val="single" w:sz="6" w:space="0" w:color="000000"/>
+              <w:left w:val="single" w:sz="6" w:space="0" w:color="000000"/>
+              <w:bottom w:val="single" w:sz="6" w:space="0" w:color="000000"/>
+              <w:right w:val="single" w:sz="6" w:space="0" w:color="000000"/>
+            </w:tcBorders>
+            <w:hideMark/>
+          </w:tcPr>
+          <w:p>
+            <w:pPr>
+              <w:rPr>
+                <w:lang w:val="en-US"/>
+              </w:rPr>
+            </w:pPr>
+            <w:r>
+              <w:t>U3 - View combined availability</w:t>
+            </w:r>
+            <w:r>
+              <w:rPr>
+                <w:lang w:val="en-US"/>
+              </w:rPr>
+              <w:t> </w:t>
+            </w:r>
+          </w:p>
+        </w:tc>
+        <w:tc>
+          <w:tcPr>
+            <w:tcW w:w="1800" w:type="dxa"/>
+            <w:tcBorders>
+              <w:top w:val="single" w:sz="6" w:space="0" w:color="000000"/>
+              <w:left w:val="single" w:sz="6" w:space="0" w:color="000000"/>
+              <w:bottom w:val="single" w:sz="6" w:space="0" w:color="000000"/>
+              <w:right w:val="single" w:sz="6" w:space="0" w:color="000000"/>
+            </w:tcBorders>
+            <w:hideMark/>
+          </w:tcPr>
+          <w:p>
+            <w:pPr>
+              <w:rPr>
+                <w:lang w:val="en-US"/>
+              </w:rPr>
+            </w:pPr>
+            <w:r>
+              <w:t>Staff member</w:t>
+            </w:r>
+            <w:r>
+              <w:rPr>
+                <w:lang w:val="en-US"/>
+              </w:rPr>
+              <w:t> </w:t>
+            </w:r>
+          </w:p>
+        </w:tc>
+        <w:tc>
+          <w:tcPr>
+            <w:tcW w:w="1800" w:type="dxa"/>
+            <w:tcBorders>
+              <w:top w:val="single" w:sz="6" w:space="0" w:color="000000"/>
+              <w:left w:val="single" w:sz="6" w:space="0" w:color="000000"/>
+              <w:bottom w:val="single" w:sz="6" w:space="0" w:color="000000"/>
+              <w:right w:val="single" w:sz="6" w:space="0" w:color="000000"/>
+            </w:tcBorders>
+            <w:hideMark/>
+          </w:tcPr>
+          <w:p>
+            <w:pPr>
+              <w:rPr>
+                <w:lang w:val="en-US"/>
+              </w:rPr>
+            </w:pPr>
+            <w:r>
+              <w:t xml:space="preserve">View available equipment and spaces in facility together to </w:t>
+            </w:r>
+            <w:r>
+              <w:lastRenderedPageBreak/>
+              <w:t>check which spaces and equipment are free.</w:t>
+            </w:r>
+            <w:r>
+              <w:rPr>
+                <w:lang w:val="en-US"/>
+              </w:rPr>
+              <w:t> </w:t>
+            </w:r>
+          </w:p>
+        </w:tc>
+        <w:tc>
+          <w:tcPr>
+            <w:tcW w:w="1800" w:type="dxa"/>
+            <w:tcBorders>
+              <w:top w:val="single" w:sz="6" w:space="0" w:color="000000"/>
+              <w:left w:val="single" w:sz="6" w:space="0" w:color="000000"/>
+              <w:bottom w:val="single" w:sz="6" w:space="0" w:color="000000"/>
+              <w:right w:val="single" w:sz="6" w:space="0" w:color="000000"/>
+            </w:tcBorders>
+            <w:hideMark/>
+          </w:tcPr>
+          <w:p>
+            <w:pPr>
+              <w:rPr>
+                <w:lang w:val="en-US"/>
+              </w:rPr>
+            </w:pPr>
+            <w:r>
+              <w:lastRenderedPageBreak/>
+              <w:t>FR2</w:t>
+            </w:r>
+            <w:r>
+              <w:rPr>
+                <w:lang w:val="en-US"/>
+              </w:rPr>
+              <w:t> </w:t>
+            </w:r>
+          </w:p>
+        </w:tc>
+        <w:tc>
+          <w:tcPr>
+            <w:tcW w:w="1800" w:type="dxa"/>
+            <w:tcBorders>
+              <w:top w:val="single" w:sz="6" w:space="0" w:color="000000"/>
+              <w:left w:val="single" w:sz="6" w:space="0" w:color="000000"/>
+              <w:bottom w:val="single" w:sz="6" w:space="0" w:color="000000"/>
+              <w:right w:val="single" w:sz="6" w:space="0" w:color="000000"/>
+            </w:tcBorders>
+            <w:hideMark/>
+          </w:tcPr>
+          <w:p>
+            <w:pPr>
+              <w:rPr>
+                <w:lang w:val="en-US"/>
+              </w:rPr>
+            </w:pPr>
+            <w:r>
+              <w:t>P1</w:t>
+            </w:r>
+            <w:r>
+              <w:rPr>
+                <w:lang w:val="en-US"/>
+              </w:rPr>
+              <w:t> </w:t>
+            </w:r>
+          </w:p>
+        </w:tc>
+      </w:tr>
+      <w:tr>
+        <w:trPr>
+          <w:trHeight w:val="285"/>
+        </w:trPr>
+        <w:tc>
+          <w:tcPr>
+            <w:tcW w:w="1800" w:type="dxa"/>
+            <w:tcBorders>
+              <w:top w:val="single" w:sz="6" w:space="0" w:color="000000"/>
+              <w:left w:val="single" w:sz="6" w:space="0" w:color="000000"/>
+              <w:bottom w:val="single" w:sz="6" w:space="0" w:color="000000"/>
+              <w:right w:val="single" w:sz="6" w:space="0" w:color="000000"/>
+            </w:tcBorders>
+            <w:hideMark/>
+          </w:tcPr>
+          <w:p>
+            <w:pPr>
+              <w:rPr>
+                <w:lang w:val="en-US"/>
+              </w:rPr>
+            </w:pPr>
+            <w:r>
+              <w:t>U4 - Submit booking request</w:t>
+            </w:r>
+            <w:r>
+              <w:rPr>
+                <w:lang w:val="en-US"/>
+              </w:rPr>
+              <w:t> </w:t>
+            </w:r>
+          </w:p>
+        </w:tc>
+        <w:tc>
+          <w:tcPr>
+            <w:tcW w:w="1800" w:type="dxa"/>
+            <w:tcBorders>
+              <w:top w:val="single" w:sz="6" w:space="0" w:color="000000"/>
+              <w:left w:val="single" w:sz="6" w:space="0" w:color="000000"/>
+              <w:bottom w:val="single" w:sz="6" w:space="0" w:color="000000"/>
+              <w:right w:val="single" w:sz="6" w:space="0" w:color="000000"/>
+            </w:tcBorders>
+            <w:hideMark/>
+          </w:tcPr>
+          <w:p>
+            <w:pPr>
+              <w:rPr>
+                <w:lang w:val="en-US"/>
+              </w:rPr>
+            </w:pPr>
+            <w:r>
+              <w:t>Casual group, coach; Partnership programmes and league; School; Club</w:t>
+            </w:r>
+            <w:r>
+              <w:rPr>
+                <w:lang w:val="en-US"/>
+              </w:rPr>
+              <w:t> </w:t>
+            </w:r>
+          </w:p>
+        </w:tc>
+        <w:tc>
+          <w:tcPr>
+            <w:tcW w:w="1800" w:type="dxa"/>
+            <w:tcBorders>
+              <w:top w:val="single" w:sz="6" w:space="0" w:color="000000"/>
+              <w:left w:val="single" w:sz="6" w:space="0" w:color="000000"/>
+              <w:bottom w:val="single" w:sz="6" w:space="0" w:color="000000"/>
+              <w:right w:val="single" w:sz="6" w:space="0" w:color="000000"/>
+            </w:tcBorders>
+            <w:hideMark/>
+          </w:tcPr>
+          <w:p>
+            <w:pPr>
+              <w:rPr>
+                <w:lang w:val="en-US"/>
+              </w:rPr>
+            </w:pPr>
+            <w:r>
+              <w:t>Request a space and equipment for a date and within specific timeslot and with agreed setup and reset time included (A: staff may enter the request on the group’s behalf).</w:t>
+            </w:r>
+            <w:r>
+              <w:rPr>
+                <w:lang w:val="en-US"/>
+              </w:rPr>
+              <w:t> </w:t>
+            </w:r>
+          </w:p>
+        </w:tc>
+        <w:tc>
+          <w:tcPr>
+            <w:tcW w:w="1800" w:type="dxa"/>
+            <w:tcBorders>
+              <w:top w:val="single" w:sz="6" w:space="0" w:color="000000"/>
+              <w:left w:val="single" w:sz="6" w:space="0" w:color="000000"/>
+              <w:bottom w:val="single" w:sz="6" w:space="0" w:color="000000"/>
+              <w:right w:val="single" w:sz="6" w:space="0" w:color="000000"/>
+            </w:tcBorders>
+            <w:hideMark/>
+          </w:tcPr>
+          <w:p>
+            <w:pPr>
+              <w:rPr>
+                <w:lang w:val="en-US"/>
+              </w:rPr>
+            </w:pPr>
+            <w:r>
+              <w:t>FR6, FR7, FR8</w:t>
+            </w:r>
+            <w:r>
+              <w:rPr>
+                <w:lang w:val="en-US"/>
+              </w:rPr>
+              <w:t> </w:t>
+            </w:r>
+          </w:p>
+        </w:tc>
+        <w:tc>
+          <w:tcPr>
+            <w:tcW w:w="1800" w:type="dxa"/>
+            <w:tcBorders>
+              <w:top w:val="single" w:sz="6" w:space="0" w:color="000000"/>
+              <w:left w:val="single" w:sz="6" w:space="0" w:color="000000"/>
+              <w:bottom w:val="single" w:sz="6" w:space="0" w:color="000000"/>
+              <w:right w:val="single" w:sz="6" w:space="0" w:color="000000"/>
+            </w:tcBorders>
+            <w:hideMark/>
+          </w:tcPr>
+          <w:p>
+            <w:pPr>
+              <w:rPr>
+                <w:lang w:val="en-US"/>
+              </w:rPr>
+            </w:pPr>
+            <w:r>
+              <w:t>P5, P6, P7</w:t>
+            </w:r>
+            <w:r>
+              <w:rPr>
+                <w:lang w:val="en-US"/>
+              </w:rPr>
+              <w:t> </w:t>
+            </w:r>
+          </w:p>
+        </w:tc>
+      </w:tr>
+      <w:tr>
+        <w:trPr>
+          <w:trHeight w:val="285"/>
+        </w:trPr>
+        <w:tc>
+          <w:tcPr>
+            <w:tcW w:w="1800" w:type="dxa"/>
+            <w:tcBorders>
+              <w:top w:val="single" w:sz="6" w:space="0" w:color="000000"/>
+              <w:left w:val="single" w:sz="6" w:space="0" w:color="000000"/>
+              <w:bottom w:val="single" w:sz="6" w:space="0" w:color="000000"/>
+              <w:right w:val="single" w:sz="6" w:space="0" w:color="000000"/>
+            </w:tcBorders>
+            <w:hideMark/>
+          </w:tcPr>
+          <w:p>
+            <w:pPr>
+              <w:rPr>
+                <w:lang w:val="en-US"/>
+              </w:rPr>
+            </w:pPr>
+            <w:r>
+              <w:t>U5 - Process booking request</w:t>
+            </w:r>
+            <w:r>
+              <w:rPr>
+                <w:lang w:val="en-US"/>
+              </w:rPr>
+              <w:t> </w:t>
+            </w:r>
+          </w:p>
+        </w:tc>
+        <w:tc>
+          <w:tcPr>
+            <w:tcW w:w="1800" w:type="dxa"/>
+            <w:tcBorders>
+              <w:top w:val="single" w:sz="6" w:space="0" w:color="000000"/>
+              <w:left w:val="single" w:sz="6" w:space="0" w:color="000000"/>
+              <w:bottom w:val="single" w:sz="6" w:space="0" w:color="000000"/>
+              <w:right w:val="single" w:sz="6" w:space="0" w:color="000000"/>
+            </w:tcBorders>
+            <w:hideMark/>
+          </w:tcPr>
+          <w:p>
+            <w:pPr>
+              <w:rPr>
+                <w:lang w:val="en-US"/>
+              </w:rPr>
+            </w:pPr>
+            <w:r>
+              <w:t>Staff member</w:t>
+            </w:r>
+            <w:r>
+              <w:rPr>
+                <w:lang w:val="en-US"/>
+              </w:rPr>
+              <w:t> </w:t>
+            </w:r>
+          </w:p>
+        </w:tc>
+        <w:tc>
+          <w:tcPr>
+            <w:tcW w:w="1800" w:type="dxa"/>
+            <w:tcBorders>
+              <w:top w:val="single" w:sz="6" w:space="0" w:color="000000"/>
+              <w:left w:val="single" w:sz="6" w:space="0" w:color="000000"/>
+              <w:bottom w:val="single" w:sz="6" w:space="0" w:color="000000"/>
+              <w:right w:val="single" w:sz="6" w:space="0" w:color="000000"/>
+            </w:tcBorders>
+            <w:hideMark/>
+          </w:tcPr>
+          <w:p>
+            <w:pPr>
+              <w:rPr>
+                <w:lang w:val="en-US"/>
+              </w:rPr>
+            </w:pPr>
+            <w:r>
+              <w:t>Check priority rules, space availability and process request if it's suitable.</w:t>
+            </w:r>
+            <w:r>
+              <w:rPr>
+                <w:lang w:val="en-US"/>
+              </w:rPr>
+              <w:t> </w:t>
+            </w:r>
+          </w:p>
+        </w:tc>
+        <w:tc>
+          <w:tcPr>
+            <w:tcW w:w="1800" w:type="dxa"/>
+            <w:tcBorders>
+              <w:top w:val="single" w:sz="6" w:space="0" w:color="000000"/>
+              <w:left w:val="single" w:sz="6" w:space="0" w:color="000000"/>
+              <w:bottom w:val="single" w:sz="6" w:space="0" w:color="000000"/>
+              <w:right w:val="single" w:sz="6" w:space="0" w:color="000000"/>
+            </w:tcBorders>
+            <w:hideMark/>
+          </w:tcPr>
+          <w:p>
+            <w:pPr>
+              <w:rPr>
+                <w:lang w:val="en-US"/>
+              </w:rPr>
+            </w:pPr>
+            <w:r>
+              <w:rPr>
+                <w:lang w:val="en-US"/>
+              </w:rPr>
+              <w:t> </w:t>
+            </w:r>
+          </w:p>
+        </w:tc>
+        <w:tc>
+          <w:tcPr>
+            <w:tcW w:w="1800" w:type="dxa"/>
+            <w:tcBorders>
+              <w:top w:val="single" w:sz="6" w:space="0" w:color="000000"/>
+              <w:left w:val="single" w:sz="6" w:space="0" w:color="000000"/>
+              <w:bottom w:val="single" w:sz="6" w:space="0" w:color="000000"/>
+              <w:right w:val="single" w:sz="6" w:space="0" w:color="000000"/>
+            </w:tcBorders>
+            <w:hideMark/>
+          </w:tcPr>
+          <w:p>
+            <w:pPr>
+              <w:rPr>
+                <w:lang w:val="en-US"/>
+              </w:rPr>
+            </w:pPr>
+            <w:r>
+              <w:rPr>
+                <w:lang w:val="en-US"/>
+              </w:rPr>
+              <w:t> </w:t>
+            </w:r>
+          </w:p>
+        </w:tc>
+      </w:tr>
+      <w:tr>
+        <w:trPr>
+          <w:trHeight w:val="285"/>
+        </w:trPr>
+        <w:tc>
+          <w:tcPr>
+            <w:tcW w:w="1800" w:type="dxa"/>
+            <w:tcBorders>
+              <w:top w:val="single" w:sz="6" w:space="0" w:color="000000"/>
+              <w:left w:val="single" w:sz="6" w:space="0" w:color="000000"/>
+              <w:bottom w:val="single" w:sz="6" w:space="0" w:color="000000"/>
+              <w:right w:val="single" w:sz="6" w:space="0" w:color="000000"/>
+            </w:tcBorders>
+            <w:hideMark/>
+          </w:tcPr>
+          <w:p>
+            <w:pPr>
+              <w:rPr>
+                <w:lang w:val="en-US"/>
+              </w:rPr>
+            </w:pPr>
+            <w:r>
+              <w:t>U6 - Manage provisional and recurring booking</w:t>
+            </w:r>
+            <w:r>
+              <w:rPr>
+                <w:lang w:val="en-US"/>
+              </w:rPr>
+              <w:t> </w:t>
+            </w:r>
+          </w:p>
+        </w:tc>
+        <w:tc>
+          <w:tcPr>
+            <w:tcW w:w="1800" w:type="dxa"/>
+            <w:tcBorders>
+              <w:top w:val="single" w:sz="6" w:space="0" w:color="000000"/>
+              <w:left w:val="single" w:sz="6" w:space="0" w:color="000000"/>
+              <w:bottom w:val="single" w:sz="6" w:space="0" w:color="000000"/>
+              <w:right w:val="single" w:sz="6" w:space="0" w:color="000000"/>
+            </w:tcBorders>
+            <w:hideMark/>
+          </w:tcPr>
+          <w:p>
+            <w:pPr>
+              <w:rPr>
+                <w:lang w:val="en-US"/>
+              </w:rPr>
+            </w:pPr>
+            <w:r>
+              <w:t>Staff member</w:t>
+            </w:r>
+            <w:r>
+              <w:rPr>
+                <w:lang w:val="en-US"/>
+              </w:rPr>
+              <w:t> </w:t>
+            </w:r>
+          </w:p>
+        </w:tc>
+        <w:tc>
+          <w:tcPr>
+            <w:tcW w:w="1800" w:type="dxa"/>
+            <w:tcBorders>
+              <w:top w:val="single" w:sz="6" w:space="0" w:color="000000"/>
+              <w:left w:val="single" w:sz="6" w:space="0" w:color="000000"/>
+              <w:bottom w:val="single" w:sz="6" w:space="0" w:color="000000"/>
+              <w:right w:val="single" w:sz="6" w:space="0" w:color="000000"/>
+            </w:tcBorders>
+            <w:hideMark/>
+          </w:tcPr>
+          <w:p>
+            <w:pPr>
+              <w:rPr>
+                <w:lang w:val="en-US"/>
+              </w:rPr>
+            </w:pPr>
+            <w:r>
+              <w:t>Mark bookings as provisional or confirmed and link dates of a recurring block.</w:t>
+            </w:r>
+            <w:r>
+              <w:rPr>
+                <w:lang w:val="en-US"/>
+              </w:rPr>
+              <w:t> </w:t>
+            </w:r>
+          </w:p>
+        </w:tc>
+        <w:tc>
+          <w:tcPr>
+            <w:tcW w:w="1800" w:type="dxa"/>
+            <w:tcBorders>
+              <w:top w:val="single" w:sz="6" w:space="0" w:color="000000"/>
+              <w:left w:val="single" w:sz="6" w:space="0" w:color="000000"/>
+              <w:bottom w:val="single" w:sz="6" w:space="0" w:color="000000"/>
+              <w:right w:val="single" w:sz="6" w:space="0" w:color="000000"/>
+            </w:tcBorders>
+            <w:hideMark/>
+          </w:tcPr>
+          <w:p>
+            <w:pPr>
+              <w:rPr>
+                <w:lang w:val="en-US"/>
+              </w:rPr>
+            </w:pPr>
+            <w:r>
+              <w:t>FR7</w:t>
+            </w:r>
+            <w:r>
+              <w:rPr>
+                <w:lang w:val="en-US"/>
+              </w:rPr>
+              <w:t> </w:t>
+            </w:r>
+          </w:p>
+        </w:tc>
+        <w:tc>
+          <w:tcPr>
+            <w:tcW w:w="1800" w:type="dxa"/>
+            <w:tcBorders>
+              <w:top w:val="single" w:sz="6" w:space="0" w:color="000000"/>
+              <w:left w:val="single" w:sz="6" w:space="0" w:color="000000"/>
+              <w:bottom w:val="single" w:sz="6" w:space="0" w:color="000000"/>
+              <w:right w:val="single" w:sz="6" w:space="0" w:color="000000"/>
+            </w:tcBorders>
+            <w:hideMark/>
+          </w:tcPr>
+          <w:p>
+            <w:pPr>
+              <w:rPr>
+                <w:lang w:val="en-US"/>
+              </w:rPr>
+            </w:pPr>
+            <w:r>
+              <w:t>P5</w:t>
+            </w:r>
+            <w:r>
+              <w:rPr>
+                <w:lang w:val="en-US"/>
+              </w:rPr>
+              <w:t> </w:t>
+            </w:r>
+          </w:p>
+        </w:tc>
+      </w:tr>
+      <w:tr>
+        <w:trPr>
+          <w:trHeight w:val="285"/>
+        </w:trPr>
+        <w:tc>
+          <w:tcPr>
+            <w:tcW w:w="1800" w:type="dxa"/>
+            <w:tcBorders>
+              <w:top w:val="single" w:sz="6" w:space="0" w:color="000000"/>
+              <w:left w:val="single" w:sz="6" w:space="0" w:color="000000"/>
+              <w:bottom w:val="single" w:sz="6" w:space="0" w:color="000000"/>
+              <w:right w:val="single" w:sz="6" w:space="0" w:color="000000"/>
+            </w:tcBorders>
+            <w:hideMark/>
+          </w:tcPr>
+          <w:p>
+            <w:pPr>
+              <w:rPr>
+                <w:lang w:val="en-US"/>
+              </w:rPr>
+            </w:pPr>
+            <w:r>
+              <w:t>U7 - Record closure, relocation or delayed start of selected booking</w:t>
+            </w:r>
+            <w:r>
+              <w:rPr>
+                <w:lang w:val="en-US"/>
+              </w:rPr>
+              <w:t> </w:t>
+            </w:r>
+          </w:p>
+        </w:tc>
+        <w:tc>
+          <w:tcPr>
+            <w:tcW w:w="1800" w:type="dxa"/>
+            <w:tcBorders>
+              <w:top w:val="single" w:sz="6" w:space="0" w:color="000000"/>
+              <w:left w:val="single" w:sz="6" w:space="0" w:color="000000"/>
+              <w:bottom w:val="single" w:sz="6" w:space="0" w:color="000000"/>
+              <w:right w:val="single" w:sz="6" w:space="0" w:color="000000"/>
+            </w:tcBorders>
+            <w:hideMark/>
+          </w:tcPr>
+          <w:p>
+            <w:pPr>
+              <w:rPr>
+                <w:lang w:val="en-US"/>
+              </w:rPr>
+            </w:pPr>
+            <w:r>
+              <w:t>Staff member</w:t>
+            </w:r>
+            <w:r>
+              <w:rPr>
+                <w:lang w:val="en-US"/>
+              </w:rPr>
+              <w:t> </w:t>
+            </w:r>
+          </w:p>
+        </w:tc>
+        <w:tc>
+          <w:tcPr>
+            <w:tcW w:w="1800" w:type="dxa"/>
+            <w:tcBorders>
+              <w:top w:val="single" w:sz="6" w:space="0" w:color="000000"/>
+              <w:left w:val="single" w:sz="6" w:space="0" w:color="000000"/>
+              <w:bottom w:val="single" w:sz="6" w:space="0" w:color="000000"/>
+              <w:right w:val="single" w:sz="6" w:space="0" w:color="000000"/>
+            </w:tcBorders>
+            <w:hideMark/>
+          </w:tcPr>
+          <w:p>
+            <w:pPr>
+              <w:rPr>
+                <w:lang w:val="en-US"/>
+              </w:rPr>
+            </w:pPr>
+            <w:r>
+              <w:t>Record decision, who made this decision, affected booking, reason and date.</w:t>
+            </w:r>
+            <w:r>
+              <w:rPr>
+                <w:lang w:val="en-US"/>
+              </w:rPr>
+              <w:t> </w:t>
+            </w:r>
+          </w:p>
+        </w:tc>
+        <w:tc>
+          <w:tcPr>
+            <w:tcW w:w="1800" w:type="dxa"/>
+            <w:tcBorders>
+              <w:top w:val="single" w:sz="6" w:space="0" w:color="000000"/>
+              <w:left w:val="single" w:sz="6" w:space="0" w:color="000000"/>
+              <w:bottom w:val="single" w:sz="6" w:space="0" w:color="000000"/>
+              <w:right w:val="single" w:sz="6" w:space="0" w:color="000000"/>
+            </w:tcBorders>
+            <w:hideMark/>
+          </w:tcPr>
+          <w:p>
+            <w:pPr>
+              <w:rPr>
+                <w:lang w:val="en-US"/>
+              </w:rPr>
+            </w:pPr>
+            <w:r>
+              <w:t>FR4</w:t>
+            </w:r>
+            <w:r>
+              <w:rPr>
+                <w:lang w:val="en-US"/>
+              </w:rPr>
+              <w:t> </w:t>
+            </w:r>
+          </w:p>
+        </w:tc>
+        <w:tc>
+          <w:tcPr>
+            <w:tcW w:w="1800" w:type="dxa"/>
+            <w:tcBorders>
+              <w:top w:val="single" w:sz="6" w:space="0" w:color="000000"/>
+              <w:left w:val="single" w:sz="6" w:space="0" w:color="000000"/>
+              <w:bottom w:val="single" w:sz="6" w:space="0" w:color="000000"/>
+              <w:right w:val="single" w:sz="6" w:space="0" w:color="000000"/>
+            </w:tcBorders>
+            <w:hideMark/>
+          </w:tcPr>
+          <w:p>
+            <w:pPr>
+              <w:rPr>
+                <w:lang w:val="en-US"/>
+              </w:rPr>
+            </w:pPr>
+            <w:r>
+              <w:t>P2</w:t>
+            </w:r>
+            <w:r>
+              <w:rPr>
+                <w:lang w:val="en-US"/>
+              </w:rPr>
+              <w:t> </w:t>
+            </w:r>
+          </w:p>
+        </w:tc>
+      </w:tr>
+      <w:tr>
+        <w:trPr>
+          <w:trHeight w:val="285"/>
+        </w:trPr>
+        <w:tc>
+          <w:tcPr>
+            <w:tcW w:w="1800" w:type="dxa"/>
+            <w:tcBorders>
+              <w:top w:val="single" w:sz="6" w:space="0" w:color="000000"/>
+              <w:left w:val="single" w:sz="6" w:space="0" w:color="000000"/>
+              <w:bottom w:val="single" w:sz="6" w:space="0" w:color="000000"/>
+              <w:right w:val="single" w:sz="6" w:space="0" w:color="000000"/>
+            </w:tcBorders>
+            <w:hideMark/>
+          </w:tcPr>
+          <w:p>
+            <w:pPr>
+              <w:rPr>
+                <w:lang w:val="en-US"/>
+              </w:rPr>
+            </w:pPr>
+            <w:r>
+              <w:t>U8 - Inform contacts of relocated, closed or delayed booking</w:t>
+            </w:r>
+            <w:r>
+              <w:rPr>
+                <w:lang w:val="en-US"/>
+              </w:rPr>
+              <w:t> </w:t>
+            </w:r>
+          </w:p>
+        </w:tc>
+        <w:tc>
+          <w:tcPr>
+            <w:tcW w:w="1800" w:type="dxa"/>
+            <w:tcBorders>
+              <w:top w:val="single" w:sz="6" w:space="0" w:color="000000"/>
+              <w:left w:val="single" w:sz="6" w:space="0" w:color="000000"/>
+              <w:bottom w:val="single" w:sz="6" w:space="0" w:color="000000"/>
+              <w:right w:val="single" w:sz="6" w:space="0" w:color="000000"/>
+            </w:tcBorders>
+            <w:hideMark/>
+          </w:tcPr>
+          <w:p>
+            <w:pPr>
+              <w:rPr>
+                <w:lang w:val="en-US"/>
+              </w:rPr>
+            </w:pPr>
+            <w:r>
+              <w:t>Staff member</w:t>
+            </w:r>
+            <w:r>
+              <w:rPr>
+                <w:lang w:val="en-US"/>
+              </w:rPr>
+              <w:t> </w:t>
+            </w:r>
+          </w:p>
+          <w:p>
+            <w:pPr>
+              <w:rPr>
+                <w:lang w:val="en-US"/>
+              </w:rPr>
+            </w:pPr>
+            <w:r>
+              <w:rPr>
+                <w:lang w:val="en-US"/>
+              </w:rPr>
+              <w:t> </w:t>
+            </w:r>
+          </w:p>
+        </w:tc>
+        <w:tc>
+          <w:tcPr>
+            <w:tcW w:w="1800" w:type="dxa"/>
+            <w:tcBorders>
+              <w:top w:val="single" w:sz="6" w:space="0" w:color="000000"/>
+              <w:left w:val="single" w:sz="6" w:space="0" w:color="000000"/>
+              <w:bottom w:val="single" w:sz="6" w:space="0" w:color="000000"/>
+              <w:right w:val="single" w:sz="6" w:space="0" w:color="000000"/>
+            </w:tcBorders>
+            <w:hideMark/>
+          </w:tcPr>
+          <w:p>
+            <w:pPr>
+              <w:rPr>
+                <w:lang w:val="en-US"/>
+              </w:rPr>
+            </w:pPr>
+            <w:r>
+              <w:t>Record message sent to each affected contact and when it was sent.</w:t>
+            </w:r>
+            <w:r>
+              <w:rPr>
+                <w:lang w:val="en-US"/>
+              </w:rPr>
+              <w:t> </w:t>
+            </w:r>
+          </w:p>
+        </w:tc>
+        <w:tc>
+          <w:tcPr>
+            <w:tcW w:w="1800" w:type="dxa"/>
+            <w:tcBorders>
+              <w:top w:val="single" w:sz="6" w:space="0" w:color="000000"/>
+              <w:left w:val="single" w:sz="6" w:space="0" w:color="000000"/>
+              <w:bottom w:val="single" w:sz="6" w:space="0" w:color="000000"/>
+              <w:right w:val="single" w:sz="6" w:space="0" w:color="000000"/>
+            </w:tcBorders>
+            <w:hideMark/>
+          </w:tcPr>
+          <w:p>
+            <w:pPr>
+              <w:rPr>
+                <w:lang w:val="en-US"/>
+              </w:rPr>
+            </w:pPr>
+            <w:r>
+              <w:t>FR5</w:t>
+            </w:r>
+            <w:r>
+              <w:rPr>
+                <w:lang w:val="en-US"/>
+              </w:rPr>
+              <w:t> </w:t>
+            </w:r>
+          </w:p>
+        </w:tc>
+        <w:tc>
+          <w:tcPr>
+            <w:tcW w:w="1800" w:type="dxa"/>
+            <w:tcBorders>
+              <w:top w:val="single" w:sz="6" w:space="0" w:color="000000"/>
+              <w:left w:val="single" w:sz="6" w:space="0" w:color="000000"/>
+              <w:bottom w:val="single" w:sz="6" w:space="0" w:color="000000"/>
+              <w:right w:val="single" w:sz="6" w:space="0" w:color="000000"/>
+            </w:tcBorders>
+            <w:hideMark/>
+          </w:tcPr>
+          <w:p>
+            <w:pPr>
+              <w:rPr>
+                <w:lang w:val="en-US"/>
+              </w:rPr>
+            </w:pPr>
+            <w:r>
+              <w:t>P2</w:t>
+            </w:r>
+            <w:r>
+              <w:rPr>
+                <w:lang w:val="en-US"/>
+              </w:rPr>
+              <w:t> </w:t>
+            </w:r>
+          </w:p>
+        </w:tc>
+      </w:tr>
+      <w:tr>
+        <w:trPr>
+          <w:trHeight w:val="285"/>
+        </w:trPr>
+        <w:tc>
+          <w:tcPr>
+            <w:tcW w:w="1800" w:type="dxa"/>
+            <w:tcBorders>
+              <w:top w:val="single" w:sz="6" w:space="0" w:color="000000"/>
+              <w:left w:val="single" w:sz="6" w:space="0" w:color="000000"/>
+              <w:bottom w:val="single" w:sz="6" w:space="0" w:color="000000"/>
+              <w:right w:val="single" w:sz="6" w:space="0" w:color="000000"/>
+            </w:tcBorders>
+            <w:hideMark/>
+          </w:tcPr>
+          <w:p>
+            <w:pPr>
+              <w:rPr>
+                <w:lang w:val="en-US"/>
+              </w:rPr>
+            </w:pPr>
+            <w:r>
+              <w:lastRenderedPageBreak/>
+              <w:t>U9 - Offer alternative for restricted outdoor space</w:t>
+            </w:r>
+            <w:r>
+              <w:rPr>
+                <w:lang w:val="en-US"/>
+              </w:rPr>
+              <w:t> </w:t>
+            </w:r>
+          </w:p>
+        </w:tc>
+        <w:tc>
+          <w:tcPr>
+            <w:tcW w:w="1800" w:type="dxa"/>
+            <w:tcBorders>
+              <w:top w:val="single" w:sz="6" w:space="0" w:color="000000"/>
+              <w:left w:val="single" w:sz="6" w:space="0" w:color="000000"/>
+              <w:bottom w:val="single" w:sz="6" w:space="0" w:color="000000"/>
+              <w:right w:val="single" w:sz="6" w:space="0" w:color="000000"/>
+            </w:tcBorders>
+            <w:hideMark/>
+          </w:tcPr>
+          <w:p>
+            <w:pPr>
+              <w:rPr>
+                <w:lang w:val="en-US"/>
+              </w:rPr>
+            </w:pPr>
+            <w:r>
+              <w:t>Staff member</w:t>
+            </w:r>
+            <w:r>
+              <w:rPr>
+                <w:lang w:val="en-US"/>
+              </w:rPr>
+              <w:t> </w:t>
+            </w:r>
+          </w:p>
+        </w:tc>
+        <w:tc>
+          <w:tcPr>
+            <w:tcW w:w="1800" w:type="dxa"/>
+            <w:tcBorders>
+              <w:top w:val="single" w:sz="6" w:space="0" w:color="000000"/>
+              <w:left w:val="single" w:sz="6" w:space="0" w:color="000000"/>
+              <w:bottom w:val="single" w:sz="6" w:space="0" w:color="000000"/>
+              <w:right w:val="single" w:sz="6" w:space="0" w:color="000000"/>
+            </w:tcBorders>
+            <w:hideMark/>
+          </w:tcPr>
+          <w:p>
+            <w:pPr>
+              <w:rPr>
+                <w:lang w:val="en-US"/>
+              </w:rPr>
+            </w:pPr>
+            <w:r>
+              <w:t>List suitable alternatives with equipment and lighting details when an outdoor space is restricted, so the group can accept one of these alternatives.</w:t>
+            </w:r>
+            <w:r>
+              <w:rPr>
+                <w:lang w:val="en-US"/>
+              </w:rPr>
+              <w:t> </w:t>
+            </w:r>
+          </w:p>
+        </w:tc>
+        <w:tc>
+          <w:tcPr>
+            <w:tcW w:w="1800" w:type="dxa"/>
+            <w:tcBorders>
+              <w:top w:val="single" w:sz="6" w:space="0" w:color="000000"/>
+              <w:left w:val="single" w:sz="6" w:space="0" w:color="000000"/>
+              <w:bottom w:val="single" w:sz="6" w:space="0" w:color="000000"/>
+              <w:right w:val="single" w:sz="6" w:space="0" w:color="000000"/>
+            </w:tcBorders>
+            <w:hideMark/>
+          </w:tcPr>
+          <w:p>
+            <w:pPr>
+              <w:rPr>
+                <w:lang w:val="en-US"/>
+              </w:rPr>
+            </w:pPr>
+            <w:r>
+              <w:rPr>
+                <w:lang w:val="en-US"/>
+              </w:rPr>
+              <w:t> </w:t>
+            </w:r>
+          </w:p>
+        </w:tc>
+        <w:tc>
+          <w:tcPr>
+            <w:tcW w:w="1800" w:type="dxa"/>
+            <w:tcBorders>
+              <w:top w:val="single" w:sz="6" w:space="0" w:color="000000"/>
+              <w:left w:val="single" w:sz="6" w:space="0" w:color="000000"/>
+              <w:bottom w:val="single" w:sz="6" w:space="0" w:color="000000"/>
+              <w:right w:val="single" w:sz="6" w:space="0" w:color="000000"/>
+            </w:tcBorders>
+            <w:hideMark/>
+          </w:tcPr>
+          <w:p>
+            <w:pPr>
+              <w:rPr>
+                <w:lang w:val="en-US"/>
+              </w:rPr>
+            </w:pPr>
+            <w:r>
+              <w:t>P10</w:t>
+            </w:r>
+            <w:r>
+              <w:rPr>
+                <w:lang w:val="en-US"/>
+              </w:rPr>
+              <w:t> </w:t>
+            </w:r>
+          </w:p>
+        </w:tc>
+      </w:tr>
+      <w:tr>
+        <w:trPr>
+          <w:trHeight w:val="285"/>
+        </w:trPr>
+        <w:tc>
+          <w:tcPr>
+            <w:tcW w:w="1800" w:type="dxa"/>
+            <w:tcBorders>
+              <w:top w:val="single" w:sz="6" w:space="0" w:color="000000"/>
+              <w:left w:val="single" w:sz="6" w:space="0" w:color="000000"/>
+              <w:bottom w:val="single" w:sz="6" w:space="0" w:color="000000"/>
+              <w:right w:val="single" w:sz="6" w:space="0" w:color="000000"/>
+            </w:tcBorders>
+            <w:hideMark/>
+          </w:tcPr>
+          <w:p>
+            <w:pPr>
+              <w:rPr>
+                <w:lang w:val="en-US"/>
+              </w:rPr>
+            </w:pPr>
+            <w:r>
+              <w:t>U10 - Give relief staff instructions, access codes and keys while limiting their access to sensitive information</w:t>
+            </w:r>
+            <w:r>
+              <w:rPr>
+                <w:lang w:val="en-US"/>
+              </w:rPr>
+              <w:t> </w:t>
+            </w:r>
+          </w:p>
+        </w:tc>
+        <w:tc>
+          <w:tcPr>
+            <w:tcW w:w="1800" w:type="dxa"/>
+            <w:tcBorders>
+              <w:top w:val="single" w:sz="6" w:space="0" w:color="000000"/>
+              <w:left w:val="single" w:sz="6" w:space="0" w:color="000000"/>
+              <w:bottom w:val="single" w:sz="6" w:space="0" w:color="000000"/>
+              <w:right w:val="single" w:sz="6" w:space="0" w:color="000000"/>
+            </w:tcBorders>
+            <w:hideMark/>
+          </w:tcPr>
+          <w:p>
+            <w:pPr>
+              <w:rPr>
+                <w:lang w:val="en-US"/>
+              </w:rPr>
+            </w:pPr>
+            <w:r>
+              <w:t>Staff member</w:t>
+            </w:r>
+            <w:r>
+              <w:rPr>
+                <w:lang w:val="en-US"/>
+              </w:rPr>
+              <w:t> </w:t>
+            </w:r>
+          </w:p>
+        </w:tc>
+        <w:tc>
+          <w:tcPr>
+            <w:tcW w:w="1800" w:type="dxa"/>
+            <w:tcBorders>
+              <w:top w:val="single" w:sz="6" w:space="0" w:color="000000"/>
+              <w:left w:val="single" w:sz="6" w:space="0" w:color="000000"/>
+              <w:bottom w:val="single" w:sz="6" w:space="0" w:color="000000"/>
+              <w:right w:val="single" w:sz="6" w:space="0" w:color="000000"/>
+            </w:tcBorders>
+            <w:hideMark/>
+          </w:tcPr>
+          <w:p>
+            <w:pPr>
+              <w:rPr>
+                <w:lang w:val="en-US"/>
+              </w:rPr>
+            </w:pPr>
+            <w:r>
+              <w:t>Relief staff receive opening and closing instructions, access codes and keys without information they do not need.</w:t>
+            </w:r>
+            <w:r>
+              <w:rPr>
+                <w:lang w:val="en-US"/>
+              </w:rPr>
+              <w:t> </w:t>
+            </w:r>
+          </w:p>
+        </w:tc>
+        <w:tc>
+          <w:tcPr>
+            <w:tcW w:w="1800" w:type="dxa"/>
+            <w:tcBorders>
+              <w:top w:val="single" w:sz="6" w:space="0" w:color="000000"/>
+              <w:left w:val="single" w:sz="6" w:space="0" w:color="000000"/>
+              <w:bottom w:val="single" w:sz="6" w:space="0" w:color="000000"/>
+              <w:right w:val="single" w:sz="6" w:space="0" w:color="000000"/>
+            </w:tcBorders>
+            <w:hideMark/>
+          </w:tcPr>
+          <w:p>
+            <w:pPr>
+              <w:rPr>
+                <w:lang w:val="en-US"/>
+              </w:rPr>
+            </w:pPr>
+            <w:r>
+              <w:t>FR9</w:t>
+            </w:r>
+            <w:r>
+              <w:rPr>
+                <w:lang w:val="en-US"/>
+              </w:rPr>
+              <w:t> </w:t>
+            </w:r>
+          </w:p>
+        </w:tc>
+        <w:tc>
+          <w:tcPr>
+            <w:tcW w:w="1800" w:type="dxa"/>
+            <w:tcBorders>
+              <w:top w:val="single" w:sz="6" w:space="0" w:color="000000"/>
+              <w:left w:val="single" w:sz="6" w:space="0" w:color="000000"/>
+              <w:bottom w:val="single" w:sz="6" w:space="0" w:color="000000"/>
+              <w:right w:val="single" w:sz="6" w:space="0" w:color="000000"/>
+            </w:tcBorders>
+            <w:hideMark/>
+          </w:tcPr>
+          <w:p>
+            <w:pPr>
+              <w:rPr>
+                <w:lang w:val="en-US"/>
+              </w:rPr>
+            </w:pPr>
+            <w:r>
+              <w:t>P8a, P8b</w:t>
+            </w:r>
+            <w:r>
+              <w:rPr>
+                <w:lang w:val="en-US"/>
+              </w:rPr>
+              <w:t> </w:t>
+            </w:r>
+          </w:p>
+        </w:tc>
+      </w:tr>
+      <w:tr>
+        <w:trPr>
+          <w:trHeight w:val="285"/>
+        </w:trPr>
+        <w:tc>
+          <w:tcPr>
+            <w:tcW w:w="1800" w:type="dxa"/>
+            <w:tcBorders>
+              <w:top w:val="single" w:sz="6" w:space="0" w:color="000000"/>
+              <w:left w:val="single" w:sz="6" w:space="0" w:color="000000"/>
+              <w:bottom w:val="single" w:sz="6" w:space="0" w:color="000000"/>
+              <w:right w:val="single" w:sz="6" w:space="0" w:color="000000"/>
+            </w:tcBorders>
+            <w:hideMark/>
+          </w:tcPr>
+          <w:p>
+            <w:pPr>
+              <w:rPr>
+                <w:lang w:val="en-US"/>
+              </w:rPr>
+            </w:pPr>
+            <w:r>
+              <w:t>U11 - Record group history of cancellations, late arrivals and departures, incidents and damages</w:t>
+            </w:r>
+            <w:r>
+              <w:rPr>
+                <w:lang w:val="en-US"/>
+              </w:rPr>
+              <w:t> </w:t>
+            </w:r>
+          </w:p>
+        </w:tc>
+        <w:tc>
+          <w:tcPr>
+            <w:tcW w:w="1800" w:type="dxa"/>
+            <w:tcBorders>
+              <w:top w:val="single" w:sz="6" w:space="0" w:color="000000"/>
+              <w:left w:val="single" w:sz="6" w:space="0" w:color="000000"/>
+              <w:bottom w:val="single" w:sz="6" w:space="0" w:color="000000"/>
+              <w:right w:val="single" w:sz="6" w:space="0" w:color="000000"/>
+            </w:tcBorders>
+            <w:hideMark/>
+          </w:tcPr>
+          <w:p>
+            <w:pPr>
+              <w:rPr>
+                <w:lang w:val="en-US"/>
+              </w:rPr>
+            </w:pPr>
+            <w:r>
+              <w:t>Staff member</w:t>
+            </w:r>
+            <w:r>
+              <w:rPr>
+                <w:lang w:val="en-US"/>
+              </w:rPr>
+              <w:t> </w:t>
+            </w:r>
+          </w:p>
+        </w:tc>
+        <w:tc>
+          <w:tcPr>
+            <w:tcW w:w="1800" w:type="dxa"/>
+            <w:tcBorders>
+              <w:top w:val="single" w:sz="6" w:space="0" w:color="000000"/>
+              <w:left w:val="single" w:sz="6" w:space="0" w:color="000000"/>
+              <w:bottom w:val="single" w:sz="6" w:space="0" w:color="000000"/>
+              <w:right w:val="single" w:sz="6" w:space="0" w:color="000000"/>
+            </w:tcBorders>
+            <w:hideMark/>
+          </w:tcPr>
+          <w:p>
+            <w:pPr>
+              <w:rPr>
+                <w:lang w:val="en-US"/>
+              </w:rPr>
+            </w:pPr>
+            <w:r>
+              <w:t>Record cancellations, late arrivals and departures, incidents and damage against group involved.</w:t>
+            </w:r>
+            <w:r>
+              <w:rPr>
+                <w:lang w:val="en-US"/>
+              </w:rPr>
+              <w:t> </w:t>
+            </w:r>
+          </w:p>
+        </w:tc>
+        <w:tc>
+          <w:tcPr>
+            <w:tcW w:w="1800" w:type="dxa"/>
+            <w:tcBorders>
+              <w:top w:val="single" w:sz="6" w:space="0" w:color="000000"/>
+              <w:left w:val="single" w:sz="6" w:space="0" w:color="000000"/>
+              <w:bottom w:val="single" w:sz="6" w:space="0" w:color="000000"/>
+              <w:right w:val="single" w:sz="6" w:space="0" w:color="000000"/>
+            </w:tcBorders>
+            <w:hideMark/>
+          </w:tcPr>
+          <w:p>
+            <w:pPr>
+              <w:rPr>
+                <w:lang w:val="en-US"/>
+              </w:rPr>
+            </w:pPr>
+            <w:r>
+              <w:t>FR10</w:t>
+            </w:r>
+            <w:r>
+              <w:rPr>
+                <w:lang w:val="en-US"/>
+              </w:rPr>
+              <w:t> </w:t>
+            </w:r>
+          </w:p>
+        </w:tc>
+        <w:tc>
+          <w:tcPr>
+            <w:tcW w:w="1800" w:type="dxa"/>
+            <w:tcBorders>
+              <w:top w:val="single" w:sz="6" w:space="0" w:color="000000"/>
+              <w:left w:val="single" w:sz="6" w:space="0" w:color="000000"/>
+              <w:bottom w:val="single" w:sz="6" w:space="0" w:color="000000"/>
+              <w:right w:val="single" w:sz="6" w:space="0" w:color="000000"/>
+            </w:tcBorders>
+            <w:hideMark/>
+          </w:tcPr>
+          <w:p>
+            <w:pPr>
+              <w:rPr>
+                <w:lang w:val="en-US"/>
+              </w:rPr>
+            </w:pPr>
+            <w:r>
+              <w:t>P9</w:t>
+            </w:r>
+            <w:r>
+              <w:rPr>
+                <w:lang w:val="en-US"/>
+              </w:rPr>
+              <w:t> </w:t>
+            </w:r>
+          </w:p>
+        </w:tc>
+      </w:tr>
+      <w:tr>
+        <w:trPr>
+          <w:trHeight w:val="285"/>
+        </w:trPr>
+        <w:tc>
+          <w:tcPr>
+            <w:tcW w:w="1800" w:type="dxa"/>
+            <w:tcBorders>
+              <w:top w:val="single" w:sz="6" w:space="0" w:color="000000"/>
+              <w:left w:val="single" w:sz="6" w:space="0" w:color="000000"/>
+              <w:bottom w:val="single" w:sz="6" w:space="0" w:color="000000"/>
+              <w:right w:val="single" w:sz="6" w:space="0" w:color="000000"/>
+            </w:tcBorders>
+            <w:hideMark/>
+          </w:tcPr>
+          <w:p>
+            <w:pPr>
+              <w:rPr>
+                <w:lang w:val="en-US"/>
+              </w:rPr>
+            </w:pPr>
+            <w:r>
+              <w:t>U12 – Build report using records available</w:t>
+            </w:r>
+            <w:r>
+              <w:rPr>
+                <w:lang w:val="en-US"/>
+              </w:rPr>
+              <w:t> </w:t>
+            </w:r>
+          </w:p>
+        </w:tc>
+        <w:tc>
+          <w:tcPr>
+            <w:tcW w:w="1800" w:type="dxa"/>
+            <w:tcBorders>
+              <w:top w:val="single" w:sz="6" w:space="0" w:color="000000"/>
+              <w:left w:val="single" w:sz="6" w:space="0" w:color="000000"/>
+              <w:bottom w:val="single" w:sz="6" w:space="0" w:color="000000"/>
+              <w:right w:val="single" w:sz="6" w:space="0" w:color="000000"/>
+            </w:tcBorders>
+            <w:hideMark/>
+          </w:tcPr>
+          <w:p>
+            <w:pPr>
+              <w:rPr>
+                <w:lang w:val="en-US"/>
+              </w:rPr>
+            </w:pPr>
+            <w:r>
+              <w:t>Facilities coordinator</w:t>
+            </w:r>
+            <w:r>
+              <w:rPr>
+                <w:lang w:val="en-US"/>
+              </w:rPr>
+              <w:t> </w:t>
+            </w:r>
+          </w:p>
+        </w:tc>
+        <w:tc>
+          <w:tcPr>
+            <w:tcW w:w="1800" w:type="dxa"/>
+            <w:tcBorders>
+              <w:top w:val="single" w:sz="6" w:space="0" w:color="000000"/>
+              <w:left w:val="single" w:sz="6" w:space="0" w:color="000000"/>
+              <w:bottom w:val="single" w:sz="6" w:space="0" w:color="000000"/>
+              <w:right w:val="single" w:sz="6" w:space="0" w:color="000000"/>
+            </w:tcBorders>
+            <w:hideMark/>
+          </w:tcPr>
+          <w:p>
+            <w:pPr>
+              <w:rPr>
+                <w:lang w:val="en-US"/>
+              </w:rPr>
+            </w:pPr>
+            <w:r>
+              <w:t xml:space="preserve">Find records of confirmed and provisional bookings, maintenance conflicts, equipment allocation, incidents and recurring unmet demand in one place and build </w:t>
+            </w:r>
+            <w:r>
+              <w:lastRenderedPageBreak/>
+              <w:t>report using them.</w:t>
+            </w:r>
+            <w:r>
+              <w:rPr>
+                <w:lang w:val="en-US"/>
+              </w:rPr>
+              <w:t> </w:t>
+            </w:r>
+          </w:p>
+        </w:tc>
+        <w:tc>
+          <w:tcPr>
+            <w:tcW w:w="1800" w:type="dxa"/>
+            <w:tcBorders>
+              <w:top w:val="single" w:sz="6" w:space="0" w:color="000000"/>
+              <w:left w:val="single" w:sz="6" w:space="0" w:color="000000"/>
+              <w:bottom w:val="single" w:sz="6" w:space="0" w:color="000000"/>
+              <w:right w:val="single" w:sz="6" w:space="0" w:color="000000"/>
+            </w:tcBorders>
+            <w:hideMark/>
+          </w:tcPr>
+          <w:p>
+            <w:pPr>
+              <w:rPr>
+                <w:lang w:val="en-US"/>
+              </w:rPr>
+            </w:pPr>
+            <w:r>
+              <w:lastRenderedPageBreak/>
+              <w:t>FR12</w:t>
+            </w:r>
+            <w:r>
+              <w:rPr>
+                <w:lang w:val="en-US"/>
+              </w:rPr>
+              <w:t> </w:t>
+            </w:r>
+          </w:p>
+        </w:tc>
+        <w:tc>
+          <w:tcPr>
+            <w:tcW w:w="1800" w:type="dxa"/>
+            <w:tcBorders>
+              <w:top w:val="single" w:sz="6" w:space="0" w:color="000000"/>
+              <w:left w:val="single" w:sz="6" w:space="0" w:color="000000"/>
+              <w:bottom w:val="single" w:sz="6" w:space="0" w:color="000000"/>
+              <w:right w:val="single" w:sz="6" w:space="0" w:color="000000"/>
+            </w:tcBorders>
+            <w:hideMark/>
+          </w:tcPr>
+          <w:p>
+            <w:pPr>
+              <w:rPr>
+                <w:lang w:val="en-US"/>
+              </w:rPr>
+            </w:pPr>
+            <w:r>
+              <w:t>P11</w:t>
+            </w:r>
+            <w:r>
+              <w:rPr>
+                <w:lang w:val="en-US"/>
+              </w:rPr>
+              <w:t> </w:t>
+            </w:r>
+          </w:p>
+        </w:tc>
+      </w:tr>
+    </w:tbl>
+    <w:p/>
+    <w:p>
+      <w:pPr>
+        <w:pStyle w:val="Heading2"/>
+      </w:pPr>
+      <w:r>
+        <w:t>Detailed use-case diagram:</w:t>
+      </w:r>
+    </w:p>
+    <w:tbl>
+      <w:tblPr>
+        <w:tblW w:w="0" w:type="dxa"/>
+        <w:tblBorders>
+          <w:top w:val="outset" w:sz="6" w:space="0" w:color="auto"/>
+          <w:left w:val="outset" w:sz="6" w:space="0" w:color="auto"/>
+          <w:bottom w:val="outset" w:sz="6" w:space="0" w:color="auto"/>
+          <w:right w:val="outset" w:sz="6" w:space="0" w:color="auto"/>
+        </w:tblBorders>
+        <w:tblCellMar>
+          <w:left w:w="0" w:type="dxa"/>
+          <w:right w:w="0" w:type="dxa"/>
+        </w:tblCellMar>
+        <w:tblLook w:val="04A0" w:firstRow="1" w:lastRow="0" w:firstColumn="1" w:lastColumn="0" w:noHBand="0" w:noVBand="1"/>
+      </w:tblPr>
+      <w:tblGrid>
+        <w:gridCol w:w="2554"/>
+        <w:gridCol w:w="6456"/>
+      </w:tblGrid>
+      <w:tr>
+        <w:trPr>
+          <w:trHeight w:val="285"/>
+        </w:trPr>
+        <w:tc>
+          <w:tcPr>
+            <w:tcW w:w="2565" w:type="dxa"/>
+            <w:tcBorders>
+              <w:top w:val="single" w:sz="6" w:space="0" w:color="auto"/>
+              <w:left w:val="single" w:sz="6" w:space="0" w:color="auto"/>
+              <w:bottom w:val="single" w:sz="6" w:space="0" w:color="auto"/>
+              <w:right w:val="single" w:sz="6" w:space="0" w:color="auto"/>
+            </w:tcBorders>
+            <w:shd w:val="clear" w:color="auto" w:fill="C6D9F1"/>
+            <w:hideMark/>
+          </w:tcPr>
+          <w:p>
+            <w:pPr>
+              <w:rPr>
+                <w:lang w:val="en-US"/>
+              </w:rPr>
+            </w:pPr>
+            <w:r>
+              <w:rPr>
+                <w:b/>
+                <w:bCs/>
+              </w:rPr>
+              <w:t>Use Case Name</w:t>
+            </w:r>
+            <w:r>
+              <w:rPr>
+                <w:lang w:val="en-US"/>
+              </w:rPr>
+              <w:t> </w:t>
+            </w:r>
+          </w:p>
+        </w:tc>
+        <w:tc>
+          <w:tcPr>
+            <w:tcW w:w="6510" w:type="dxa"/>
+            <w:tcBorders>
+              <w:top w:val="single" w:sz="6" w:space="0" w:color="auto"/>
+              <w:left w:val="single" w:sz="6" w:space="0" w:color="auto"/>
+              <w:bottom w:val="single" w:sz="6" w:space="0" w:color="auto"/>
+              <w:right w:val="single" w:sz="6" w:space="0" w:color="auto"/>
+            </w:tcBorders>
+            <w:shd w:val="clear" w:color="auto" w:fill="C6D9F1"/>
+            <w:hideMark/>
+          </w:tcPr>
+          <w:p>
+            <w:pPr>
+              <w:rPr>
+                <w:lang w:val="en-US"/>
+              </w:rPr>
+            </w:pPr>
+            <w:r>
+              <w:t>Record an unavailable space</w:t>
+            </w:r>
+            <w:r>
+              <w:rPr>
+                <w:lang w:val="en-US"/>
+              </w:rPr>
+              <w:t> </w:t>
+            </w:r>
+          </w:p>
+        </w:tc>
+      </w:tr>
+      <w:tr>
+        <w:trPr>
+          <w:trHeight w:val="285"/>
+        </w:trPr>
+        <w:tc>
+          <w:tcPr>
+            <w:tcW w:w="2565" w:type="dxa"/>
+            <w:tcBorders>
+              <w:top w:val="single" w:sz="6" w:space="0" w:color="auto"/>
+              <w:left w:val="single" w:sz="6" w:space="0" w:color="auto"/>
+              <w:bottom w:val="single" w:sz="6" w:space="0" w:color="auto"/>
+              <w:right w:val="single" w:sz="6" w:space="0" w:color="auto"/>
+            </w:tcBorders>
+            <w:hideMark/>
+          </w:tcPr>
+          <w:p>
+            <w:pPr>
+              <w:rPr>
+                <w:lang w:val="en-US"/>
+              </w:rPr>
+            </w:pPr>
+            <w:r>
+              <w:rPr>
+                <w:b/>
+                <w:bCs/>
+              </w:rPr>
+              <w:t>Use Case Id</w:t>
+            </w:r>
+            <w:r>
+              <w:rPr>
+                <w:lang w:val="en-US"/>
+              </w:rPr>
+              <w:t> </w:t>
+            </w:r>
+          </w:p>
+        </w:tc>
+        <w:tc>
+          <w:tcPr>
+            <w:tcW w:w="6510" w:type="dxa"/>
+            <w:tcBorders>
+              <w:top w:val="single" w:sz="6" w:space="0" w:color="auto"/>
+              <w:left w:val="single" w:sz="6" w:space="0" w:color="auto"/>
+              <w:bottom w:val="single" w:sz="6" w:space="0" w:color="auto"/>
+              <w:right w:val="single" w:sz="6" w:space="0" w:color="auto"/>
+            </w:tcBorders>
+            <w:hideMark/>
+          </w:tcPr>
+          <w:p>
+            <w:pPr>
+              <w:rPr>
+                <w:lang w:val="en-US"/>
+              </w:rPr>
+            </w:pPr>
+            <w:r>
+              <w:t>001</w:t>
+            </w:r>
+            <w:r>
+              <w:rPr>
+                <w:lang w:val="en-US"/>
+              </w:rPr>
+              <w:t> </w:t>
+            </w:r>
+          </w:p>
+        </w:tc>
+      </w:tr>
+      <w:tr>
+        <w:trPr>
+          <w:trHeight w:val="285"/>
+        </w:trPr>
+        <w:tc>
+          <w:tcPr>
+            <w:tcW w:w="2565" w:type="dxa"/>
+            <w:tcBorders>
+              <w:top w:val="single" w:sz="6" w:space="0" w:color="auto"/>
+              <w:left w:val="single" w:sz="6" w:space="0" w:color="auto"/>
+              <w:bottom w:val="single" w:sz="6" w:space="0" w:color="auto"/>
+              <w:right w:val="single" w:sz="6" w:space="0" w:color="auto"/>
+            </w:tcBorders>
+            <w:hideMark/>
+          </w:tcPr>
+          <w:p>
+            <w:pPr>
+              <w:rPr>
+                <w:lang w:val="en-US"/>
+              </w:rPr>
+            </w:pPr>
+            <w:r>
+              <w:rPr>
+                <w:b/>
+                <w:bCs/>
+              </w:rPr>
+              <w:t>Priority</w:t>
+            </w:r>
+            <w:r>
+              <w:rPr>
+                <w:lang w:val="en-US"/>
+              </w:rPr>
+              <w:t> </w:t>
+            </w:r>
+          </w:p>
+        </w:tc>
+        <w:tc>
+          <w:tcPr>
+            <w:tcW w:w="6510" w:type="dxa"/>
+            <w:tcBorders>
+              <w:top w:val="single" w:sz="6" w:space="0" w:color="auto"/>
+              <w:left w:val="single" w:sz="6" w:space="0" w:color="auto"/>
+              <w:bottom w:val="single" w:sz="6" w:space="0" w:color="auto"/>
+              <w:right w:val="single" w:sz="6" w:space="0" w:color="auto"/>
+            </w:tcBorders>
+            <w:hideMark/>
+          </w:tcPr>
+          <w:p>
+            <w:pPr>
+              <w:rPr>
+                <w:lang w:val="en-US"/>
+              </w:rPr>
+            </w:pPr>
+            <w:r>
+              <w:t>1</w:t>
+            </w:r>
+            <w:r>
+              <w:rPr>
+                <w:lang w:val="en-US"/>
+              </w:rPr>
+              <w:t> </w:t>
+            </w:r>
+          </w:p>
+        </w:tc>
+      </w:tr>
+      <w:tr>
+        <w:trPr>
+          <w:trHeight w:val="285"/>
+        </w:trPr>
+        <w:tc>
+          <w:tcPr>
+            <w:tcW w:w="2565" w:type="dxa"/>
+            <w:tcBorders>
+              <w:top w:val="single" w:sz="6" w:space="0" w:color="auto"/>
+              <w:left w:val="single" w:sz="6" w:space="0" w:color="auto"/>
+              <w:bottom w:val="single" w:sz="6" w:space="0" w:color="auto"/>
+              <w:right w:val="single" w:sz="6" w:space="0" w:color="auto"/>
+            </w:tcBorders>
+            <w:hideMark/>
+          </w:tcPr>
+          <w:p>
+            <w:pPr>
+              <w:rPr>
+                <w:lang w:val="en-US"/>
+              </w:rPr>
+            </w:pPr>
+            <w:r>
+              <w:rPr>
+                <w:b/>
+                <w:bCs/>
+              </w:rPr>
+              <w:t>Source</w:t>
+            </w:r>
+            <w:r>
+              <w:rPr>
+                <w:lang w:val="en-US"/>
+              </w:rPr>
+              <w:t> </w:t>
+            </w:r>
+          </w:p>
+        </w:tc>
+        <w:tc>
+          <w:tcPr>
+            <w:tcW w:w="6510" w:type="dxa"/>
+            <w:tcBorders>
+              <w:top w:val="single" w:sz="6" w:space="0" w:color="auto"/>
+              <w:left w:val="single" w:sz="6" w:space="0" w:color="auto"/>
+              <w:bottom w:val="single" w:sz="6" w:space="0" w:color="auto"/>
+              <w:right w:val="single" w:sz="6" w:space="0" w:color="auto"/>
+            </w:tcBorders>
+            <w:hideMark/>
+          </w:tcPr>
+          <w:p>
+            <w:pPr>
+              <w:rPr>
+                <w:lang w:val="en-US"/>
+              </w:rPr>
+            </w:pPr>
+            <w:r>
+              <w:t>Scenario description; FR1</w:t>
+            </w:r>
+            <w:r>
+              <w:rPr>
+                <w:lang w:val="en-US"/>
+              </w:rPr>
+              <w:t> </w:t>
+            </w:r>
+          </w:p>
+        </w:tc>
+      </w:tr>
+      <w:tr>
+        <w:trPr>
+          <w:trHeight w:val="285"/>
+        </w:trPr>
+        <w:tc>
+          <w:tcPr>
+            <w:tcW w:w="2565" w:type="dxa"/>
+            <w:tcBorders>
+              <w:top w:val="single" w:sz="6" w:space="0" w:color="auto"/>
+              <w:left w:val="single" w:sz="6" w:space="0" w:color="auto"/>
+              <w:bottom w:val="single" w:sz="6" w:space="0" w:color="auto"/>
+              <w:right w:val="single" w:sz="6" w:space="0" w:color="auto"/>
+            </w:tcBorders>
+            <w:hideMark/>
+          </w:tcPr>
+          <w:p>
+            <w:pPr>
+              <w:rPr>
+                <w:lang w:val="en-US"/>
+              </w:rPr>
+            </w:pPr>
+            <w:r>
+              <w:rPr>
+                <w:b/>
+                <w:bCs/>
+              </w:rPr>
+              <w:t>Primary Business Actor</w:t>
+            </w:r>
+            <w:r>
+              <w:rPr>
+                <w:lang w:val="en-US"/>
+              </w:rPr>
+              <w:t> </w:t>
+            </w:r>
+          </w:p>
+        </w:tc>
+        <w:tc>
+          <w:tcPr>
+            <w:tcW w:w="6510" w:type="dxa"/>
+            <w:tcBorders>
+              <w:top w:val="single" w:sz="6" w:space="0" w:color="auto"/>
+              <w:left w:val="single" w:sz="6" w:space="0" w:color="auto"/>
+              <w:bottom w:val="single" w:sz="6" w:space="0" w:color="auto"/>
+              <w:right w:val="single" w:sz="6" w:space="0" w:color="auto"/>
+            </w:tcBorders>
+            <w:hideMark/>
+          </w:tcPr>
+          <w:p>
+            <w:pPr>
+              <w:rPr>
+                <w:lang w:val="en-US"/>
+              </w:rPr>
+            </w:pPr>
+            <w:r>
+              <w:t>Staff member </w:t>
+            </w:r>
+            <w:r>
+              <w:rPr>
+                <w:lang w:val="en-US"/>
+              </w:rPr>
+              <w:t> </w:t>
+            </w:r>
+          </w:p>
+        </w:tc>
+      </w:tr>
+      <w:tr>
+        <w:trPr>
+          <w:trHeight w:val="285"/>
+        </w:trPr>
+        <w:tc>
+          <w:tcPr>
+            <w:tcW w:w="2565" w:type="dxa"/>
+            <w:tcBorders>
+              <w:top w:val="single" w:sz="6" w:space="0" w:color="auto"/>
+              <w:left w:val="single" w:sz="6" w:space="0" w:color="auto"/>
+              <w:bottom w:val="single" w:sz="6" w:space="0" w:color="auto"/>
+              <w:right w:val="single" w:sz="6" w:space="0" w:color="auto"/>
+            </w:tcBorders>
+            <w:hideMark/>
+          </w:tcPr>
+          <w:p>
+            <w:pPr>
+              <w:rPr>
+                <w:lang w:val="en-US"/>
+              </w:rPr>
+            </w:pPr>
+            <w:r>
+              <w:rPr>
+                <w:b/>
+                <w:bCs/>
+              </w:rPr>
+              <w:t>Other Participating Actors</w:t>
+            </w:r>
+            <w:r>
+              <w:rPr>
+                <w:lang w:val="en-US"/>
+              </w:rPr>
+              <w:t> </w:t>
+            </w:r>
+          </w:p>
+        </w:tc>
+        <w:tc>
+          <w:tcPr>
+            <w:tcW w:w="6510" w:type="dxa"/>
+            <w:tcBorders>
+              <w:top w:val="single" w:sz="6" w:space="0" w:color="auto"/>
+              <w:left w:val="single" w:sz="6" w:space="0" w:color="auto"/>
+              <w:bottom w:val="single" w:sz="6" w:space="0" w:color="auto"/>
+              <w:right w:val="single" w:sz="6" w:space="0" w:color="auto"/>
+            </w:tcBorders>
+            <w:hideMark/>
+          </w:tcPr>
+          <w:p>
+            <w:pPr>
+              <w:rPr>
+                <w:lang w:val="en-US"/>
+              </w:rPr>
+            </w:pPr>
+            <w:r>
+              <w:t>Maintenance officer</w:t>
+            </w:r>
+            <w:r>
+              <w:rPr>
+                <w:lang w:val="en-US"/>
+              </w:rPr>
+              <w:t> </w:t>
+            </w:r>
+          </w:p>
+        </w:tc>
+      </w:tr>
+      <w:tr>
+        <w:trPr>
+          <w:trHeight w:val="285"/>
+        </w:trPr>
+        <w:tc>
+          <w:tcPr>
+            <w:tcW w:w="2565" w:type="dxa"/>
+            <w:tcBorders>
+              <w:top w:val="single" w:sz="6" w:space="0" w:color="auto"/>
+              <w:left w:val="single" w:sz="6" w:space="0" w:color="auto"/>
+              <w:bottom w:val="single" w:sz="6" w:space="0" w:color="auto"/>
+              <w:right w:val="single" w:sz="6" w:space="0" w:color="auto"/>
+            </w:tcBorders>
+            <w:hideMark/>
+          </w:tcPr>
+          <w:p>
+            <w:pPr>
+              <w:rPr>
+                <w:lang w:val="en-US"/>
+              </w:rPr>
+            </w:pPr>
+            <w:r>
+              <w:rPr>
+                <w:b/>
+                <w:bCs/>
+              </w:rPr>
+              <w:t>Description</w:t>
+            </w:r>
+            <w:r>
+              <w:rPr>
+                <w:lang w:val="en-US"/>
+              </w:rPr>
+              <w:t> </w:t>
+            </w:r>
+          </w:p>
+        </w:tc>
+        <w:tc>
+          <w:tcPr>
+            <w:tcW w:w="6510" w:type="dxa"/>
+            <w:tcBorders>
+              <w:top w:val="single" w:sz="6" w:space="0" w:color="auto"/>
+              <w:left w:val="single" w:sz="6" w:space="0" w:color="auto"/>
+              <w:bottom w:val="single" w:sz="6" w:space="0" w:color="auto"/>
+              <w:right w:val="single" w:sz="6" w:space="0" w:color="auto"/>
+            </w:tcBorders>
+            <w:hideMark/>
+          </w:tcPr>
+          <w:p>
+            <w:pPr>
+              <w:rPr>
+                <w:lang w:val="en-US"/>
+              </w:rPr>
+            </w:pPr>
+            <w:r>
+              <w:t>Record a single space as unavailable for a date and time range with a reason without closing the whole facility.</w:t>
+            </w:r>
+            <w:r>
+              <w:rPr>
+                <w:lang w:val="en-US"/>
+              </w:rPr>
+              <w:t> </w:t>
+            </w:r>
+          </w:p>
+        </w:tc>
+      </w:tr>
+      <w:tr>
+        <w:trPr>
+          <w:trHeight w:val="285"/>
+        </w:trPr>
+        <w:tc>
+          <w:tcPr>
+            <w:tcW w:w="2565" w:type="dxa"/>
+            <w:tcBorders>
+              <w:top w:val="single" w:sz="6" w:space="0" w:color="auto"/>
+              <w:left w:val="single" w:sz="6" w:space="0" w:color="auto"/>
+              <w:bottom w:val="single" w:sz="6" w:space="0" w:color="auto"/>
+              <w:right w:val="single" w:sz="6" w:space="0" w:color="auto"/>
+            </w:tcBorders>
+            <w:hideMark/>
+          </w:tcPr>
+          <w:p>
+            <w:pPr>
+              <w:rPr>
+                <w:lang w:val="en-US"/>
+              </w:rPr>
+            </w:pPr>
+            <w:r>
+              <w:rPr>
+                <w:b/>
+                <w:bCs/>
+              </w:rPr>
+              <w:t>Preconditions</w:t>
+            </w:r>
+            <w:r>
+              <w:rPr>
+                <w:lang w:val="en-US"/>
+              </w:rPr>
+              <w:t> </w:t>
+            </w:r>
+          </w:p>
+        </w:tc>
+        <w:tc>
+          <w:tcPr>
+            <w:tcW w:w="6510" w:type="dxa"/>
+            <w:tcBorders>
+              <w:top w:val="single" w:sz="6" w:space="0" w:color="auto"/>
+              <w:left w:val="single" w:sz="6" w:space="0" w:color="auto"/>
+              <w:bottom w:val="single" w:sz="6" w:space="0" w:color="auto"/>
+              <w:right w:val="single" w:sz="6" w:space="0" w:color="auto"/>
+            </w:tcBorders>
+            <w:hideMark/>
+          </w:tcPr>
+          <w:p>
+            <w:pPr>
+              <w:rPr>
+                <w:lang w:val="en-US"/>
+              </w:rPr>
+            </w:pPr>
+            <w:r>
+              <w:t>1. The space, changing room, entrance or equipment item exists in the facility records.</w:t>
+            </w:r>
+            <w:r>
+              <w:rPr>
+                <w:lang w:val="en-US"/>
+              </w:rPr>
+              <w:t> </w:t>
+            </w:r>
+            <w:r>
+              <w:rPr>
+                <w:lang w:val="en-US"/>
+              </w:rPr>
+              <w:br/>
+            </w:r>
+            <w:r>
+              <w:t>2. The staff member knows which space is affected, time range and reason for unavailability (maintenance, inspection or community event).</w:t>
+            </w:r>
+            <w:r>
+              <w:rPr>
+                <w:lang w:val="en-US"/>
+              </w:rPr>
+              <w:t> </w:t>
+            </w:r>
+          </w:p>
+        </w:tc>
+      </w:tr>
+      <w:tr>
+        <w:trPr>
+          <w:trHeight w:val="285"/>
+        </w:trPr>
+        <w:tc>
+          <w:tcPr>
+            <w:tcW w:w="2565" w:type="dxa"/>
+            <w:tcBorders>
+              <w:top w:val="single" w:sz="6" w:space="0" w:color="auto"/>
+              <w:left w:val="single" w:sz="6" w:space="0" w:color="auto"/>
+              <w:bottom w:val="single" w:sz="6" w:space="0" w:color="auto"/>
+              <w:right w:val="single" w:sz="6" w:space="0" w:color="auto"/>
+            </w:tcBorders>
+            <w:hideMark/>
+          </w:tcPr>
+          <w:p>
+            <w:pPr>
+              <w:rPr>
+                <w:lang w:val="en-US"/>
+              </w:rPr>
+            </w:pPr>
+            <w:r>
+              <w:rPr>
+                <w:b/>
+                <w:bCs/>
+              </w:rPr>
+              <w:t>Trigger</w:t>
+            </w:r>
+            <w:r>
+              <w:rPr>
+                <w:lang w:val="en-US"/>
+              </w:rPr>
+              <w:t> </w:t>
+            </w:r>
+          </w:p>
+        </w:tc>
+        <w:tc>
+          <w:tcPr>
+            <w:tcW w:w="6510" w:type="dxa"/>
+            <w:tcBorders>
+              <w:top w:val="single" w:sz="6" w:space="0" w:color="auto"/>
+              <w:left w:val="single" w:sz="6" w:space="0" w:color="auto"/>
+              <w:bottom w:val="single" w:sz="6" w:space="0" w:color="auto"/>
+              <w:right w:val="single" w:sz="6" w:space="0" w:color="auto"/>
+            </w:tcBorders>
+            <w:hideMark/>
+          </w:tcPr>
+          <w:p>
+            <w:pPr>
+              <w:rPr>
+                <w:lang w:val="en-US"/>
+              </w:rPr>
+            </w:pPr>
+            <w:r>
+              <w:t>The maintenance officer or another source informs a staff member that a space will be out of service.</w:t>
+            </w:r>
+            <w:r>
+              <w:rPr>
+                <w:lang w:val="en-US"/>
+              </w:rPr>
+              <w:t> </w:t>
+            </w:r>
+          </w:p>
+        </w:tc>
+      </w:tr>
+      <w:tr>
+        <w:trPr>
+          <w:trHeight w:val="285"/>
+        </w:trPr>
+        <w:tc>
+          <w:tcPr>
+            <w:tcW w:w="9075" w:type="dxa"/>
+            <w:gridSpan w:val="2"/>
+            <w:tcBorders>
+              <w:top w:val="single" w:sz="6" w:space="0" w:color="auto"/>
+              <w:left w:val="single" w:sz="6" w:space="0" w:color="auto"/>
+              <w:bottom w:val="single" w:sz="6" w:space="0" w:color="auto"/>
+              <w:right w:val="single" w:sz="6" w:space="0" w:color="auto"/>
+            </w:tcBorders>
+            <w:shd w:val="clear" w:color="auto" w:fill="C6D9F1"/>
+            <w:hideMark/>
+          </w:tcPr>
+          <w:p>
+            <w:pPr>
+              <w:rPr>
+                <w:lang w:val="en-US"/>
+              </w:rPr>
+            </w:pPr>
+            <w:r>
+              <w:rPr>
+                <w:b/>
+                <w:bCs/>
+              </w:rPr>
+              <w:t>Success Flow</w:t>
+            </w:r>
+            <w:r>
+              <w:rPr>
+                <w:lang w:val="en-US"/>
+              </w:rPr>
+              <w:t> </w:t>
+            </w:r>
+          </w:p>
+        </w:tc>
+      </w:tr>
+      <w:tr>
+        <w:trPr>
+          <w:trHeight w:val="1980"/>
+        </w:trPr>
+        <w:tc>
+          <w:tcPr>
+            <w:tcW w:w="9075" w:type="dxa"/>
+            <w:gridSpan w:val="2"/>
+            <w:tcBorders>
+              <w:top w:val="single" w:sz="6" w:space="0" w:color="auto"/>
+              <w:left w:val="single" w:sz="6" w:space="0" w:color="auto"/>
+              <w:bottom w:val="single" w:sz="6" w:space="0" w:color="auto"/>
+              <w:right w:val="single" w:sz="6" w:space="0" w:color="auto"/>
+            </w:tcBorders>
+            <w:hideMark/>
+          </w:tcPr>
+          <w:p>
+            <w:pPr>
+              <w:numPr>
+                <w:ilvl w:val="0"/>
+                <w:numId w:val="5"/>
+              </w:numPr>
+              <w:rPr>
+                <w:lang w:val="en-US"/>
+              </w:rPr>
+            </w:pPr>
+            <w:r>
+              <w:t>The staff member selects specific area in facility and then affected space.</w:t>
+            </w:r>
+            <w:r>
+              <w:rPr>
+                <w:lang w:val="en-US"/>
+              </w:rPr>
+              <w:t> </w:t>
+            </w:r>
+          </w:p>
+          <w:p>
+            <w:pPr>
+              <w:numPr>
+                <w:ilvl w:val="0"/>
+                <w:numId w:val="6"/>
+              </w:numPr>
+              <w:rPr>
+                <w:lang w:val="en-US"/>
+              </w:rPr>
+            </w:pPr>
+            <w:r>
+              <w:t>The staff member enters the starting date and date/time range of the restriction.</w:t>
+            </w:r>
+            <w:r>
+              <w:rPr>
+                <w:lang w:val="en-US"/>
+              </w:rPr>
+              <w:t> </w:t>
+            </w:r>
+          </w:p>
+          <w:p>
+            <w:pPr>
+              <w:numPr>
+                <w:ilvl w:val="0"/>
+                <w:numId w:val="7"/>
+              </w:numPr>
+              <w:rPr>
+                <w:lang w:val="en-US"/>
+              </w:rPr>
+            </w:pPr>
+            <w:r>
+              <w:t>The staff member enters reason for unavailability: maintenance, inspection or community event.</w:t>
+            </w:r>
+            <w:r>
+              <w:rPr>
+                <w:lang w:val="en-US"/>
+              </w:rPr>
+              <w:t> </w:t>
+            </w:r>
+          </w:p>
+          <w:p>
+            <w:pPr>
+              <w:numPr>
+                <w:ilvl w:val="0"/>
+                <w:numId w:val="8"/>
+              </w:numPr>
+              <w:rPr>
+                <w:lang w:val="en-US"/>
+              </w:rPr>
+            </w:pPr>
+            <w:r>
+              <w:t>The staff member checks combined view (UC2) and confirms that the space shows as unavailable and other spaces of the facility still show as available.</w:t>
+            </w:r>
+            <w:r>
+              <w:rPr>
+                <w:lang w:val="en-US"/>
+              </w:rPr>
+              <w:t> </w:t>
+            </w:r>
+          </w:p>
+          <w:p>
+            <w:pPr>
+              <w:numPr>
+                <w:ilvl w:val="0"/>
+                <w:numId w:val="9"/>
+              </w:numPr>
+              <w:rPr>
+                <w:lang w:val="en-US"/>
+              </w:rPr>
+            </w:pPr>
+            <w:r>
+              <w:t>The staff member checks whether any existing bookings of space fall inside the range (A). If there are none, the use case ends.</w:t>
+            </w:r>
+            <w:r>
+              <w:rPr>
+                <w:lang w:val="en-US"/>
+              </w:rPr>
+              <w:t> </w:t>
+            </w:r>
+          </w:p>
+          <w:p>
+            <w:pPr>
+              <w:rPr>
+                <w:lang w:val="en-US"/>
+              </w:rPr>
+            </w:pPr>
+            <w:r>
+              <w:t> </w:t>
+            </w:r>
+            <w:r>
+              <w:rPr>
+                <w:lang w:val="en-US"/>
+              </w:rPr>
+              <w:t> </w:t>
+            </w:r>
+          </w:p>
+        </w:tc>
+      </w:tr>
+      <w:tr>
+        <w:trPr>
+          <w:trHeight w:val="225"/>
+        </w:trPr>
+        <w:tc>
+          <w:tcPr>
+            <w:tcW w:w="9075" w:type="dxa"/>
+            <w:gridSpan w:val="2"/>
+            <w:tcBorders>
+              <w:top w:val="single" w:sz="6" w:space="0" w:color="auto"/>
+              <w:left w:val="single" w:sz="6" w:space="0" w:color="auto"/>
+              <w:bottom w:val="single" w:sz="6" w:space="0" w:color="auto"/>
+              <w:right w:val="single" w:sz="6" w:space="0" w:color="auto"/>
+            </w:tcBorders>
+            <w:shd w:val="clear" w:color="auto" w:fill="C6D9F1"/>
+            <w:hideMark/>
+          </w:tcPr>
+          <w:p>
+            <w:pPr>
+              <w:rPr>
+                <w:lang w:val="en-US"/>
+              </w:rPr>
+            </w:pPr>
+            <w:r>
+              <w:rPr>
+                <w:b/>
+                <w:bCs/>
+              </w:rPr>
+              <w:lastRenderedPageBreak/>
+              <w:t>Alternate Flow</w:t>
+            </w:r>
+            <w:r>
+              <w:rPr>
+                <w:lang w:val="en-US"/>
+              </w:rPr>
+              <w:t> </w:t>
+            </w:r>
+          </w:p>
+        </w:tc>
+      </w:tr>
+      <w:tr>
+        <w:trPr>
+          <w:trHeight w:val="1710"/>
+        </w:trPr>
+        <w:tc>
+          <w:tcPr>
+            <w:tcW w:w="9075" w:type="dxa"/>
+            <w:gridSpan w:val="2"/>
+            <w:tcBorders>
+              <w:top w:val="single" w:sz="6" w:space="0" w:color="auto"/>
+              <w:left w:val="single" w:sz="6" w:space="0" w:color="auto"/>
+              <w:bottom w:val="single" w:sz="6" w:space="0" w:color="auto"/>
+              <w:right w:val="single" w:sz="6" w:space="0" w:color="auto"/>
+            </w:tcBorders>
+            <w:hideMark/>
+          </w:tcPr>
+          <w:p>
+            <w:pPr>
+              <w:numPr>
+                <w:ilvl w:val="0"/>
+                <w:numId w:val="10"/>
+              </w:numPr>
+              <w:rPr>
+                <w:lang w:val="en-US"/>
+              </w:rPr>
+            </w:pPr>
+            <w:r>
+              <w:t>If the restriction affects more than one space, the staff member repeats steps 1 to 4 for each space, so every restriction has its own record.</w:t>
+            </w:r>
+            <w:r>
+              <w:rPr>
+                <w:lang w:val="en-US"/>
+              </w:rPr>
+              <w:t> </w:t>
+            </w:r>
+          </w:p>
+          <w:p>
+            <w:pPr>
+              <w:rPr>
+                <w:lang w:val="en-US"/>
+              </w:rPr>
+            </w:pPr>
+            <w:r>
+              <w:t> </w:t>
+            </w:r>
+            <w:r>
+              <w:rPr>
+                <w:lang w:val="en-US"/>
+              </w:rPr>
+              <w:t> </w:t>
+            </w:r>
+          </w:p>
+          <w:p>
+            <w:pPr>
+              <w:numPr>
+                <w:ilvl w:val="0"/>
+                <w:numId w:val="11"/>
+              </w:numPr>
+              <w:rPr>
+                <w:lang w:val="en-US"/>
+              </w:rPr>
+            </w:pPr>
+            <w:r>
+              <w:t>At step 5 the staff member finds existing bookings inside the restriction range. The staff member starts “Record closure, relocation or delayed start” for each affected booking. </w:t>
+            </w:r>
+            <w:r>
+              <w:rPr>
+                <w:lang w:val="en-US"/>
+              </w:rPr>
+              <w:t> </w:t>
+            </w:r>
+          </w:p>
+          <w:p>
+            <w:pPr>
+              <w:rPr>
+                <w:lang w:val="en-US"/>
+              </w:rPr>
+            </w:pPr>
+            <w:r>
+              <w:t> </w:t>
+            </w:r>
+            <w:r>
+              <w:rPr>
+                <w:lang w:val="en-US"/>
+              </w:rPr>
+              <w:t> </w:t>
+            </w:r>
+          </w:p>
+          <w:p>
+            <w:pPr>
+              <w:numPr>
+                <w:ilvl w:val="0"/>
+                <w:numId w:val="12"/>
+              </w:numPr>
+              <w:rPr>
+                <w:lang w:val="en-US"/>
+              </w:rPr>
+            </w:pPr>
+            <w:r>
+              <w:t>If the date/time range or reason for restriction is unclear, the staff member asks maintenance officer before step 2.</w:t>
+            </w:r>
+            <w:r>
+              <w:rPr>
+                <w:lang w:val="en-US"/>
+              </w:rPr>
+              <w:t> </w:t>
+            </w:r>
+          </w:p>
+          <w:p>
+            <w:pPr>
+              <w:rPr>
+                <w:lang w:val="en-US"/>
+              </w:rPr>
+            </w:pPr>
+            <w:r>
+              <w:t> </w:t>
+            </w:r>
+            <w:r>
+              <w:rPr>
+                <w:lang w:val="en-US"/>
+              </w:rPr>
+              <w:t> </w:t>
+            </w:r>
+          </w:p>
+          <w:p>
+            <w:pPr>
+              <w:rPr>
+                <w:lang w:val="en-US"/>
+              </w:rPr>
+            </w:pPr>
+            <w:r>
+              <w:t> </w:t>
+            </w:r>
+            <w:r>
+              <w:rPr>
+                <w:lang w:val="en-US"/>
+              </w:rPr>
+              <w:t> </w:t>
+            </w:r>
+          </w:p>
+        </w:tc>
+      </w:tr>
+      <w:tr>
+        <w:trPr>
+          <w:trHeight w:val="285"/>
+        </w:trPr>
+        <w:tc>
+          <w:tcPr>
+            <w:tcW w:w="9075" w:type="dxa"/>
+            <w:gridSpan w:val="2"/>
+            <w:tcBorders>
+              <w:top w:val="single" w:sz="6" w:space="0" w:color="auto"/>
+              <w:left w:val="single" w:sz="6" w:space="0" w:color="auto"/>
+              <w:bottom w:val="single" w:sz="6" w:space="0" w:color="auto"/>
+              <w:right w:val="single" w:sz="6" w:space="0" w:color="auto"/>
+            </w:tcBorders>
+            <w:hideMark/>
+          </w:tcPr>
+          <w:p>
+            <w:pPr>
+              <w:rPr>
+                <w:lang w:val="en-US"/>
+              </w:rPr>
+            </w:pPr>
+            <w:r>
+              <w:rPr>
+                <w:lang w:val="en-US"/>
+              </w:rPr>
+              <w:t> </w:t>
+            </w:r>
+          </w:p>
+        </w:tc>
+      </w:tr>
+      <w:tr>
+        <w:trPr>
+          <w:trHeight w:val="285"/>
+        </w:trPr>
+        <w:tc>
+          <w:tcPr>
+            <w:tcW w:w="9075" w:type="dxa"/>
+            <w:gridSpan w:val="2"/>
+            <w:tcBorders>
+              <w:top w:val="single" w:sz="6" w:space="0" w:color="auto"/>
+              <w:left w:val="single" w:sz="6" w:space="0" w:color="auto"/>
+              <w:bottom w:val="single" w:sz="6" w:space="0" w:color="auto"/>
+              <w:right w:val="single" w:sz="6" w:space="0" w:color="auto"/>
+            </w:tcBorders>
+            <w:shd w:val="clear" w:color="auto" w:fill="C6D9F1"/>
+            <w:hideMark/>
+          </w:tcPr>
+          <w:p>
+            <w:pPr>
+              <w:rPr>
+                <w:lang w:val="en-US"/>
+              </w:rPr>
+            </w:pPr>
+            <w:r>
+              <w:rPr>
+                <w:b/>
+                <w:bCs/>
+              </w:rPr>
+              <w:t>Exception Flow</w:t>
+            </w:r>
+            <w:r>
+              <w:rPr>
+                <w:lang w:val="en-US"/>
+              </w:rPr>
+              <w:t> </w:t>
+            </w:r>
+          </w:p>
+        </w:tc>
+      </w:tr>
+      <w:tr>
+        <w:trPr>
+          <w:trHeight w:val="1665"/>
+        </w:trPr>
+        <w:tc>
+          <w:tcPr>
+            <w:tcW w:w="9075" w:type="dxa"/>
+            <w:gridSpan w:val="2"/>
+            <w:tcBorders>
+              <w:top w:val="single" w:sz="6" w:space="0" w:color="auto"/>
+              <w:left w:val="single" w:sz="6" w:space="0" w:color="auto"/>
+              <w:bottom w:val="single" w:sz="6" w:space="0" w:color="auto"/>
+              <w:right w:val="single" w:sz="6" w:space="0" w:color="auto"/>
+            </w:tcBorders>
+            <w:hideMark/>
+          </w:tcPr>
+          <w:p>
+            <w:pPr>
+              <w:numPr>
+                <w:ilvl w:val="0"/>
+                <w:numId w:val="13"/>
+              </w:numPr>
+              <w:rPr>
+                <w:lang w:val="en-US"/>
+              </w:rPr>
+            </w:pPr>
+            <w:r>
+              <w:t xml:space="preserve">If the date/time range or reason for restriction is missing, the restriction is not </w:t>
+            </w:r>
+            <w:proofErr w:type="gramStart"/>
+            <w:r>
+              <w:t>recorded</w:t>
+            </w:r>
+            <w:proofErr w:type="gramEnd"/>
+            <w:r>
+              <w:t xml:space="preserve"> and the staff member must obtain the detail first.</w:t>
+            </w:r>
+            <w:r>
+              <w:rPr>
+                <w:lang w:val="en-US"/>
+              </w:rPr>
+              <w:t> </w:t>
+            </w:r>
+          </w:p>
+          <w:p>
+            <w:pPr>
+              <w:numPr>
+                <w:ilvl w:val="0"/>
+                <w:numId w:val="14"/>
+              </w:numPr>
+              <w:rPr>
+                <w:lang w:val="en-US"/>
+              </w:rPr>
+            </w:pPr>
+            <w:r>
+              <w:t> If the end of the time range is before the start, staff member corrects the range at step 2.</w:t>
+            </w:r>
+            <w:r>
+              <w:rPr>
+                <w:lang w:val="en-US"/>
+              </w:rPr>
+              <w:t> </w:t>
+            </w:r>
+          </w:p>
+          <w:p>
+            <w:pPr>
+              <w:numPr>
+                <w:ilvl w:val="0"/>
+                <w:numId w:val="15"/>
+              </w:numPr>
+              <w:rPr>
+                <w:lang w:val="en-US"/>
+              </w:rPr>
+            </w:pPr>
+            <w:r>
+              <w:t>If it is not clear who may decide that the space is unavailable, staff member records nothing until it is confirmed.</w:t>
+            </w:r>
+            <w:r>
+              <w:rPr>
+                <w:lang w:val="en-US"/>
+              </w:rPr>
+              <w:t> </w:t>
+            </w:r>
+          </w:p>
+          <w:p>
+            <w:pPr>
+              <w:rPr>
+                <w:lang w:val="en-US"/>
+              </w:rPr>
+            </w:pPr>
+            <w:r>
+              <w:t> </w:t>
+            </w:r>
+            <w:r>
+              <w:rPr>
+                <w:lang w:val="en-US"/>
+              </w:rPr>
+              <w:t> </w:t>
+            </w:r>
+          </w:p>
+        </w:tc>
+      </w:tr>
+      <w:tr>
+        <w:trPr>
+          <w:trHeight w:val="285"/>
+        </w:trPr>
+        <w:tc>
+          <w:tcPr>
+            <w:tcW w:w="2565" w:type="dxa"/>
+            <w:tcBorders>
+              <w:top w:val="single" w:sz="6" w:space="0" w:color="auto"/>
+              <w:left w:val="single" w:sz="6" w:space="0" w:color="auto"/>
+              <w:bottom w:val="single" w:sz="6" w:space="0" w:color="auto"/>
+              <w:right w:val="single" w:sz="6" w:space="0" w:color="auto"/>
+            </w:tcBorders>
+            <w:hideMark/>
+          </w:tcPr>
+          <w:p>
+            <w:pPr>
+              <w:rPr>
+                <w:lang w:val="en-US"/>
+              </w:rPr>
+            </w:pPr>
+            <w:r>
+              <w:rPr>
+                <w:b/>
+                <w:bCs/>
+              </w:rPr>
+              <w:t>Post conditions</w:t>
+            </w:r>
+            <w:r>
+              <w:rPr>
+                <w:lang w:val="en-US"/>
+              </w:rPr>
+              <w:t> </w:t>
+            </w:r>
+          </w:p>
+        </w:tc>
+        <w:tc>
+          <w:tcPr>
+            <w:tcW w:w="6510" w:type="dxa"/>
+            <w:tcBorders>
+              <w:top w:val="nil"/>
+              <w:left w:val="single" w:sz="6" w:space="0" w:color="auto"/>
+              <w:bottom w:val="single" w:sz="6" w:space="0" w:color="auto"/>
+              <w:right w:val="single" w:sz="6" w:space="0" w:color="auto"/>
+            </w:tcBorders>
+            <w:hideMark/>
+          </w:tcPr>
+          <w:p>
+            <w:pPr>
+              <w:rPr>
+                <w:lang w:val="en-US"/>
+              </w:rPr>
+            </w:pPr>
+            <w:r>
+              <w:t>1. The space or equipment item is shown as unavailable for the stated time range with reason for unavailability.</w:t>
+            </w:r>
+            <w:r>
+              <w:rPr>
+                <w:lang w:val="en-US"/>
+              </w:rPr>
+              <w:t> </w:t>
+            </w:r>
+            <w:r>
+              <w:rPr>
+                <w:lang w:val="en-US"/>
+              </w:rPr>
+              <w:br/>
+            </w:r>
+            <w:r>
+              <w:t>2. Other unaffected spaces of the same facility can still be booked.</w:t>
+            </w:r>
+            <w:r>
+              <w:rPr>
+                <w:lang w:val="en-US"/>
+              </w:rPr>
+              <w:t> </w:t>
+            </w:r>
+            <w:r>
+              <w:rPr>
+                <w:lang w:val="en-US"/>
+              </w:rPr>
+              <w:br/>
+            </w:r>
+            <w:r>
+              <w:t>3. Existing bookings affected by the restriction are identified for staff to follow up.</w:t>
+            </w:r>
+            <w:r>
+              <w:rPr>
+                <w:lang w:val="en-US"/>
+              </w:rPr>
+              <w:t> </w:t>
+            </w:r>
+            <w:r>
+              <w:rPr>
+                <w:lang w:val="en-US"/>
+              </w:rPr>
+              <w:br/>
+            </w:r>
+            <w:r>
+              <w:t>4. New booking requests for the restricted space and range are checked against the restriction when they are process.</w:t>
+            </w:r>
+            <w:r>
+              <w:rPr>
+                <w:lang w:val="en-US"/>
+              </w:rPr>
+              <w:t> </w:t>
+            </w:r>
+          </w:p>
+        </w:tc>
+      </w:tr>
+    </w:tbl>
+    <w:p>
+      <w:pPr>
+        <w:rPr>
+          <w:lang w:val="uk-UA"/>
+        </w:rPr>
+      </w:pPr>
+    </w:p>
     <w:sectPr>
       <w:pgSz w:w="11906" w:h="16838"/>
       <w:pgMar w:top="1440" w:right="1440" w:bottom="1440" w:left="1440" w:header="720" w:footer="720" w:gutter="0"/>
@@ -19527,6 +22738,155 @@
 <file path=word/numbering.xml><?xml version="1.0" encoding="utf-8"?>
 <w:numbering xmlns:wpc="http://schemas.microsoft.com/office/word/2010/wordprocessingCanvas" xmlns:cx="http://schemas.microsoft.com/office/drawing/2014/chartex" xmlns:cx1="http://schemas.microsoft.com/office/drawing/2015/9/8/chartex" xmlns:cx2="http://schemas.microsoft.com/office/drawing/2015/10/21/chartex" xmlns:cx3="http://schemas.microsoft.com/office/drawing/2016/5/9/chartex" xmlns:cx4="http://schemas.microsoft.com/office/drawing/2016/5/10/chartex" xmlns:cx5="http://schemas.microsoft.com/office/drawing/2016/5/11/chartex" xmlns:cx6="http://schemas.microsoft.com/office/drawing/2016/5/12/chartex" xmlns:cx7="http://schemas.microsoft.com/office/drawing/2016/5/13/chartex" xmlns:cx8="http://schemas.microsoft.com/office/drawing/2016/5/14/chartex" xmlns:mc="http://schemas.openxmlformats.org/markup-compatibility/2006" xmlns:aink="http://schemas.microsoft.com/office/drawing/2016/ink" xmlns:am3d="http://schemas.microsoft.com/office/drawing/2017/model3d" xmlns:o="urn:schemas-microsoft-com:office:office" xmlns:oel="http://schemas.microsoft.com/office/2019/extlst" xmlns:r="http://schemas.openxmlformats.org/officeDocument/2006/relationships" xmlns:m="http://schemas.openxmlformats.org/officeDocument/2006/math" xmlns:v="urn:schemas-microsoft-com:vml" xmlns:wp14="http://schemas.microsoft.com/office/word/2010/wordprocessingDrawing" xmlns:wp="http://schemas.openxmlformats.org/drawingml/2006/wordprocessingDrawing" xmlns:w10="urn:schemas-microsoft-com:office:word" xmlns:w="http://schemas.openxmlformats.org/wordprocessingml/2006/main" xmlns:w14="http://schemas.microsoft.com/office/word/2010/wordml" xmlns:w15="http://schemas.microsoft.com/office/word/2012/wordml" xmlns:w16cex="http://schemas.microsoft.com/office/word/2018/wordml/cex" xmlns:w16cid="http://schemas.microsoft.com/office/word/2016/wordml/cid" xmlns:w16="http://schemas.microsoft.com/office/word/2018/wordml" xmlns:w16du="http://schemas.microsoft.com/office/word/2023/wordml/word16du" xmlns:w16sdtdh="http://schemas.microsoft.com/office/word/2020/wordml/sdtdatahash" xmlns:w16sdtfl="http://schemas.microsoft.com/office/word/2024/wordml/sdtformatlock" xmlns:w16se="http://schemas.microsoft.com/office/word/2015/wordml/symex" xmlns:wpg="http://schemas.microsoft.com/office/word/2010/wordprocessingGroup" xmlns:wpi="http://schemas.microsoft.com/office/word/2010/wordprocessingInk" xmlns:wne="http://schemas.microsoft.com/office/word/2006/wordml" xmlns:wps="http://schemas.microsoft.com/office/word/2010/wordprocessingShape" mc:Ignorable="w14 w15 w16se w16cid w16 w16cex w16sdtdh w16sdtfl w16du wp14">
   <w:abstractNum w:abstractNumId="0" w15:restartNumberingAfterBreak="0">
+    <w:nsid w:val="010E11A7"/>
+    <w:multiLevelType w:val="multilevel"/>
+    <w:tmpl w:val="CE926422"/>
+    <w:lvl w:ilvl="0">
+      <w:start w:val="1"/>
+      <w:numFmt w:val="bullet"/>
+      <w:lvlText w:val=""/>
+      <w:lvlJc w:val="left"/>
+      <w:pPr>
+        <w:tabs>
+          <w:tab w:val="num" w:pos="720"/>
+        </w:tabs>
+        <w:ind w:left="720" w:hanging="360"/>
+      </w:pPr>
+      <w:rPr>
+        <w:rFonts w:ascii="Symbol" w:hAnsi="Symbol" w:hint="default"/>
+        <w:sz w:val="20"/>
+      </w:rPr>
+    </w:lvl>
+    <w:lvl w:ilvl="1" w:tentative="1">
+      <w:start w:val="1"/>
+      <w:numFmt w:val="bullet"/>
+      <w:lvlText w:val=""/>
+      <w:lvlJc w:val="left"/>
+      <w:pPr>
+        <w:tabs>
+          <w:tab w:val="num" w:pos="1440"/>
+        </w:tabs>
+        <w:ind w:left="1440" w:hanging="360"/>
+      </w:pPr>
+      <w:rPr>
+        <w:rFonts w:ascii="Symbol" w:hAnsi="Symbol" w:hint="default"/>
+        <w:sz w:val="20"/>
+      </w:rPr>
+    </w:lvl>
+    <w:lvl w:ilvl="2" w:tentative="1">
+      <w:start w:val="1"/>
+      <w:numFmt w:val="bullet"/>
+      <w:lvlText w:val=""/>
+      <w:lvlJc w:val="left"/>
+      <w:pPr>
+        <w:tabs>
+          <w:tab w:val="num" w:pos="2160"/>
+        </w:tabs>
+        <w:ind w:left="2160" w:hanging="360"/>
+      </w:pPr>
+      <w:rPr>
+        <w:rFonts w:ascii="Symbol" w:hAnsi="Symbol" w:hint="default"/>
+        <w:sz w:val="20"/>
+      </w:rPr>
+    </w:lvl>
+    <w:lvl w:ilvl="3" w:tentative="1">
+      <w:start w:val="1"/>
+      <w:numFmt w:val="bullet"/>
+      <w:lvlText w:val=""/>
+      <w:lvlJc w:val="left"/>
+      <w:pPr>
+        <w:tabs>
+          <w:tab w:val="num" w:pos="2880"/>
+        </w:tabs>
+        <w:ind w:left="2880" w:hanging="360"/>
+      </w:pPr>
+      <w:rPr>
+        <w:rFonts w:ascii="Symbol" w:hAnsi="Symbol" w:hint="default"/>
+        <w:sz w:val="20"/>
+      </w:rPr>
+    </w:lvl>
+    <w:lvl w:ilvl="4" w:tentative="1">
+      <w:start w:val="1"/>
+      <w:numFmt w:val="bullet"/>
+      <w:lvlText w:val=""/>
+      <w:lvlJc w:val="left"/>
+      <w:pPr>
+        <w:tabs>
+          <w:tab w:val="num" w:pos="3600"/>
+        </w:tabs>
+        <w:ind w:left="3600" w:hanging="360"/>
+      </w:pPr>
+      <w:rPr>
+        <w:rFonts w:ascii="Symbol" w:hAnsi="Symbol" w:hint="default"/>
+        <w:sz w:val="20"/>
+      </w:rPr>
+    </w:lvl>
+    <w:lvl w:ilvl="5" w:tentative="1">
+      <w:start w:val="1"/>
+      <w:numFmt w:val="bullet"/>
+      <w:lvlText w:val=""/>
+      <w:lvlJc w:val="left"/>
+      <w:pPr>
+        <w:tabs>
+          <w:tab w:val="num" w:pos="4320"/>
+        </w:tabs>
+        <w:ind w:left="4320" w:hanging="360"/>
+      </w:pPr>
+      <w:rPr>
+        <w:rFonts w:ascii="Symbol" w:hAnsi="Symbol" w:hint="default"/>
+        <w:sz w:val="20"/>
+      </w:rPr>
+    </w:lvl>
+    <w:lvl w:ilvl="6" w:tentative="1">
+      <w:start w:val="1"/>
+      <w:numFmt w:val="bullet"/>
+      <w:lvlText w:val=""/>
+      <w:lvlJc w:val="left"/>
+      <w:pPr>
+        <w:tabs>
+          <w:tab w:val="num" w:pos="5040"/>
+        </w:tabs>
+        <w:ind w:left="5040" w:hanging="360"/>
+      </w:pPr>
+      <w:rPr>
+        <w:rFonts w:ascii="Symbol" w:hAnsi="Symbol" w:hint="default"/>
+        <w:sz w:val="20"/>
+      </w:rPr>
+    </w:lvl>
+    <w:lvl w:ilvl="7" w:tentative="1">
+      <w:start w:val="1"/>
+      <w:numFmt w:val="bullet"/>
+      <w:lvlText w:val=""/>
+      <w:lvlJc w:val="left"/>
+      <w:pPr>
+        <w:tabs>
+          <w:tab w:val="num" w:pos="5760"/>
+        </w:tabs>
+        <w:ind w:left="5760" w:hanging="360"/>
+      </w:pPr>
+      <w:rPr>
+        <w:rFonts w:ascii="Symbol" w:hAnsi="Symbol" w:hint="default"/>
+        <w:sz w:val="20"/>
+      </w:rPr>
+    </w:lvl>
+    <w:lvl w:ilvl="8" w:tentative="1">
+      <w:start w:val="1"/>
+      <w:numFmt w:val="bullet"/>
+      <w:lvlText w:val=""/>
+      <w:lvlJc w:val="left"/>
+      <w:pPr>
+        <w:tabs>
+          <w:tab w:val="num" w:pos="6480"/>
+        </w:tabs>
+        <w:ind w:left="6480" w:hanging="360"/>
+      </w:pPr>
+      <w:rPr>
+        <w:rFonts w:ascii="Symbol" w:hAnsi="Symbol" w:hint="default"/>
+        <w:sz w:val="20"/>
+      </w:rPr>
+    </w:lvl>
+  </w:abstractNum>
+  <w:abstractNum w:abstractNumId="1" w15:restartNumberingAfterBreak="0">
     <w:nsid w:val="02E6173C"/>
     <w:multiLevelType w:val="hybridMultilevel"/>
     <w:tmpl w:val="29A2951A"/>
@@ -19612,7 +22972,269 @@
       </w:pPr>
     </w:lvl>
   </w:abstractNum>
-  <w:abstractNum w:abstractNumId="1" w15:restartNumberingAfterBreak="0">
+  <w:abstractNum w:abstractNumId="2" w15:restartNumberingAfterBreak="0">
+    <w:nsid w:val="09C872B5"/>
+    <w:multiLevelType w:val="multilevel"/>
+    <w:tmpl w:val="BCC6A4BA"/>
+    <w:lvl w:ilvl="0">
+      <w:start w:val="4"/>
+      <w:numFmt w:val="decimal"/>
+      <w:lvlText w:val="%1."/>
+      <w:lvlJc w:val="left"/>
+      <w:pPr>
+        <w:tabs>
+          <w:tab w:val="num" w:pos="720"/>
+        </w:tabs>
+        <w:ind w:left="720" w:hanging="360"/>
+      </w:pPr>
+    </w:lvl>
+    <w:lvl w:ilvl="1" w:tentative="1">
+      <w:start w:val="1"/>
+      <w:numFmt w:val="decimal"/>
+      <w:lvlText w:val="%2."/>
+      <w:lvlJc w:val="left"/>
+      <w:pPr>
+        <w:tabs>
+          <w:tab w:val="num" w:pos="1440"/>
+        </w:tabs>
+        <w:ind w:left="1440" w:hanging="360"/>
+      </w:pPr>
+    </w:lvl>
+    <w:lvl w:ilvl="2" w:tentative="1">
+      <w:start w:val="1"/>
+      <w:numFmt w:val="decimal"/>
+      <w:lvlText w:val="%3."/>
+      <w:lvlJc w:val="left"/>
+      <w:pPr>
+        <w:tabs>
+          <w:tab w:val="num" w:pos="2160"/>
+        </w:tabs>
+        <w:ind w:left="2160" w:hanging="360"/>
+      </w:pPr>
+    </w:lvl>
+    <w:lvl w:ilvl="3" w:tentative="1">
+      <w:start w:val="1"/>
+      <w:numFmt w:val="decimal"/>
+      <w:lvlText w:val="%4."/>
+      <w:lvlJc w:val="left"/>
+      <w:pPr>
+        <w:tabs>
+          <w:tab w:val="num" w:pos="2880"/>
+        </w:tabs>
+        <w:ind w:left="2880" w:hanging="360"/>
+      </w:pPr>
+    </w:lvl>
+    <w:lvl w:ilvl="4" w:tentative="1">
+      <w:start w:val="1"/>
+      <w:numFmt w:val="decimal"/>
+      <w:lvlText w:val="%5."/>
+      <w:lvlJc w:val="left"/>
+      <w:pPr>
+        <w:tabs>
+          <w:tab w:val="num" w:pos="3600"/>
+        </w:tabs>
+        <w:ind w:left="3600" w:hanging="360"/>
+      </w:pPr>
+    </w:lvl>
+    <w:lvl w:ilvl="5" w:tentative="1">
+      <w:start w:val="1"/>
+      <w:numFmt w:val="decimal"/>
+      <w:lvlText w:val="%6."/>
+      <w:lvlJc w:val="left"/>
+      <w:pPr>
+        <w:tabs>
+          <w:tab w:val="num" w:pos="4320"/>
+        </w:tabs>
+        <w:ind w:left="4320" w:hanging="360"/>
+      </w:pPr>
+    </w:lvl>
+    <w:lvl w:ilvl="6" w:tentative="1">
+      <w:start w:val="1"/>
+      <w:numFmt w:val="decimal"/>
+      <w:lvlText w:val="%7."/>
+      <w:lvlJc w:val="left"/>
+      <w:pPr>
+        <w:tabs>
+          <w:tab w:val="num" w:pos="5040"/>
+        </w:tabs>
+        <w:ind w:left="5040" w:hanging="360"/>
+      </w:pPr>
+    </w:lvl>
+    <w:lvl w:ilvl="7" w:tentative="1">
+      <w:start w:val="1"/>
+      <w:numFmt w:val="decimal"/>
+      <w:lvlText w:val="%8."/>
+      <w:lvlJc w:val="left"/>
+      <w:pPr>
+        <w:tabs>
+          <w:tab w:val="num" w:pos="5760"/>
+        </w:tabs>
+        <w:ind w:left="5760" w:hanging="360"/>
+      </w:pPr>
+    </w:lvl>
+    <w:lvl w:ilvl="8" w:tentative="1">
+      <w:start w:val="1"/>
+      <w:numFmt w:val="decimal"/>
+      <w:lvlText w:val="%9."/>
+      <w:lvlJc w:val="left"/>
+      <w:pPr>
+        <w:tabs>
+          <w:tab w:val="num" w:pos="6480"/>
+        </w:tabs>
+        <w:ind w:left="6480" w:hanging="360"/>
+      </w:pPr>
+    </w:lvl>
+  </w:abstractNum>
+  <w:abstractNum w:abstractNumId="3" w15:restartNumberingAfterBreak="0">
+    <w:nsid w:val="1A82283C"/>
+    <w:multiLevelType w:val="multilevel"/>
+    <w:tmpl w:val="6A2C94E8"/>
+    <w:lvl w:ilvl="0">
+      <w:start w:val="1"/>
+      <w:numFmt w:val="bullet"/>
+      <w:lvlText w:val=""/>
+      <w:lvlJc w:val="left"/>
+      <w:pPr>
+        <w:tabs>
+          <w:tab w:val="num" w:pos="720"/>
+        </w:tabs>
+        <w:ind w:left="720" w:hanging="360"/>
+      </w:pPr>
+      <w:rPr>
+        <w:rFonts w:ascii="Symbol" w:hAnsi="Symbol" w:hint="default"/>
+        <w:sz w:val="20"/>
+      </w:rPr>
+    </w:lvl>
+    <w:lvl w:ilvl="1" w:tentative="1">
+      <w:start w:val="1"/>
+      <w:numFmt w:val="bullet"/>
+      <w:lvlText w:val=""/>
+      <w:lvlJc w:val="left"/>
+      <w:pPr>
+        <w:tabs>
+          <w:tab w:val="num" w:pos="1440"/>
+        </w:tabs>
+        <w:ind w:left="1440" w:hanging="360"/>
+      </w:pPr>
+      <w:rPr>
+        <w:rFonts w:ascii="Symbol" w:hAnsi="Symbol" w:hint="default"/>
+        <w:sz w:val="20"/>
+      </w:rPr>
+    </w:lvl>
+    <w:lvl w:ilvl="2" w:tentative="1">
+      <w:start w:val="1"/>
+      <w:numFmt w:val="bullet"/>
+      <w:lvlText w:val=""/>
+      <w:lvlJc w:val="left"/>
+      <w:pPr>
+        <w:tabs>
+          <w:tab w:val="num" w:pos="2160"/>
+        </w:tabs>
+        <w:ind w:left="2160" w:hanging="360"/>
+      </w:pPr>
+      <w:rPr>
+        <w:rFonts w:ascii="Symbol" w:hAnsi="Symbol" w:hint="default"/>
+        <w:sz w:val="20"/>
+      </w:rPr>
+    </w:lvl>
+    <w:lvl w:ilvl="3" w:tentative="1">
+      <w:start w:val="1"/>
+      <w:numFmt w:val="bullet"/>
+      <w:lvlText w:val=""/>
+      <w:lvlJc w:val="left"/>
+      <w:pPr>
+        <w:tabs>
+          <w:tab w:val="num" w:pos="2880"/>
+        </w:tabs>
+        <w:ind w:left="2880" w:hanging="360"/>
+      </w:pPr>
+      <w:rPr>
+        <w:rFonts w:ascii="Symbol" w:hAnsi="Symbol" w:hint="default"/>
+        <w:sz w:val="20"/>
+      </w:rPr>
+    </w:lvl>
+    <w:lvl w:ilvl="4" w:tentative="1">
+      <w:start w:val="1"/>
+      <w:numFmt w:val="bullet"/>
+      <w:lvlText w:val=""/>
+      <w:lvlJc w:val="left"/>
+      <w:pPr>
+        <w:tabs>
+          <w:tab w:val="num" w:pos="3600"/>
+        </w:tabs>
+        <w:ind w:left="3600" w:hanging="360"/>
+      </w:pPr>
+      <w:rPr>
+        <w:rFonts w:ascii="Symbol" w:hAnsi="Symbol" w:hint="default"/>
+        <w:sz w:val="20"/>
+      </w:rPr>
+    </w:lvl>
+    <w:lvl w:ilvl="5" w:tentative="1">
+      <w:start w:val="1"/>
+      <w:numFmt w:val="bullet"/>
+      <w:lvlText w:val=""/>
+      <w:lvlJc w:val="left"/>
+      <w:pPr>
+        <w:tabs>
+          <w:tab w:val="num" w:pos="4320"/>
+        </w:tabs>
+        <w:ind w:left="4320" w:hanging="360"/>
+      </w:pPr>
+      <w:rPr>
+        <w:rFonts w:ascii="Symbol" w:hAnsi="Symbol" w:hint="default"/>
+        <w:sz w:val="20"/>
+      </w:rPr>
+    </w:lvl>
+    <w:lvl w:ilvl="6" w:tentative="1">
+      <w:start w:val="1"/>
+      <w:numFmt w:val="bullet"/>
+      <w:lvlText w:val=""/>
+      <w:lvlJc w:val="left"/>
+      <w:pPr>
+        <w:tabs>
+          <w:tab w:val="num" w:pos="5040"/>
+        </w:tabs>
+        <w:ind w:left="5040" w:hanging="360"/>
+      </w:pPr>
+      <w:rPr>
+        <w:rFonts w:ascii="Symbol" w:hAnsi="Symbol" w:hint="default"/>
+        <w:sz w:val="20"/>
+      </w:rPr>
+    </w:lvl>
+    <w:lvl w:ilvl="7" w:tentative="1">
+      <w:start w:val="1"/>
+      <w:numFmt w:val="bullet"/>
+      <w:lvlText w:val=""/>
+      <w:lvlJc w:val="left"/>
+      <w:pPr>
+        <w:tabs>
+          <w:tab w:val="num" w:pos="5760"/>
+        </w:tabs>
+        <w:ind w:left="5760" w:hanging="360"/>
+      </w:pPr>
+      <w:rPr>
+        <w:rFonts w:ascii="Symbol" w:hAnsi="Symbol" w:hint="default"/>
+        <w:sz w:val="20"/>
+      </w:rPr>
+    </w:lvl>
+    <w:lvl w:ilvl="8" w:tentative="1">
+      <w:start w:val="1"/>
+      <w:numFmt w:val="bullet"/>
+      <w:lvlText w:val=""/>
+      <w:lvlJc w:val="left"/>
+      <w:pPr>
+        <w:tabs>
+          <w:tab w:val="num" w:pos="6480"/>
+        </w:tabs>
+        <w:ind w:left="6480" w:hanging="360"/>
+      </w:pPr>
+      <w:rPr>
+        <w:rFonts w:ascii="Symbol" w:hAnsi="Symbol" w:hint="default"/>
+        <w:sz w:val="20"/>
+      </w:rPr>
+    </w:lvl>
+  </w:abstractNum>
+  <w:abstractNum w:abstractNumId="4" w15:restartNumberingAfterBreak="0">
     <w:nsid w:val="1D1627DE"/>
     <w:multiLevelType w:val="hybridMultilevel"/>
     <w:tmpl w:val="4D0893F6"/>
@@ -19725,7 +23347,757 @@
       </w:rPr>
     </w:lvl>
   </w:abstractNum>
-  <w:abstractNum w:abstractNumId="2" w15:restartNumberingAfterBreak="0">
+  <w:abstractNum w:abstractNumId="5" w15:restartNumberingAfterBreak="0">
+    <w:nsid w:val="30A27A3C"/>
+    <w:multiLevelType w:val="multilevel"/>
+    <w:tmpl w:val="3A1E100C"/>
+    <w:lvl w:ilvl="0">
+      <w:start w:val="3"/>
+      <w:numFmt w:val="decimal"/>
+      <w:lvlText w:val="%1."/>
+      <w:lvlJc w:val="left"/>
+      <w:pPr>
+        <w:tabs>
+          <w:tab w:val="num" w:pos="720"/>
+        </w:tabs>
+        <w:ind w:left="720" w:hanging="360"/>
+      </w:pPr>
+    </w:lvl>
+    <w:lvl w:ilvl="1" w:tentative="1">
+      <w:start w:val="1"/>
+      <w:numFmt w:val="decimal"/>
+      <w:lvlText w:val="%2."/>
+      <w:lvlJc w:val="left"/>
+      <w:pPr>
+        <w:tabs>
+          <w:tab w:val="num" w:pos="1440"/>
+        </w:tabs>
+        <w:ind w:left="1440" w:hanging="360"/>
+      </w:pPr>
+    </w:lvl>
+    <w:lvl w:ilvl="2" w:tentative="1">
+      <w:start w:val="1"/>
+      <w:numFmt w:val="decimal"/>
+      <w:lvlText w:val="%3."/>
+      <w:lvlJc w:val="left"/>
+      <w:pPr>
+        <w:tabs>
+          <w:tab w:val="num" w:pos="2160"/>
+        </w:tabs>
+        <w:ind w:left="2160" w:hanging="360"/>
+      </w:pPr>
+    </w:lvl>
+    <w:lvl w:ilvl="3" w:tentative="1">
+      <w:start w:val="1"/>
+      <w:numFmt w:val="decimal"/>
+      <w:lvlText w:val="%4."/>
+      <w:lvlJc w:val="left"/>
+      <w:pPr>
+        <w:tabs>
+          <w:tab w:val="num" w:pos="2880"/>
+        </w:tabs>
+        <w:ind w:left="2880" w:hanging="360"/>
+      </w:pPr>
+    </w:lvl>
+    <w:lvl w:ilvl="4" w:tentative="1">
+      <w:start w:val="1"/>
+      <w:numFmt w:val="decimal"/>
+      <w:lvlText w:val="%5."/>
+      <w:lvlJc w:val="left"/>
+      <w:pPr>
+        <w:tabs>
+          <w:tab w:val="num" w:pos="3600"/>
+        </w:tabs>
+        <w:ind w:left="3600" w:hanging="360"/>
+      </w:pPr>
+    </w:lvl>
+    <w:lvl w:ilvl="5" w:tentative="1">
+      <w:start w:val="1"/>
+      <w:numFmt w:val="decimal"/>
+      <w:lvlText w:val="%6."/>
+      <w:lvlJc w:val="left"/>
+      <w:pPr>
+        <w:tabs>
+          <w:tab w:val="num" w:pos="4320"/>
+        </w:tabs>
+        <w:ind w:left="4320" w:hanging="360"/>
+      </w:pPr>
+    </w:lvl>
+    <w:lvl w:ilvl="6" w:tentative="1">
+      <w:start w:val="1"/>
+      <w:numFmt w:val="decimal"/>
+      <w:lvlText w:val="%7."/>
+      <w:lvlJc w:val="left"/>
+      <w:pPr>
+        <w:tabs>
+          <w:tab w:val="num" w:pos="5040"/>
+        </w:tabs>
+        <w:ind w:left="5040" w:hanging="360"/>
+      </w:pPr>
+    </w:lvl>
+    <w:lvl w:ilvl="7" w:tentative="1">
+      <w:start w:val="1"/>
+      <w:numFmt w:val="decimal"/>
+      <w:lvlText w:val="%8."/>
+      <w:lvlJc w:val="left"/>
+      <w:pPr>
+        <w:tabs>
+          <w:tab w:val="num" w:pos="5760"/>
+        </w:tabs>
+        <w:ind w:left="5760" w:hanging="360"/>
+      </w:pPr>
+    </w:lvl>
+    <w:lvl w:ilvl="8" w:tentative="1">
+      <w:start w:val="1"/>
+      <w:numFmt w:val="decimal"/>
+      <w:lvlText w:val="%9."/>
+      <w:lvlJc w:val="left"/>
+      <w:pPr>
+        <w:tabs>
+          <w:tab w:val="num" w:pos="6480"/>
+        </w:tabs>
+        <w:ind w:left="6480" w:hanging="360"/>
+      </w:pPr>
+    </w:lvl>
+  </w:abstractNum>
+  <w:abstractNum w:abstractNumId="6" w15:restartNumberingAfterBreak="0">
+    <w:nsid w:val="35412C18"/>
+    <w:multiLevelType w:val="multilevel"/>
+    <w:tmpl w:val="93245EB4"/>
+    <w:lvl w:ilvl="0">
+      <w:start w:val="1"/>
+      <w:numFmt w:val="decimal"/>
+      <w:lvlText w:val="%1."/>
+      <w:lvlJc w:val="left"/>
+      <w:pPr>
+        <w:tabs>
+          <w:tab w:val="num" w:pos="720"/>
+        </w:tabs>
+        <w:ind w:left="720" w:hanging="360"/>
+      </w:pPr>
+    </w:lvl>
+    <w:lvl w:ilvl="1" w:tentative="1">
+      <w:start w:val="1"/>
+      <w:numFmt w:val="decimal"/>
+      <w:lvlText w:val="%2."/>
+      <w:lvlJc w:val="left"/>
+      <w:pPr>
+        <w:tabs>
+          <w:tab w:val="num" w:pos="1440"/>
+        </w:tabs>
+        <w:ind w:left="1440" w:hanging="360"/>
+      </w:pPr>
+    </w:lvl>
+    <w:lvl w:ilvl="2" w:tentative="1">
+      <w:start w:val="1"/>
+      <w:numFmt w:val="decimal"/>
+      <w:lvlText w:val="%3."/>
+      <w:lvlJc w:val="left"/>
+      <w:pPr>
+        <w:tabs>
+          <w:tab w:val="num" w:pos="2160"/>
+        </w:tabs>
+        <w:ind w:left="2160" w:hanging="360"/>
+      </w:pPr>
+    </w:lvl>
+    <w:lvl w:ilvl="3" w:tentative="1">
+      <w:start w:val="1"/>
+      <w:numFmt w:val="decimal"/>
+      <w:lvlText w:val="%4."/>
+      <w:lvlJc w:val="left"/>
+      <w:pPr>
+        <w:tabs>
+          <w:tab w:val="num" w:pos="2880"/>
+        </w:tabs>
+        <w:ind w:left="2880" w:hanging="360"/>
+      </w:pPr>
+    </w:lvl>
+    <w:lvl w:ilvl="4" w:tentative="1">
+      <w:start w:val="1"/>
+      <w:numFmt w:val="decimal"/>
+      <w:lvlText w:val="%5."/>
+      <w:lvlJc w:val="left"/>
+      <w:pPr>
+        <w:tabs>
+          <w:tab w:val="num" w:pos="3600"/>
+        </w:tabs>
+        <w:ind w:left="3600" w:hanging="360"/>
+      </w:pPr>
+    </w:lvl>
+    <w:lvl w:ilvl="5" w:tentative="1">
+      <w:start w:val="1"/>
+      <w:numFmt w:val="decimal"/>
+      <w:lvlText w:val="%6."/>
+      <w:lvlJc w:val="left"/>
+      <w:pPr>
+        <w:tabs>
+          <w:tab w:val="num" w:pos="4320"/>
+        </w:tabs>
+        <w:ind w:left="4320" w:hanging="360"/>
+      </w:pPr>
+    </w:lvl>
+    <w:lvl w:ilvl="6" w:tentative="1">
+      <w:start w:val="1"/>
+      <w:numFmt w:val="decimal"/>
+      <w:lvlText w:val="%7."/>
+      <w:lvlJc w:val="left"/>
+      <w:pPr>
+        <w:tabs>
+          <w:tab w:val="num" w:pos="5040"/>
+        </w:tabs>
+        <w:ind w:left="5040" w:hanging="360"/>
+      </w:pPr>
+    </w:lvl>
+    <w:lvl w:ilvl="7" w:tentative="1">
+      <w:start w:val="1"/>
+      <w:numFmt w:val="decimal"/>
+      <w:lvlText w:val="%8."/>
+      <w:lvlJc w:val="left"/>
+      <w:pPr>
+        <w:tabs>
+          <w:tab w:val="num" w:pos="5760"/>
+        </w:tabs>
+        <w:ind w:left="5760" w:hanging="360"/>
+      </w:pPr>
+    </w:lvl>
+    <w:lvl w:ilvl="8" w:tentative="1">
+      <w:start w:val="1"/>
+      <w:numFmt w:val="decimal"/>
+      <w:lvlText w:val="%9."/>
+      <w:lvlJc w:val="left"/>
+      <w:pPr>
+        <w:tabs>
+          <w:tab w:val="num" w:pos="6480"/>
+        </w:tabs>
+        <w:ind w:left="6480" w:hanging="360"/>
+      </w:pPr>
+    </w:lvl>
+  </w:abstractNum>
+  <w:abstractNum w:abstractNumId="7" w15:restartNumberingAfterBreak="0">
+    <w:nsid w:val="4A3D435B"/>
+    <w:multiLevelType w:val="multilevel"/>
+    <w:tmpl w:val="9328C7E8"/>
+    <w:lvl w:ilvl="0">
+      <w:start w:val="2"/>
+      <w:numFmt w:val="decimal"/>
+      <w:lvlText w:val="%1."/>
+      <w:lvlJc w:val="left"/>
+      <w:pPr>
+        <w:tabs>
+          <w:tab w:val="num" w:pos="720"/>
+        </w:tabs>
+        <w:ind w:left="720" w:hanging="360"/>
+      </w:pPr>
+    </w:lvl>
+    <w:lvl w:ilvl="1" w:tentative="1">
+      <w:start w:val="1"/>
+      <w:numFmt w:val="decimal"/>
+      <w:lvlText w:val="%2."/>
+      <w:lvlJc w:val="left"/>
+      <w:pPr>
+        <w:tabs>
+          <w:tab w:val="num" w:pos="1440"/>
+        </w:tabs>
+        <w:ind w:left="1440" w:hanging="360"/>
+      </w:pPr>
+    </w:lvl>
+    <w:lvl w:ilvl="2" w:tentative="1">
+      <w:start w:val="1"/>
+      <w:numFmt w:val="decimal"/>
+      <w:lvlText w:val="%3."/>
+      <w:lvlJc w:val="left"/>
+      <w:pPr>
+        <w:tabs>
+          <w:tab w:val="num" w:pos="2160"/>
+        </w:tabs>
+        <w:ind w:left="2160" w:hanging="360"/>
+      </w:pPr>
+    </w:lvl>
+    <w:lvl w:ilvl="3" w:tentative="1">
+      <w:start w:val="1"/>
+      <w:numFmt w:val="decimal"/>
+      <w:lvlText w:val="%4."/>
+      <w:lvlJc w:val="left"/>
+      <w:pPr>
+        <w:tabs>
+          <w:tab w:val="num" w:pos="2880"/>
+        </w:tabs>
+        <w:ind w:left="2880" w:hanging="360"/>
+      </w:pPr>
+    </w:lvl>
+    <w:lvl w:ilvl="4" w:tentative="1">
+      <w:start w:val="1"/>
+      <w:numFmt w:val="decimal"/>
+      <w:lvlText w:val="%5."/>
+      <w:lvlJc w:val="left"/>
+      <w:pPr>
+        <w:tabs>
+          <w:tab w:val="num" w:pos="3600"/>
+        </w:tabs>
+        <w:ind w:left="3600" w:hanging="360"/>
+      </w:pPr>
+    </w:lvl>
+    <w:lvl w:ilvl="5" w:tentative="1">
+      <w:start w:val="1"/>
+      <w:numFmt w:val="decimal"/>
+      <w:lvlText w:val="%6."/>
+      <w:lvlJc w:val="left"/>
+      <w:pPr>
+        <w:tabs>
+          <w:tab w:val="num" w:pos="4320"/>
+        </w:tabs>
+        <w:ind w:left="4320" w:hanging="360"/>
+      </w:pPr>
+    </w:lvl>
+    <w:lvl w:ilvl="6" w:tentative="1">
+      <w:start w:val="1"/>
+      <w:numFmt w:val="decimal"/>
+      <w:lvlText w:val="%7."/>
+      <w:lvlJc w:val="left"/>
+      <w:pPr>
+        <w:tabs>
+          <w:tab w:val="num" w:pos="5040"/>
+        </w:tabs>
+        <w:ind w:left="5040" w:hanging="360"/>
+      </w:pPr>
+    </w:lvl>
+    <w:lvl w:ilvl="7" w:tentative="1">
+      <w:start w:val="1"/>
+      <w:numFmt w:val="decimal"/>
+      <w:lvlText w:val="%8."/>
+      <w:lvlJc w:val="left"/>
+      <w:pPr>
+        <w:tabs>
+          <w:tab w:val="num" w:pos="5760"/>
+        </w:tabs>
+        <w:ind w:left="5760" w:hanging="360"/>
+      </w:pPr>
+    </w:lvl>
+    <w:lvl w:ilvl="8" w:tentative="1">
+      <w:start w:val="1"/>
+      <w:numFmt w:val="decimal"/>
+      <w:lvlText w:val="%9."/>
+      <w:lvlJc w:val="left"/>
+      <w:pPr>
+        <w:tabs>
+          <w:tab w:val="num" w:pos="6480"/>
+        </w:tabs>
+        <w:ind w:left="6480" w:hanging="360"/>
+      </w:pPr>
+    </w:lvl>
+  </w:abstractNum>
+  <w:abstractNum w:abstractNumId="8" w15:restartNumberingAfterBreak="0">
+    <w:nsid w:val="4E8A4D7D"/>
+    <w:multiLevelType w:val="multilevel"/>
+    <w:tmpl w:val="E0F6D77A"/>
+    <w:lvl w:ilvl="0">
+      <w:start w:val="1"/>
+      <w:numFmt w:val="bullet"/>
+      <w:lvlText w:val=""/>
+      <w:lvlJc w:val="left"/>
+      <w:pPr>
+        <w:tabs>
+          <w:tab w:val="num" w:pos="720"/>
+        </w:tabs>
+        <w:ind w:left="720" w:hanging="360"/>
+      </w:pPr>
+      <w:rPr>
+        <w:rFonts w:ascii="Symbol" w:hAnsi="Symbol" w:hint="default"/>
+        <w:sz w:val="20"/>
+      </w:rPr>
+    </w:lvl>
+    <w:lvl w:ilvl="1" w:tentative="1">
+      <w:start w:val="1"/>
+      <w:numFmt w:val="bullet"/>
+      <w:lvlText w:val=""/>
+      <w:lvlJc w:val="left"/>
+      <w:pPr>
+        <w:tabs>
+          <w:tab w:val="num" w:pos="1440"/>
+        </w:tabs>
+        <w:ind w:left="1440" w:hanging="360"/>
+      </w:pPr>
+      <w:rPr>
+        <w:rFonts w:ascii="Symbol" w:hAnsi="Symbol" w:hint="default"/>
+        <w:sz w:val="20"/>
+      </w:rPr>
+    </w:lvl>
+    <w:lvl w:ilvl="2" w:tentative="1">
+      <w:start w:val="1"/>
+      <w:numFmt w:val="bullet"/>
+      <w:lvlText w:val=""/>
+      <w:lvlJc w:val="left"/>
+      <w:pPr>
+        <w:tabs>
+          <w:tab w:val="num" w:pos="2160"/>
+        </w:tabs>
+        <w:ind w:left="2160" w:hanging="360"/>
+      </w:pPr>
+      <w:rPr>
+        <w:rFonts w:ascii="Symbol" w:hAnsi="Symbol" w:hint="default"/>
+        <w:sz w:val="20"/>
+      </w:rPr>
+    </w:lvl>
+    <w:lvl w:ilvl="3" w:tentative="1">
+      <w:start w:val="1"/>
+      <w:numFmt w:val="bullet"/>
+      <w:lvlText w:val=""/>
+      <w:lvlJc w:val="left"/>
+      <w:pPr>
+        <w:tabs>
+          <w:tab w:val="num" w:pos="2880"/>
+        </w:tabs>
+        <w:ind w:left="2880" w:hanging="360"/>
+      </w:pPr>
+      <w:rPr>
+        <w:rFonts w:ascii="Symbol" w:hAnsi="Symbol" w:hint="default"/>
+        <w:sz w:val="20"/>
+      </w:rPr>
+    </w:lvl>
+    <w:lvl w:ilvl="4" w:tentative="1">
+      <w:start w:val="1"/>
+      <w:numFmt w:val="bullet"/>
+      <w:lvlText w:val=""/>
+      <w:lvlJc w:val="left"/>
+      <w:pPr>
+        <w:tabs>
+          <w:tab w:val="num" w:pos="3600"/>
+        </w:tabs>
+        <w:ind w:left="3600" w:hanging="360"/>
+      </w:pPr>
+      <w:rPr>
+        <w:rFonts w:ascii="Symbol" w:hAnsi="Symbol" w:hint="default"/>
+        <w:sz w:val="20"/>
+      </w:rPr>
+    </w:lvl>
+    <w:lvl w:ilvl="5" w:tentative="1">
+      <w:start w:val="1"/>
+      <w:numFmt w:val="bullet"/>
+      <w:lvlText w:val=""/>
+      <w:lvlJc w:val="left"/>
+      <w:pPr>
+        <w:tabs>
+          <w:tab w:val="num" w:pos="4320"/>
+        </w:tabs>
+        <w:ind w:left="4320" w:hanging="360"/>
+      </w:pPr>
+      <w:rPr>
+        <w:rFonts w:ascii="Symbol" w:hAnsi="Symbol" w:hint="default"/>
+        <w:sz w:val="20"/>
+      </w:rPr>
+    </w:lvl>
+    <w:lvl w:ilvl="6" w:tentative="1">
+      <w:start w:val="1"/>
+      <w:numFmt w:val="bullet"/>
+      <w:lvlText w:val=""/>
+      <w:lvlJc w:val="left"/>
+      <w:pPr>
+        <w:tabs>
+          <w:tab w:val="num" w:pos="5040"/>
+        </w:tabs>
+        <w:ind w:left="5040" w:hanging="360"/>
+      </w:pPr>
+      <w:rPr>
+        <w:rFonts w:ascii="Symbol" w:hAnsi="Symbol" w:hint="default"/>
+        <w:sz w:val="20"/>
+      </w:rPr>
+    </w:lvl>
+    <w:lvl w:ilvl="7" w:tentative="1">
+      <w:start w:val="1"/>
+      <w:numFmt w:val="bullet"/>
+      <w:lvlText w:val=""/>
+      <w:lvlJc w:val="left"/>
+      <w:pPr>
+        <w:tabs>
+          <w:tab w:val="num" w:pos="5760"/>
+        </w:tabs>
+        <w:ind w:left="5760" w:hanging="360"/>
+      </w:pPr>
+      <w:rPr>
+        <w:rFonts w:ascii="Symbol" w:hAnsi="Symbol" w:hint="default"/>
+        <w:sz w:val="20"/>
+      </w:rPr>
+    </w:lvl>
+    <w:lvl w:ilvl="8" w:tentative="1">
+      <w:start w:val="1"/>
+      <w:numFmt w:val="bullet"/>
+      <w:lvlText w:val=""/>
+      <w:lvlJc w:val="left"/>
+      <w:pPr>
+        <w:tabs>
+          <w:tab w:val="num" w:pos="6480"/>
+        </w:tabs>
+        <w:ind w:left="6480" w:hanging="360"/>
+      </w:pPr>
+      <w:rPr>
+        <w:rFonts w:ascii="Symbol" w:hAnsi="Symbol" w:hint="default"/>
+        <w:sz w:val="20"/>
+      </w:rPr>
+    </w:lvl>
+  </w:abstractNum>
+  <w:abstractNum w:abstractNumId="9" w15:restartNumberingAfterBreak="0">
+    <w:nsid w:val="4ED57530"/>
+    <w:multiLevelType w:val="multilevel"/>
+    <w:tmpl w:val="12E2DC1E"/>
+    <w:lvl w:ilvl="0">
+      <w:start w:val="1"/>
+      <w:numFmt w:val="bullet"/>
+      <w:lvlText w:val=""/>
+      <w:lvlJc w:val="left"/>
+      <w:pPr>
+        <w:tabs>
+          <w:tab w:val="num" w:pos="720"/>
+        </w:tabs>
+        <w:ind w:left="720" w:hanging="360"/>
+      </w:pPr>
+      <w:rPr>
+        <w:rFonts w:ascii="Symbol" w:hAnsi="Symbol" w:hint="default"/>
+        <w:sz w:val="20"/>
+      </w:rPr>
+    </w:lvl>
+    <w:lvl w:ilvl="1" w:tentative="1">
+      <w:start w:val="1"/>
+      <w:numFmt w:val="bullet"/>
+      <w:lvlText w:val=""/>
+      <w:lvlJc w:val="left"/>
+      <w:pPr>
+        <w:tabs>
+          <w:tab w:val="num" w:pos="1440"/>
+        </w:tabs>
+        <w:ind w:left="1440" w:hanging="360"/>
+      </w:pPr>
+      <w:rPr>
+        <w:rFonts w:ascii="Symbol" w:hAnsi="Symbol" w:hint="default"/>
+        <w:sz w:val="20"/>
+      </w:rPr>
+    </w:lvl>
+    <w:lvl w:ilvl="2" w:tentative="1">
+      <w:start w:val="1"/>
+      <w:numFmt w:val="bullet"/>
+      <w:lvlText w:val=""/>
+      <w:lvlJc w:val="left"/>
+      <w:pPr>
+        <w:tabs>
+          <w:tab w:val="num" w:pos="2160"/>
+        </w:tabs>
+        <w:ind w:left="2160" w:hanging="360"/>
+      </w:pPr>
+      <w:rPr>
+        <w:rFonts w:ascii="Symbol" w:hAnsi="Symbol" w:hint="default"/>
+        <w:sz w:val="20"/>
+      </w:rPr>
+    </w:lvl>
+    <w:lvl w:ilvl="3" w:tentative="1">
+      <w:start w:val="1"/>
+      <w:numFmt w:val="bullet"/>
+      <w:lvlText w:val=""/>
+      <w:lvlJc w:val="left"/>
+      <w:pPr>
+        <w:tabs>
+          <w:tab w:val="num" w:pos="2880"/>
+        </w:tabs>
+        <w:ind w:left="2880" w:hanging="360"/>
+      </w:pPr>
+      <w:rPr>
+        <w:rFonts w:ascii="Symbol" w:hAnsi="Symbol" w:hint="default"/>
+        <w:sz w:val="20"/>
+      </w:rPr>
+    </w:lvl>
+    <w:lvl w:ilvl="4" w:tentative="1">
+      <w:start w:val="1"/>
+      <w:numFmt w:val="bullet"/>
+      <w:lvlText w:val=""/>
+      <w:lvlJc w:val="left"/>
+      <w:pPr>
+        <w:tabs>
+          <w:tab w:val="num" w:pos="3600"/>
+        </w:tabs>
+        <w:ind w:left="3600" w:hanging="360"/>
+      </w:pPr>
+      <w:rPr>
+        <w:rFonts w:ascii="Symbol" w:hAnsi="Symbol" w:hint="default"/>
+        <w:sz w:val="20"/>
+      </w:rPr>
+    </w:lvl>
+    <w:lvl w:ilvl="5" w:tentative="1">
+      <w:start w:val="1"/>
+      <w:numFmt w:val="bullet"/>
+      <w:lvlText w:val=""/>
+      <w:lvlJc w:val="left"/>
+      <w:pPr>
+        <w:tabs>
+          <w:tab w:val="num" w:pos="4320"/>
+        </w:tabs>
+        <w:ind w:left="4320" w:hanging="360"/>
+      </w:pPr>
+      <w:rPr>
+        <w:rFonts w:ascii="Symbol" w:hAnsi="Symbol" w:hint="default"/>
+        <w:sz w:val="20"/>
+      </w:rPr>
+    </w:lvl>
+    <w:lvl w:ilvl="6" w:tentative="1">
+      <w:start w:val="1"/>
+      <w:numFmt w:val="bullet"/>
+      <w:lvlText w:val=""/>
+      <w:lvlJc w:val="left"/>
+      <w:pPr>
+        <w:tabs>
+          <w:tab w:val="num" w:pos="5040"/>
+        </w:tabs>
+        <w:ind w:left="5040" w:hanging="360"/>
+      </w:pPr>
+      <w:rPr>
+        <w:rFonts w:ascii="Symbol" w:hAnsi="Symbol" w:hint="default"/>
+        <w:sz w:val="20"/>
+      </w:rPr>
+    </w:lvl>
+    <w:lvl w:ilvl="7" w:tentative="1">
+      <w:start w:val="1"/>
+      <w:numFmt w:val="bullet"/>
+      <w:lvlText w:val=""/>
+      <w:lvlJc w:val="left"/>
+      <w:pPr>
+        <w:tabs>
+          <w:tab w:val="num" w:pos="5760"/>
+        </w:tabs>
+        <w:ind w:left="5760" w:hanging="360"/>
+      </w:pPr>
+      <w:rPr>
+        <w:rFonts w:ascii="Symbol" w:hAnsi="Symbol" w:hint="default"/>
+        <w:sz w:val="20"/>
+      </w:rPr>
+    </w:lvl>
+    <w:lvl w:ilvl="8" w:tentative="1">
+      <w:start w:val="1"/>
+      <w:numFmt w:val="bullet"/>
+      <w:lvlText w:val=""/>
+      <w:lvlJc w:val="left"/>
+      <w:pPr>
+        <w:tabs>
+          <w:tab w:val="num" w:pos="6480"/>
+        </w:tabs>
+        <w:ind w:left="6480" w:hanging="360"/>
+      </w:pPr>
+      <w:rPr>
+        <w:rFonts w:ascii="Symbol" w:hAnsi="Symbol" w:hint="default"/>
+        <w:sz w:val="20"/>
+      </w:rPr>
+    </w:lvl>
+  </w:abstractNum>
+  <w:abstractNum w:abstractNumId="10" w15:restartNumberingAfterBreak="0">
+    <w:nsid w:val="58A153AA"/>
+    <w:multiLevelType w:val="multilevel"/>
+    <w:tmpl w:val="EFD4339E"/>
+    <w:lvl w:ilvl="0">
+      <w:start w:val="5"/>
+      <w:numFmt w:val="decimal"/>
+      <w:lvlText w:val="%1."/>
+      <w:lvlJc w:val="left"/>
+      <w:pPr>
+        <w:tabs>
+          <w:tab w:val="num" w:pos="720"/>
+        </w:tabs>
+        <w:ind w:left="720" w:hanging="360"/>
+      </w:pPr>
+    </w:lvl>
+    <w:lvl w:ilvl="1" w:tentative="1">
+      <w:start w:val="1"/>
+      <w:numFmt w:val="decimal"/>
+      <w:lvlText w:val="%2."/>
+      <w:lvlJc w:val="left"/>
+      <w:pPr>
+        <w:tabs>
+          <w:tab w:val="num" w:pos="1440"/>
+        </w:tabs>
+        <w:ind w:left="1440" w:hanging="360"/>
+      </w:pPr>
+    </w:lvl>
+    <w:lvl w:ilvl="2" w:tentative="1">
+      <w:start w:val="1"/>
+      <w:numFmt w:val="decimal"/>
+      <w:lvlText w:val="%3."/>
+      <w:lvlJc w:val="left"/>
+      <w:pPr>
+        <w:tabs>
+          <w:tab w:val="num" w:pos="2160"/>
+        </w:tabs>
+        <w:ind w:left="2160" w:hanging="360"/>
+      </w:pPr>
+    </w:lvl>
+    <w:lvl w:ilvl="3" w:tentative="1">
+      <w:start w:val="1"/>
+      <w:numFmt w:val="decimal"/>
+      <w:lvlText w:val="%4."/>
+      <w:lvlJc w:val="left"/>
+      <w:pPr>
+        <w:tabs>
+          <w:tab w:val="num" w:pos="2880"/>
+        </w:tabs>
+        <w:ind w:left="2880" w:hanging="360"/>
+      </w:pPr>
+    </w:lvl>
+    <w:lvl w:ilvl="4" w:tentative="1">
+      <w:start w:val="1"/>
+      <w:numFmt w:val="decimal"/>
+      <w:lvlText w:val="%5."/>
+      <w:lvlJc w:val="left"/>
+      <w:pPr>
+        <w:tabs>
+          <w:tab w:val="num" w:pos="3600"/>
+        </w:tabs>
+        <w:ind w:left="3600" w:hanging="360"/>
+      </w:pPr>
+    </w:lvl>
+    <w:lvl w:ilvl="5" w:tentative="1">
+      <w:start w:val="1"/>
+      <w:numFmt w:val="decimal"/>
+      <w:lvlText w:val="%6."/>
+      <w:lvlJc w:val="left"/>
+      <w:pPr>
+        <w:tabs>
+          <w:tab w:val="num" w:pos="4320"/>
+        </w:tabs>
+        <w:ind w:left="4320" w:hanging="360"/>
+      </w:pPr>
+    </w:lvl>
+    <w:lvl w:ilvl="6" w:tentative="1">
+      <w:start w:val="1"/>
+      <w:numFmt w:val="decimal"/>
+      <w:lvlText w:val="%7."/>
+      <w:lvlJc w:val="left"/>
+      <w:pPr>
+        <w:tabs>
+          <w:tab w:val="num" w:pos="5040"/>
+        </w:tabs>
+        <w:ind w:left="5040" w:hanging="360"/>
+      </w:pPr>
+    </w:lvl>
+    <w:lvl w:ilvl="7" w:tentative="1">
+      <w:start w:val="1"/>
+      <w:numFmt w:val="decimal"/>
+      <w:lvlText w:val="%8."/>
+      <w:lvlJc w:val="left"/>
+      <w:pPr>
+        <w:tabs>
+          <w:tab w:val="num" w:pos="5760"/>
+        </w:tabs>
+        <w:ind w:left="5760" w:hanging="360"/>
+      </w:pPr>
+    </w:lvl>
+    <w:lvl w:ilvl="8" w:tentative="1">
+      <w:start w:val="1"/>
+      <w:numFmt w:val="decimal"/>
+      <w:lvlText w:val="%9."/>
+      <w:lvlJc w:val="left"/>
+      <w:pPr>
+        <w:tabs>
+          <w:tab w:val="num" w:pos="6480"/>
+        </w:tabs>
+        <w:ind w:left="6480" w:hanging="360"/>
+      </w:pPr>
+    </w:lvl>
+  </w:abstractNum>
+  <w:abstractNum w:abstractNumId="11" w15:restartNumberingAfterBreak="0">
     <w:nsid w:val="69B92D51"/>
     <w:multiLevelType w:val="hybridMultilevel"/>
     <w:tmpl w:val="C67E6928"/>
@@ -19814,7 +24186,156 @@
       </w:pPr>
     </w:lvl>
   </w:abstractNum>
-  <w:abstractNum w:abstractNumId="3" w15:restartNumberingAfterBreak="0">
+  <w:abstractNum w:abstractNumId="12" w15:restartNumberingAfterBreak="0">
+    <w:nsid w:val="6A285327"/>
+    <w:multiLevelType w:val="multilevel"/>
+    <w:tmpl w:val="7100858A"/>
+    <w:lvl w:ilvl="0">
+      <w:start w:val="1"/>
+      <w:numFmt w:val="bullet"/>
+      <w:lvlText w:val=""/>
+      <w:lvlJc w:val="left"/>
+      <w:pPr>
+        <w:tabs>
+          <w:tab w:val="num" w:pos="720"/>
+        </w:tabs>
+        <w:ind w:left="720" w:hanging="360"/>
+      </w:pPr>
+      <w:rPr>
+        <w:rFonts w:ascii="Symbol" w:hAnsi="Symbol" w:hint="default"/>
+        <w:sz w:val="20"/>
+      </w:rPr>
+    </w:lvl>
+    <w:lvl w:ilvl="1" w:tentative="1">
+      <w:start w:val="1"/>
+      <w:numFmt w:val="bullet"/>
+      <w:lvlText w:val=""/>
+      <w:lvlJc w:val="left"/>
+      <w:pPr>
+        <w:tabs>
+          <w:tab w:val="num" w:pos="1440"/>
+        </w:tabs>
+        <w:ind w:left="1440" w:hanging="360"/>
+      </w:pPr>
+      <w:rPr>
+        <w:rFonts w:ascii="Symbol" w:hAnsi="Symbol" w:hint="default"/>
+        <w:sz w:val="20"/>
+      </w:rPr>
+    </w:lvl>
+    <w:lvl w:ilvl="2" w:tentative="1">
+      <w:start w:val="1"/>
+      <w:numFmt w:val="bullet"/>
+      <w:lvlText w:val=""/>
+      <w:lvlJc w:val="left"/>
+      <w:pPr>
+        <w:tabs>
+          <w:tab w:val="num" w:pos="2160"/>
+        </w:tabs>
+        <w:ind w:left="2160" w:hanging="360"/>
+      </w:pPr>
+      <w:rPr>
+        <w:rFonts w:ascii="Symbol" w:hAnsi="Symbol" w:hint="default"/>
+        <w:sz w:val="20"/>
+      </w:rPr>
+    </w:lvl>
+    <w:lvl w:ilvl="3" w:tentative="1">
+      <w:start w:val="1"/>
+      <w:numFmt w:val="bullet"/>
+      <w:lvlText w:val=""/>
+      <w:lvlJc w:val="left"/>
+      <w:pPr>
+        <w:tabs>
+          <w:tab w:val="num" w:pos="2880"/>
+        </w:tabs>
+        <w:ind w:left="2880" w:hanging="360"/>
+      </w:pPr>
+      <w:rPr>
+        <w:rFonts w:ascii="Symbol" w:hAnsi="Symbol" w:hint="default"/>
+        <w:sz w:val="20"/>
+      </w:rPr>
+    </w:lvl>
+    <w:lvl w:ilvl="4" w:tentative="1">
+      <w:start w:val="1"/>
+      <w:numFmt w:val="bullet"/>
+      <w:lvlText w:val=""/>
+      <w:lvlJc w:val="left"/>
+      <w:pPr>
+        <w:tabs>
+          <w:tab w:val="num" w:pos="3600"/>
+        </w:tabs>
+        <w:ind w:left="3600" w:hanging="360"/>
+      </w:pPr>
+      <w:rPr>
+        <w:rFonts w:ascii="Symbol" w:hAnsi="Symbol" w:hint="default"/>
+        <w:sz w:val="20"/>
+      </w:rPr>
+    </w:lvl>
+    <w:lvl w:ilvl="5" w:tentative="1">
+      <w:start w:val="1"/>
+      <w:numFmt w:val="bullet"/>
+      <w:lvlText w:val=""/>
+      <w:lvlJc w:val="left"/>
+      <w:pPr>
+        <w:tabs>
+          <w:tab w:val="num" w:pos="4320"/>
+        </w:tabs>
+        <w:ind w:left="4320" w:hanging="360"/>
+      </w:pPr>
+      <w:rPr>
+        <w:rFonts w:ascii="Symbol" w:hAnsi="Symbol" w:hint="default"/>
+        <w:sz w:val="20"/>
+      </w:rPr>
+    </w:lvl>
+    <w:lvl w:ilvl="6" w:tentative="1">
+      <w:start w:val="1"/>
+      <w:numFmt w:val="bullet"/>
+      <w:lvlText w:val=""/>
+      <w:lvlJc w:val="left"/>
+      <w:pPr>
+        <w:tabs>
+          <w:tab w:val="num" w:pos="5040"/>
+        </w:tabs>
+        <w:ind w:left="5040" w:hanging="360"/>
+      </w:pPr>
+      <w:rPr>
+        <w:rFonts w:ascii="Symbol" w:hAnsi="Symbol" w:hint="default"/>
+        <w:sz w:val="20"/>
+      </w:rPr>
+    </w:lvl>
+    <w:lvl w:ilvl="7" w:tentative="1">
+      <w:start w:val="1"/>
+      <w:numFmt w:val="bullet"/>
+      <w:lvlText w:val=""/>
+      <w:lvlJc w:val="left"/>
+      <w:pPr>
+        <w:tabs>
+          <w:tab w:val="num" w:pos="5760"/>
+        </w:tabs>
+        <w:ind w:left="5760" w:hanging="360"/>
+      </w:pPr>
+      <w:rPr>
+        <w:rFonts w:ascii="Symbol" w:hAnsi="Symbol" w:hint="default"/>
+        <w:sz w:val="20"/>
+      </w:rPr>
+    </w:lvl>
+    <w:lvl w:ilvl="8" w:tentative="1">
+      <w:start w:val="1"/>
+      <w:numFmt w:val="bullet"/>
+      <w:lvlText w:val=""/>
+      <w:lvlJc w:val="left"/>
+      <w:pPr>
+        <w:tabs>
+          <w:tab w:val="num" w:pos="6480"/>
+        </w:tabs>
+        <w:ind w:left="6480" w:hanging="360"/>
+      </w:pPr>
+      <w:rPr>
+        <w:rFonts w:ascii="Symbol" w:hAnsi="Symbol" w:hint="default"/>
+        <w:sz w:val="20"/>
+      </w:rPr>
+    </w:lvl>
+  </w:abstractNum>
+  <w:abstractNum w:abstractNumId="13" w15:restartNumberingAfterBreak="0">
     <w:nsid w:val="6BAFC6A3"/>
     <w:multiLevelType w:val="hybridMultilevel"/>
     <w:tmpl w:val="D7FA3EF8"/>
@@ -19927,17 +24448,199 @@
       </w:rPr>
     </w:lvl>
   </w:abstractNum>
+  <w:abstractNum w:abstractNumId="14" w15:restartNumberingAfterBreak="0">
+    <w:nsid w:val="72BC6B69"/>
+    <w:multiLevelType w:val="multilevel"/>
+    <w:tmpl w:val="D27801C6"/>
+    <w:lvl w:ilvl="0">
+      <w:start w:val="1"/>
+      <w:numFmt w:val="bullet"/>
+      <w:lvlText w:val=""/>
+      <w:lvlJc w:val="left"/>
+      <w:pPr>
+        <w:tabs>
+          <w:tab w:val="num" w:pos="720"/>
+        </w:tabs>
+        <w:ind w:left="720" w:hanging="360"/>
+      </w:pPr>
+      <w:rPr>
+        <w:rFonts w:ascii="Symbol" w:hAnsi="Symbol" w:hint="default"/>
+        <w:sz w:val="20"/>
+      </w:rPr>
+    </w:lvl>
+    <w:lvl w:ilvl="1" w:tentative="1">
+      <w:start w:val="1"/>
+      <w:numFmt w:val="bullet"/>
+      <w:lvlText w:val=""/>
+      <w:lvlJc w:val="left"/>
+      <w:pPr>
+        <w:tabs>
+          <w:tab w:val="num" w:pos="1440"/>
+        </w:tabs>
+        <w:ind w:left="1440" w:hanging="360"/>
+      </w:pPr>
+      <w:rPr>
+        <w:rFonts w:ascii="Symbol" w:hAnsi="Symbol" w:hint="default"/>
+        <w:sz w:val="20"/>
+      </w:rPr>
+    </w:lvl>
+    <w:lvl w:ilvl="2" w:tentative="1">
+      <w:start w:val="1"/>
+      <w:numFmt w:val="bullet"/>
+      <w:lvlText w:val=""/>
+      <w:lvlJc w:val="left"/>
+      <w:pPr>
+        <w:tabs>
+          <w:tab w:val="num" w:pos="2160"/>
+        </w:tabs>
+        <w:ind w:left="2160" w:hanging="360"/>
+      </w:pPr>
+      <w:rPr>
+        <w:rFonts w:ascii="Symbol" w:hAnsi="Symbol" w:hint="default"/>
+        <w:sz w:val="20"/>
+      </w:rPr>
+    </w:lvl>
+    <w:lvl w:ilvl="3" w:tentative="1">
+      <w:start w:val="1"/>
+      <w:numFmt w:val="bullet"/>
+      <w:lvlText w:val=""/>
+      <w:lvlJc w:val="left"/>
+      <w:pPr>
+        <w:tabs>
+          <w:tab w:val="num" w:pos="2880"/>
+        </w:tabs>
+        <w:ind w:left="2880" w:hanging="360"/>
+      </w:pPr>
+      <w:rPr>
+        <w:rFonts w:ascii="Symbol" w:hAnsi="Symbol" w:hint="default"/>
+        <w:sz w:val="20"/>
+      </w:rPr>
+    </w:lvl>
+    <w:lvl w:ilvl="4" w:tentative="1">
+      <w:start w:val="1"/>
+      <w:numFmt w:val="bullet"/>
+      <w:lvlText w:val=""/>
+      <w:lvlJc w:val="left"/>
+      <w:pPr>
+        <w:tabs>
+          <w:tab w:val="num" w:pos="3600"/>
+        </w:tabs>
+        <w:ind w:left="3600" w:hanging="360"/>
+      </w:pPr>
+      <w:rPr>
+        <w:rFonts w:ascii="Symbol" w:hAnsi="Symbol" w:hint="default"/>
+        <w:sz w:val="20"/>
+      </w:rPr>
+    </w:lvl>
+    <w:lvl w:ilvl="5" w:tentative="1">
+      <w:start w:val="1"/>
+      <w:numFmt w:val="bullet"/>
+      <w:lvlText w:val=""/>
+      <w:lvlJc w:val="left"/>
+      <w:pPr>
+        <w:tabs>
+          <w:tab w:val="num" w:pos="4320"/>
+        </w:tabs>
+        <w:ind w:left="4320" w:hanging="360"/>
+      </w:pPr>
+      <w:rPr>
+        <w:rFonts w:ascii="Symbol" w:hAnsi="Symbol" w:hint="default"/>
+        <w:sz w:val="20"/>
+      </w:rPr>
+    </w:lvl>
+    <w:lvl w:ilvl="6" w:tentative="1">
+      <w:start w:val="1"/>
+      <w:numFmt w:val="bullet"/>
+      <w:lvlText w:val=""/>
+      <w:lvlJc w:val="left"/>
+      <w:pPr>
+        <w:tabs>
+          <w:tab w:val="num" w:pos="5040"/>
+        </w:tabs>
+        <w:ind w:left="5040" w:hanging="360"/>
+      </w:pPr>
+      <w:rPr>
+        <w:rFonts w:ascii="Symbol" w:hAnsi="Symbol" w:hint="default"/>
+        <w:sz w:val="20"/>
+      </w:rPr>
+    </w:lvl>
+    <w:lvl w:ilvl="7" w:tentative="1">
+      <w:start w:val="1"/>
+      <w:numFmt w:val="bullet"/>
+      <w:lvlText w:val=""/>
+      <w:lvlJc w:val="left"/>
+      <w:pPr>
+        <w:tabs>
+          <w:tab w:val="num" w:pos="5760"/>
+        </w:tabs>
+        <w:ind w:left="5760" w:hanging="360"/>
+      </w:pPr>
+      <w:rPr>
+        <w:rFonts w:ascii="Symbol" w:hAnsi="Symbol" w:hint="default"/>
+        <w:sz w:val="20"/>
+      </w:rPr>
+    </w:lvl>
+    <w:lvl w:ilvl="8" w:tentative="1">
+      <w:start w:val="1"/>
+      <w:numFmt w:val="bullet"/>
+      <w:lvlText w:val=""/>
+      <w:lvlJc w:val="left"/>
+      <w:pPr>
+        <w:tabs>
+          <w:tab w:val="num" w:pos="6480"/>
+        </w:tabs>
+        <w:ind w:left="6480" w:hanging="360"/>
+      </w:pPr>
+      <w:rPr>
+        <w:rFonts w:ascii="Symbol" w:hAnsi="Symbol" w:hint="default"/>
+        <w:sz w:val="20"/>
+      </w:rPr>
+    </w:lvl>
+  </w:abstractNum>
   <w:num w:numId="1" w16cid:durableId="1988513788">
+    <w:abstractNumId w:val="13"/>
+  </w:num>
+  <w:num w:numId="2" w16cid:durableId="1954048636">
+    <w:abstractNumId w:val="4"/>
+  </w:num>
+  <w:num w:numId="3" w16cid:durableId="798063922">
+    <w:abstractNumId w:val="1"/>
+  </w:num>
+  <w:num w:numId="4" w16cid:durableId="1256355102">
+    <w:abstractNumId w:val="11"/>
+  </w:num>
+  <w:num w:numId="5" w16cid:durableId="1333290582">
+    <w:abstractNumId w:val="6"/>
+  </w:num>
+  <w:num w:numId="6" w16cid:durableId="1175876586">
+    <w:abstractNumId w:val="7"/>
+  </w:num>
+  <w:num w:numId="7" w16cid:durableId="1862891778">
+    <w:abstractNumId w:val="5"/>
+  </w:num>
+  <w:num w:numId="8" w16cid:durableId="190148220">
+    <w:abstractNumId w:val="2"/>
+  </w:num>
+  <w:num w:numId="9" w16cid:durableId="1578441775">
+    <w:abstractNumId w:val="10"/>
+  </w:num>
+  <w:num w:numId="10" w16cid:durableId="1059524348">
+    <w:abstractNumId w:val="12"/>
+  </w:num>
+  <w:num w:numId="11" w16cid:durableId="2132630933">
+    <w:abstractNumId w:val="0"/>
+  </w:num>
+  <w:num w:numId="12" w16cid:durableId="684596052">
+    <w:abstractNumId w:val="14"/>
+  </w:num>
+  <w:num w:numId="13" w16cid:durableId="1996295090">
     <w:abstractNumId w:val="3"/>
   </w:num>
-  <w:num w:numId="2" w16cid:durableId="1954048636">
-    <w:abstractNumId w:val="1"/>
+  <w:num w:numId="14" w16cid:durableId="281544832">
+    <w:abstractNumId w:val="8"/>
   </w:num>
-  <w:num w:numId="3" w16cid:durableId="798063922">
-    <w:abstractNumId w:val="0"/>
-  </w:num>
-  <w:num w:numId="4" w16cid:durableId="1256355102">
-    <w:abstractNumId w:val="2"/>
+  <w:num w:numId="15" w16cid:durableId="180553793">
+    <w:abstractNumId w:val="9"/>
   </w:num>
 </w:numbering>
 </file>

</xml_diff>

<commit_message>
working on Gherkin examples
Signed-off-by: tanahia <sofi.bookfan@gmail.com>
</commit_message>
<xml_diff>
--- a/report/report.docx
+++ b/report/report.docx
@@ -21459,6 +21459,798 @@
         <w:t>Detailed use-case diagram:</w:t>
       </w:r>
     </w:p>
+    <w:p>
+      <w:r>
+        <w:rPr>
+          <w:noProof/>
+        </w:rPr>
+        <mc:AlternateContent>
+          <mc:Choice Requires="wps">
+            <w:drawing>
+              <wp:anchor distT="0" distB="0" distL="114300" distR="114300" simplePos="0" relativeHeight="251669504" behindDoc="0" locked="0" layoutInCell="1" allowOverlap="1" wp14:anchorId="706379C3" wp14:editId="5EF706F7">
+                <wp:simplePos x="0" y="0"/>
+                <wp:positionH relativeFrom="column">
+                  <wp:posOffset>1714500</wp:posOffset>
+                </wp:positionH>
+                <wp:positionV relativeFrom="paragraph">
+                  <wp:posOffset>161290</wp:posOffset>
+                </wp:positionV>
+                <wp:extent cx="1920240" cy="958850"/>
+                <wp:effectExtent l="0" t="0" r="22860" b="12700"/>
+                <wp:wrapNone/>
+                <wp:docPr id="1257057148" name="Oval 3"/>
+                <wp:cNvGraphicFramePr/>
+                <a:graphic xmlns:a="http://schemas.openxmlformats.org/drawingml/2006/main">
+                  <a:graphicData uri="http://schemas.microsoft.com/office/word/2010/wordprocessingShape">
+                    <wps:wsp>
+                      <wps:cNvSpPr/>
+                      <wps:spPr>
+                        <a:xfrm>
+                          <a:off x="0" y="0"/>
+                          <a:ext cx="1920240" cy="958850"/>
+                        </a:xfrm>
+                        <a:prstGeom prst="ellipse">
+                          <a:avLst/>
+                        </a:prstGeom>
+                      </wps:spPr>
+                      <wps:style>
+                        <a:lnRef idx="2">
+                          <a:schemeClr val="dk1"/>
+                        </a:lnRef>
+                        <a:fillRef idx="1">
+                          <a:schemeClr val="lt1"/>
+                        </a:fillRef>
+                        <a:effectRef idx="0">
+                          <a:schemeClr val="dk1"/>
+                        </a:effectRef>
+                        <a:fontRef idx="minor">
+                          <a:schemeClr val="dk1"/>
+                        </a:fontRef>
+                      </wps:style>
+                      <wps:bodyPr rot="0" spcFirstLastPara="0" vertOverflow="overflow" horzOverflow="overflow" vert="horz" wrap="square" lIns="91440" tIns="45720" rIns="91440" bIns="45720" numCol="1" spcCol="0" rtlCol="0" fromWordArt="0" anchor="ctr" anchorCtr="0" forceAA="0" compatLnSpc="1">
+                        <a:prstTxWarp prst="textNoShape">
+                          <a:avLst/>
+                        </a:prstTxWarp>
+                        <a:noAutofit/>
+                      </wps:bodyPr>
+                    </wps:wsp>
+                  </a:graphicData>
+                </a:graphic>
+                <wp14:sizeRelH relativeFrom="margin">
+                  <wp14:pctWidth>0</wp14:pctWidth>
+                </wp14:sizeRelH>
+                <wp14:sizeRelV relativeFrom="margin">
+                  <wp14:pctHeight>0</wp14:pctHeight>
+                </wp14:sizeRelV>
+              </wp:anchor>
+            </w:drawing>
+          </mc:Choice>
+          <mc:Fallback>
+            <w:pict>
+              <v:oval w14:anchorId="086757A7" id="Oval 3" o:spid="_x0000_s1026" style="position:absolute;margin-left:135pt;margin-top:12.7pt;width:151.2pt;height:75.5pt;z-index:251669504;visibility:visible;mso-wrap-style:square;mso-width-percent:0;mso-height-percent:0;mso-wrap-distance-left:9pt;mso-wrap-distance-top:0;mso-wrap-distance-right:9pt;mso-wrap-distance-bottom:0;mso-position-horizontal:absolute;mso-position-horizontal-relative:text;mso-position-vertical:absolute;mso-position-vertical-relative:text;mso-width-percent:0;mso-height-percent:0;mso-width-relative:margin;mso-height-relative:margin;v-text-anchor:middle" o:gfxdata="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" fillcolor="white [3201]" strokecolor="black [3200]" strokeweight="1pt">
+                <v:stroke joinstyle="miter"/>
+              </v:oval>
+            </w:pict>
+          </mc:Fallback>
+        </mc:AlternateContent>
+      </w:r>
+      <w:r>
+        <w:rPr>
+          <w:noProof/>
+        </w:rPr>
+        <mc:AlternateContent>
+          <mc:Choice Requires="wps">
+            <w:drawing>
+              <wp:anchor distT="0" distB="0" distL="114300" distR="114300" simplePos="0" relativeHeight="251659264" behindDoc="0" locked="0" layoutInCell="1" allowOverlap="1" wp14:anchorId="400A5309" wp14:editId="37BD68EF">
+                <wp:simplePos x="0" y="0"/>
+                <wp:positionH relativeFrom="column">
+                  <wp:posOffset>121920</wp:posOffset>
+                </wp:positionH>
+                <wp:positionV relativeFrom="paragraph">
+                  <wp:posOffset>298450</wp:posOffset>
+                </wp:positionV>
+                <wp:extent cx="304800" cy="312420"/>
+                <wp:effectExtent l="0" t="0" r="19050" b="11430"/>
+                <wp:wrapNone/>
+                <wp:docPr id="1250220152" name="Oval 1"/>
+                <wp:cNvGraphicFramePr/>
+                <a:graphic xmlns:a="http://schemas.openxmlformats.org/drawingml/2006/main">
+                  <a:graphicData uri="http://schemas.microsoft.com/office/word/2010/wordprocessingShape">
+                    <wps:wsp>
+                      <wps:cNvSpPr/>
+                      <wps:spPr>
+                        <a:xfrm>
+                          <a:off x="0" y="0"/>
+                          <a:ext cx="304800" cy="312420"/>
+                        </a:xfrm>
+                        <a:prstGeom prst="ellipse">
+                          <a:avLst/>
+                        </a:prstGeom>
+                      </wps:spPr>
+                      <wps:style>
+                        <a:lnRef idx="2">
+                          <a:schemeClr val="dk1"/>
+                        </a:lnRef>
+                        <a:fillRef idx="1">
+                          <a:schemeClr val="lt1"/>
+                        </a:fillRef>
+                        <a:effectRef idx="0">
+                          <a:schemeClr val="dk1"/>
+                        </a:effectRef>
+                        <a:fontRef idx="minor">
+                          <a:schemeClr val="dk1"/>
+                        </a:fontRef>
+                      </wps:style>
+                      <wps:bodyPr rot="0" spcFirstLastPara="0" vertOverflow="overflow" horzOverflow="overflow" vert="horz" wrap="square" lIns="91440" tIns="45720" rIns="91440" bIns="45720" numCol="1" spcCol="0" rtlCol="0" fromWordArt="0" anchor="ctr" anchorCtr="0" forceAA="0" compatLnSpc="1">
+                        <a:prstTxWarp prst="textNoShape">
+                          <a:avLst/>
+                        </a:prstTxWarp>
+                        <a:noAutofit/>
+                      </wps:bodyPr>
+                    </wps:wsp>
+                  </a:graphicData>
+                </a:graphic>
+                <wp14:sizeRelH relativeFrom="margin">
+                  <wp14:pctWidth>0</wp14:pctWidth>
+                </wp14:sizeRelH>
+                <wp14:sizeRelV relativeFrom="margin">
+                  <wp14:pctHeight>0</wp14:pctHeight>
+                </wp14:sizeRelV>
+              </wp:anchor>
+            </w:drawing>
+          </mc:Choice>
+          <mc:Fallback>
+            <w:pict>
+              <v:oval w14:anchorId="415D70C7" id="Oval 1" o:spid="_x0000_s1026" style="position:absolute;margin-left:9.6pt;margin-top:23.5pt;width:24pt;height:24.6pt;z-index:251659264;visibility:visible;mso-wrap-style:square;mso-width-percent:0;mso-height-percent:0;mso-wrap-distance-left:9pt;mso-wrap-distance-top:0;mso-wrap-distance-right:9pt;mso-wrap-distance-bottom:0;mso-position-horizontal:absolute;mso-position-horizontal-relative:text;mso-position-vertical:absolute;mso-position-vertical-relative:text;mso-width-percent:0;mso-height-percent:0;mso-width-relative:margin;mso-height-relative:margin;v-text-anchor:middle" o:gfxdata="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" fillcolor="white [3201]" strokecolor="black [3200]" strokeweight="1pt">
+                <v:stroke joinstyle="miter"/>
+              </v:oval>
+            </w:pict>
+          </mc:Fallback>
+        </mc:AlternateContent>
+      </w:r>
+    </w:p>
+    <w:p>
+      <w:r>
+        <w:rPr>
+          <w:noProof/>
+        </w:rPr>
+        <mc:AlternateContent>
+          <mc:Choice Requires="wps">
+            <w:drawing>
+              <wp:anchor distT="45720" distB="45720" distL="114300" distR="114300" simplePos="0" relativeHeight="251672576" behindDoc="0" locked="0" layoutInCell="1" allowOverlap="1" wp14:anchorId="0E093829" wp14:editId="6880F057">
+                <wp:simplePos x="0" y="0"/>
+                <wp:positionH relativeFrom="column">
+                  <wp:posOffset>1965960</wp:posOffset>
+                </wp:positionH>
+                <wp:positionV relativeFrom="paragraph">
+                  <wp:posOffset>49530</wp:posOffset>
+                </wp:positionV>
+                <wp:extent cx="1645920" cy="548640"/>
+                <wp:effectExtent l="0" t="0" r="0" b="3810"/>
+                <wp:wrapSquare wrapText="bothSides"/>
+                <wp:docPr id="217" name="Text Box 2"/>
+                <wp:cNvGraphicFramePr>
+                  <a:graphicFrameLocks xmlns:a="http://schemas.openxmlformats.org/drawingml/2006/main"/>
+                </wp:cNvGraphicFramePr>
+                <a:graphic xmlns:a="http://schemas.openxmlformats.org/drawingml/2006/main">
+                  <a:graphicData uri="http://schemas.microsoft.com/office/word/2010/wordprocessingShape">
+                    <wps:wsp>
+                      <wps:cNvSpPr txBox="1">
+                        <a:spLocks noChangeArrowheads="1"/>
+                      </wps:cNvSpPr>
+                      <wps:spPr bwMode="auto">
+                        <a:xfrm>
+                          <a:off x="0" y="0"/>
+                          <a:ext cx="1645920" cy="548640"/>
+                        </a:xfrm>
+                        <a:prstGeom prst="rect">
+                          <a:avLst/>
+                        </a:prstGeom>
+                        <a:noFill/>
+                        <a:ln>
+                          <a:noFill/>
+                        </a:ln>
+                      </wps:spPr>
+                      <wps:style>
+                        <a:lnRef idx="0">
+                          <a:scrgbClr r="0" g="0" b="0"/>
+                        </a:lnRef>
+                        <a:fillRef idx="0">
+                          <a:scrgbClr r="0" g="0" b="0"/>
+                        </a:fillRef>
+                        <a:effectRef idx="0">
+                          <a:scrgbClr r="0" g="0" b="0"/>
+                        </a:effectRef>
+                        <a:fontRef idx="minor">
+                          <a:schemeClr val="dk1"/>
+                        </a:fontRef>
+                      </wps:style>
+                      <wps:txbx>
+                        <w:txbxContent>
+                          <w:p>
+                            <w:pPr>
+                              <w:rPr>
+                                <w:lang w:val="en-US"/>
+                              </w:rPr>
+                            </w:pPr>
+                            <w:r>
+                              <w:rPr>
+                                <w:lang w:val="en-US"/>
+                              </w:rPr>
+                              <w:t>Record an unavailable space</w:t>
+                            </w:r>
+                          </w:p>
+                        </w:txbxContent>
+                      </wps:txbx>
+                      <wps:bodyPr rot="0" vert="horz" wrap="square" lIns="91440" tIns="45720" rIns="91440" bIns="45720" anchor="t" anchorCtr="0">
+                        <a:noAutofit/>
+                      </wps:bodyPr>
+                    </wps:wsp>
+                  </a:graphicData>
+                </a:graphic>
+                <wp14:sizeRelH relativeFrom="margin">
+                  <wp14:pctWidth>0</wp14:pctWidth>
+                </wp14:sizeRelH>
+                <wp14:sizeRelV relativeFrom="margin">
+                  <wp14:pctHeight>0</wp14:pctHeight>
+                </wp14:sizeRelV>
+              </wp:anchor>
+            </w:drawing>
+          </mc:Choice>
+          <mc:Fallback>
+            <w:pict>
+              <v:shapetype w14:anchorId="0E093829" id="_x0000_t202" coordsize="21600,21600" o:spt="202" path="m,l,21600r21600,l21600,xe">
+                <v:stroke joinstyle="miter"/>
+                <v:path gradientshapeok="t" o:connecttype="rect"/>
+              </v:shapetype>
+              <v:shape id="Text Box 2" o:spid="_x0000_s1026" type="#_x0000_t202" style="position:absolute;margin-left:154.8pt;margin-top:3.9pt;width:129.6pt;height:43.2pt;z-index:251672576;visibility:visible;mso-wrap-style:square;mso-width-percent:0;mso-height-percent:0;mso-wrap-distance-left:9pt;mso-wrap-distance-top:3.6pt;mso-wrap-distance-right:9pt;mso-wrap-distance-bottom:3.6pt;mso-position-horizontal:absolute;mso-position-horizontal-relative:text;mso-position-vertical:absolute;mso-position-vertical-relative:text;mso-width-percent:0;mso-height-percent:0;mso-width-relative:margin;mso-height-relative:margin;v-text-anchor:top" o:gfxdata="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" filled="f" stroked="f">
+                <v:textbox>
+                  <w:txbxContent>
+                    <w:p>
+                      <w:pPr>
+                        <w:rPr>
+                          <w:lang w:val="en-US"/>
+                        </w:rPr>
+                      </w:pPr>
+                      <w:r>
+                        <w:rPr>
+                          <w:lang w:val="en-US"/>
+                        </w:rPr>
+                        <w:t>Record an unavailable space</w:t>
+                      </w:r>
+                    </w:p>
+                  </w:txbxContent>
+                </v:textbox>
+                <w10:wrap type="square"/>
+              </v:shape>
+            </w:pict>
+          </mc:Fallback>
+        </mc:AlternateContent>
+      </w:r>
+      <w:r>
+        <w:rPr>
+          <w:noProof/>
+        </w:rPr>
+        <mc:AlternateContent>
+          <mc:Choice Requires="wps">
+            <w:drawing>
+              <wp:anchor distT="0" distB="0" distL="114300" distR="114300" simplePos="0" relativeHeight="251670528" behindDoc="0" locked="0" layoutInCell="1" allowOverlap="1" wp14:anchorId="5CF1DA4D" wp14:editId="5C8F0E53">
+                <wp:simplePos x="0" y="0"/>
+                <wp:positionH relativeFrom="column">
+                  <wp:posOffset>510540</wp:posOffset>
+                </wp:positionH>
+                <wp:positionV relativeFrom="paragraph">
+                  <wp:posOffset>247650</wp:posOffset>
+                </wp:positionV>
+                <wp:extent cx="1203960" cy="243840"/>
+                <wp:effectExtent l="0" t="57150" r="0" b="22860"/>
+                <wp:wrapNone/>
+                <wp:docPr id="675813827" name="Straight Arrow Connector 4"/>
+                <wp:cNvGraphicFramePr/>
+                <a:graphic xmlns:a="http://schemas.openxmlformats.org/drawingml/2006/main">
+                  <a:graphicData uri="http://schemas.microsoft.com/office/word/2010/wordprocessingShape">
+                    <wps:wsp>
+                      <wps:cNvCnPr/>
+                      <wps:spPr>
+                        <a:xfrm flipV="1">
+                          <a:off x="0" y="0"/>
+                          <a:ext cx="1203960" cy="243840"/>
+                        </a:xfrm>
+                        <a:prstGeom prst="straightConnector1">
+                          <a:avLst/>
+                        </a:prstGeom>
+                        <a:ln>
+                          <a:tailEnd type="triangle"/>
+                        </a:ln>
+                      </wps:spPr>
+                      <wps:style>
+                        <a:lnRef idx="1">
+                          <a:schemeClr val="dk1"/>
+                        </a:lnRef>
+                        <a:fillRef idx="0">
+                          <a:schemeClr val="dk1"/>
+                        </a:fillRef>
+                        <a:effectRef idx="0">
+                          <a:schemeClr val="dk1"/>
+                        </a:effectRef>
+                        <a:fontRef idx="minor">
+                          <a:schemeClr val="tx1"/>
+                        </a:fontRef>
+                      </wps:style>
+                      <wps:bodyPr/>
+                    </wps:wsp>
+                  </a:graphicData>
+                </a:graphic>
+              </wp:anchor>
+            </w:drawing>
+          </mc:Choice>
+          <mc:Fallback>
+            <w:pict>
+              <v:shapetype w14:anchorId="06D2ED2E" id="_x0000_t32" coordsize="21600,21600" o:spt="32" o:oned="t" path="m,l21600,21600e" filled="f">
+                <v:path arrowok="t" fillok="f" o:connecttype="none"/>
+                <o:lock v:ext="edit" shapetype="t"/>
+              </v:shapetype>
+              <v:shape id="Straight Arrow Connector 4" o:spid="_x0000_s1026" type="#_x0000_t32" style="position:absolute;margin-left:40.2pt;margin-top:19.5pt;width:94.8pt;height:19.2pt;flip:y;z-index:251670528;visibility:visible;mso-wrap-style:square;mso-wrap-distance-left:9pt;mso-wrap-distance-top:0;mso-wrap-distance-right:9pt;mso-wrap-distance-bottom:0;mso-position-horizontal:absolute;mso-position-horizontal-relative:text;mso-position-vertical:absolute;mso-position-vertical-relative:text" o:gfxdata="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" strokecolor="black [3200]" strokeweight=".5pt">
+                <v:stroke endarrow="block" joinstyle="miter"/>
+              </v:shape>
+            </w:pict>
+          </mc:Fallback>
+        </mc:AlternateContent>
+      </w:r>
+      <w:r>
+        <w:rPr>
+          <w:noProof/>
+        </w:rPr>
+        <mc:AlternateContent>
+          <mc:Choice Requires="wps">
+            <w:drawing>
+              <wp:anchor distT="0" distB="0" distL="114300" distR="114300" simplePos="0" relativeHeight="251668480" behindDoc="0" locked="0" layoutInCell="1" allowOverlap="1" wp14:anchorId="2B5B1E40" wp14:editId="5AB081B7">
+                <wp:simplePos x="0" y="0"/>
+                <wp:positionH relativeFrom="column">
+                  <wp:posOffset>83820</wp:posOffset>
+                </wp:positionH>
+                <wp:positionV relativeFrom="paragraph">
+                  <wp:posOffset>285750</wp:posOffset>
+                </wp:positionV>
+                <wp:extent cx="190500" cy="236220"/>
+                <wp:effectExtent l="0" t="0" r="19050" b="30480"/>
+                <wp:wrapNone/>
+                <wp:docPr id="1928639423" name="Straight Connector 2"/>
+                <wp:cNvGraphicFramePr/>
+                <a:graphic xmlns:a="http://schemas.openxmlformats.org/drawingml/2006/main">
+                  <a:graphicData uri="http://schemas.microsoft.com/office/word/2010/wordprocessingShape">
+                    <wps:wsp>
+                      <wps:cNvCnPr/>
+                      <wps:spPr>
+                        <a:xfrm flipH="1">
+                          <a:off x="0" y="0"/>
+                          <a:ext cx="190500" cy="236220"/>
+                        </a:xfrm>
+                        <a:prstGeom prst="line">
+                          <a:avLst/>
+                        </a:prstGeom>
+                        <a:ln w="19050"/>
+                      </wps:spPr>
+                      <wps:style>
+                        <a:lnRef idx="1">
+                          <a:schemeClr val="dk1"/>
+                        </a:lnRef>
+                        <a:fillRef idx="0">
+                          <a:schemeClr val="dk1"/>
+                        </a:fillRef>
+                        <a:effectRef idx="0">
+                          <a:schemeClr val="dk1"/>
+                        </a:effectRef>
+                        <a:fontRef idx="minor">
+                          <a:schemeClr val="tx1"/>
+                        </a:fontRef>
+                      </wps:style>
+                      <wps:bodyPr/>
+                    </wps:wsp>
+                  </a:graphicData>
+                </a:graphic>
+                <wp14:sizeRelH relativeFrom="margin">
+                  <wp14:pctWidth>0</wp14:pctWidth>
+                </wp14:sizeRelH>
+                <wp14:sizeRelV relativeFrom="margin">
+                  <wp14:pctHeight>0</wp14:pctHeight>
+                </wp14:sizeRelV>
+              </wp:anchor>
+            </w:drawing>
+          </mc:Choice>
+          <mc:Fallback>
+            <w:pict>
+              <v:line w14:anchorId="72C084BA" id="Straight Connector 2" o:spid="_x0000_s1026" style="position:absolute;flip:x;z-index:251668480;visibility:visible;mso-wrap-style:square;mso-width-percent:0;mso-height-percent:0;mso-wrap-distance-left:9pt;mso-wrap-distance-top:0;mso-wrap-distance-right:9pt;mso-wrap-distance-bottom:0;mso-position-horizontal:absolute;mso-position-horizontal-relative:text;mso-position-vertical:absolute;mso-position-vertical-relative:text;mso-width-percent:0;mso-height-percent:0;mso-width-relative:margin;mso-height-relative:margin" from="6.6pt,22.5pt" to="21.6pt,41.1pt" o:gfxdata="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" strokecolor="black [3200]" strokeweight="1.5pt">
+                <v:stroke joinstyle="miter"/>
+              </v:line>
+            </w:pict>
+          </mc:Fallback>
+        </mc:AlternateContent>
+      </w:r>
+      <w:r>
+        <w:rPr>
+          <w:noProof/>
+        </w:rPr>
+        <mc:AlternateContent>
+          <mc:Choice Requires="wps">
+            <w:drawing>
+              <wp:anchor distT="0" distB="0" distL="114300" distR="114300" simplePos="0" relativeHeight="251666432" behindDoc="0" locked="0" layoutInCell="1" allowOverlap="1" wp14:anchorId="0A07F65B" wp14:editId="0EF2DB4B">
+                <wp:simplePos x="0" y="0"/>
+                <wp:positionH relativeFrom="column">
+                  <wp:posOffset>259080</wp:posOffset>
+                </wp:positionH>
+                <wp:positionV relativeFrom="paragraph">
+                  <wp:posOffset>278130</wp:posOffset>
+                </wp:positionV>
+                <wp:extent cx="198120" cy="243840"/>
+                <wp:effectExtent l="0" t="0" r="30480" b="22860"/>
+                <wp:wrapNone/>
+                <wp:docPr id="1318182700" name="Straight Connector 2"/>
+                <wp:cNvGraphicFramePr/>
+                <a:graphic xmlns:a="http://schemas.openxmlformats.org/drawingml/2006/main">
+                  <a:graphicData uri="http://schemas.microsoft.com/office/word/2010/wordprocessingShape">
+                    <wps:wsp>
+                      <wps:cNvCnPr/>
+                      <wps:spPr>
+                        <a:xfrm>
+                          <a:off x="0" y="0"/>
+                          <a:ext cx="198120" cy="243840"/>
+                        </a:xfrm>
+                        <a:prstGeom prst="line">
+                          <a:avLst/>
+                        </a:prstGeom>
+                        <a:ln w="19050"/>
+                      </wps:spPr>
+                      <wps:style>
+                        <a:lnRef idx="1">
+                          <a:schemeClr val="dk1"/>
+                        </a:lnRef>
+                        <a:fillRef idx="0">
+                          <a:schemeClr val="dk1"/>
+                        </a:fillRef>
+                        <a:effectRef idx="0">
+                          <a:schemeClr val="dk1"/>
+                        </a:effectRef>
+                        <a:fontRef idx="minor">
+                          <a:schemeClr val="tx1"/>
+                        </a:fontRef>
+                      </wps:style>
+                      <wps:bodyPr/>
+                    </wps:wsp>
+                  </a:graphicData>
+                </a:graphic>
+                <wp14:sizeRelH relativeFrom="margin">
+                  <wp14:pctWidth>0</wp14:pctWidth>
+                </wp14:sizeRelH>
+                <wp14:sizeRelV relativeFrom="margin">
+                  <wp14:pctHeight>0</wp14:pctHeight>
+                </wp14:sizeRelV>
+              </wp:anchor>
+            </w:drawing>
+          </mc:Choice>
+          <mc:Fallback>
+            <w:pict>
+              <v:line w14:anchorId="23A0DADE" id="Straight Connector 2" o:spid="_x0000_s1026" style="position:absolute;z-index:251666432;visibility:visible;mso-wrap-style:square;mso-width-percent:0;mso-height-percent:0;mso-wrap-distance-left:9pt;mso-wrap-distance-top:0;mso-wrap-distance-right:9pt;mso-wrap-distance-bottom:0;mso-position-horizontal:absolute;mso-position-horizontal-relative:text;mso-position-vertical:absolute;mso-position-vertical-relative:text;mso-width-percent:0;mso-height-percent:0;mso-width-relative:margin;mso-height-relative:margin" from="20.4pt,21.9pt" to="36pt,41.1pt" o:gfxdata="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" strokecolor="black [3200]" strokeweight="1.5pt">
+                <v:stroke joinstyle="miter"/>
+              </v:line>
+            </w:pict>
+          </mc:Fallback>
+        </mc:AlternateContent>
+      </w:r>
+      <w:r>
+        <w:rPr>
+          <w:noProof/>
+        </w:rPr>
+        <mc:AlternateContent>
+          <mc:Choice Requires="wps">
+            <w:drawing>
+              <wp:anchor distT="0" distB="0" distL="114300" distR="114300" simplePos="0" relativeHeight="251660288" behindDoc="0" locked="0" layoutInCell="1" allowOverlap="1" wp14:anchorId="5EBE58C7" wp14:editId="118FA62E">
+                <wp:simplePos x="0" y="0"/>
+                <wp:positionH relativeFrom="column">
+                  <wp:posOffset>259080</wp:posOffset>
+                </wp:positionH>
+                <wp:positionV relativeFrom="paragraph">
+                  <wp:posOffset>278130</wp:posOffset>
+                </wp:positionV>
+                <wp:extent cx="7620" cy="516890"/>
+                <wp:effectExtent l="0" t="0" r="30480" b="35560"/>
+                <wp:wrapNone/>
+                <wp:docPr id="1224234598" name="Straight Connector 2"/>
+                <wp:cNvGraphicFramePr/>
+                <a:graphic xmlns:a="http://schemas.openxmlformats.org/drawingml/2006/main">
+                  <a:graphicData uri="http://schemas.microsoft.com/office/word/2010/wordprocessingShape">
+                    <wps:wsp>
+                      <wps:cNvCnPr/>
+                      <wps:spPr>
+                        <a:xfrm>
+                          <a:off x="0" y="0"/>
+                          <a:ext cx="7620" cy="516890"/>
+                        </a:xfrm>
+                        <a:prstGeom prst="line">
+                          <a:avLst/>
+                        </a:prstGeom>
+                        <a:ln w="19050"/>
+                      </wps:spPr>
+                      <wps:style>
+                        <a:lnRef idx="1">
+                          <a:schemeClr val="dk1"/>
+                        </a:lnRef>
+                        <a:fillRef idx="0">
+                          <a:schemeClr val="dk1"/>
+                        </a:fillRef>
+                        <a:effectRef idx="0">
+                          <a:schemeClr val="dk1"/>
+                        </a:effectRef>
+                        <a:fontRef idx="minor">
+                          <a:schemeClr val="tx1"/>
+                        </a:fontRef>
+                      </wps:style>
+                      <wps:bodyPr/>
+                    </wps:wsp>
+                  </a:graphicData>
+                </a:graphic>
+                <wp14:sizeRelH relativeFrom="margin">
+                  <wp14:pctWidth>0</wp14:pctWidth>
+                </wp14:sizeRelH>
+                <wp14:sizeRelV relativeFrom="margin">
+                  <wp14:pctHeight>0</wp14:pctHeight>
+                </wp14:sizeRelV>
+              </wp:anchor>
+            </w:drawing>
+          </mc:Choice>
+          <mc:Fallback>
+            <w:pict>
+              <v:line w14:anchorId="49C1699E" id="Straight Connector 2" o:spid="_x0000_s1026" style="position:absolute;z-index:251660288;visibility:visible;mso-wrap-style:square;mso-width-percent:0;mso-height-percent:0;mso-wrap-distance-left:9pt;mso-wrap-distance-top:0;mso-wrap-distance-right:9pt;mso-wrap-distance-bottom:0;mso-position-horizontal:absolute;mso-position-horizontal-relative:text;mso-position-vertical:absolute;mso-position-vertical-relative:text;mso-width-percent:0;mso-height-percent:0;mso-width-relative:margin;mso-height-relative:margin" from="20.4pt,21.9pt" to="21pt,62.6pt" o:gfxdata="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" strokecolor="black [3200]" strokeweight="1.5pt">
+                <v:stroke joinstyle="miter"/>
+              </v:line>
+            </w:pict>
+          </mc:Fallback>
+        </mc:AlternateContent>
+      </w:r>
+    </w:p>
+    <w:p/>
+    <w:p>
+      <w:r>
+        <w:rPr>
+          <w:noProof/>
+        </w:rPr>
+        <mc:AlternateContent>
+          <mc:Choice Requires="wps">
+            <w:drawing>
+              <wp:anchor distT="0" distB="0" distL="114300" distR="114300" simplePos="0" relativeHeight="251664384" behindDoc="0" locked="0" layoutInCell="1" allowOverlap="1" wp14:anchorId="0C3A4B61" wp14:editId="60E64738">
+                <wp:simplePos x="0" y="0"/>
+                <wp:positionH relativeFrom="column">
+                  <wp:posOffset>121920</wp:posOffset>
+                </wp:positionH>
+                <wp:positionV relativeFrom="paragraph">
+                  <wp:posOffset>144780</wp:posOffset>
+                </wp:positionV>
+                <wp:extent cx="160020" cy="251460"/>
+                <wp:effectExtent l="0" t="0" r="30480" b="34290"/>
+                <wp:wrapNone/>
+                <wp:docPr id="818965445" name="Straight Connector 2"/>
+                <wp:cNvGraphicFramePr/>
+                <a:graphic xmlns:a="http://schemas.openxmlformats.org/drawingml/2006/main">
+                  <a:graphicData uri="http://schemas.microsoft.com/office/word/2010/wordprocessingShape">
+                    <wps:wsp>
+                      <wps:cNvCnPr/>
+                      <wps:spPr>
+                        <a:xfrm flipH="1">
+                          <a:off x="0" y="0"/>
+                          <a:ext cx="160020" cy="251460"/>
+                        </a:xfrm>
+                        <a:prstGeom prst="line">
+                          <a:avLst/>
+                        </a:prstGeom>
+                        <a:ln w="19050"/>
+                      </wps:spPr>
+                      <wps:style>
+                        <a:lnRef idx="1">
+                          <a:schemeClr val="dk1"/>
+                        </a:lnRef>
+                        <a:fillRef idx="0">
+                          <a:schemeClr val="dk1"/>
+                        </a:fillRef>
+                        <a:effectRef idx="0">
+                          <a:schemeClr val="dk1"/>
+                        </a:effectRef>
+                        <a:fontRef idx="minor">
+                          <a:schemeClr val="tx1"/>
+                        </a:fontRef>
+                      </wps:style>
+                      <wps:bodyPr/>
+                    </wps:wsp>
+                  </a:graphicData>
+                </a:graphic>
+                <wp14:sizeRelH relativeFrom="margin">
+                  <wp14:pctWidth>0</wp14:pctWidth>
+                </wp14:sizeRelH>
+                <wp14:sizeRelV relativeFrom="margin">
+                  <wp14:pctHeight>0</wp14:pctHeight>
+                </wp14:sizeRelV>
+              </wp:anchor>
+            </w:drawing>
+          </mc:Choice>
+          <mc:Fallback>
+            <w:pict>
+              <v:line w14:anchorId="3708AB0F" id="Straight Connector 2" o:spid="_x0000_s1026" style="position:absolute;flip:x;z-index:251664384;visibility:visible;mso-wrap-style:square;mso-width-percent:0;mso-height-percent:0;mso-wrap-distance-left:9pt;mso-wrap-distance-top:0;mso-wrap-distance-right:9pt;mso-wrap-distance-bottom:0;mso-position-horizontal:absolute;mso-position-horizontal-relative:text;mso-position-vertical:absolute;mso-position-vertical-relative:text;mso-width-percent:0;mso-height-percent:0;mso-width-relative:margin;mso-height-relative:margin" from="9.6pt,11.4pt" to="22.2pt,31.2pt" o:gfxdata="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" strokecolor="black [3200]" strokeweight="1.5pt">
+                <v:stroke joinstyle="miter"/>
+              </v:line>
+            </w:pict>
+          </mc:Fallback>
+        </mc:AlternateContent>
+      </w:r>
+      <w:r>
+        <w:rPr>
+          <w:noProof/>
+        </w:rPr>
+        <mc:AlternateContent>
+          <mc:Choice Requires="wps">
+            <w:drawing>
+              <wp:anchor distT="0" distB="0" distL="114300" distR="114300" simplePos="0" relativeHeight="251662336" behindDoc="0" locked="0" layoutInCell="1" allowOverlap="1" wp14:anchorId="1A71AB34" wp14:editId="1ED0CFDC">
+                <wp:simplePos x="0" y="0"/>
+                <wp:positionH relativeFrom="column">
+                  <wp:posOffset>259080</wp:posOffset>
+                </wp:positionH>
+                <wp:positionV relativeFrom="paragraph">
+                  <wp:posOffset>137160</wp:posOffset>
+                </wp:positionV>
+                <wp:extent cx="198120" cy="243840"/>
+                <wp:effectExtent l="0" t="0" r="30480" b="22860"/>
+                <wp:wrapNone/>
+                <wp:docPr id="20604785" name="Straight Connector 2"/>
+                <wp:cNvGraphicFramePr/>
+                <a:graphic xmlns:a="http://schemas.openxmlformats.org/drawingml/2006/main">
+                  <a:graphicData uri="http://schemas.microsoft.com/office/word/2010/wordprocessingShape">
+                    <wps:wsp>
+                      <wps:cNvCnPr/>
+                      <wps:spPr>
+                        <a:xfrm>
+                          <a:off x="0" y="0"/>
+                          <a:ext cx="198120" cy="243840"/>
+                        </a:xfrm>
+                        <a:prstGeom prst="line">
+                          <a:avLst/>
+                        </a:prstGeom>
+                        <a:ln w="19050"/>
+                      </wps:spPr>
+                      <wps:style>
+                        <a:lnRef idx="1">
+                          <a:schemeClr val="dk1"/>
+                        </a:lnRef>
+                        <a:fillRef idx="0">
+                          <a:schemeClr val="dk1"/>
+                        </a:fillRef>
+                        <a:effectRef idx="0">
+                          <a:schemeClr val="dk1"/>
+                        </a:effectRef>
+                        <a:fontRef idx="minor">
+                          <a:schemeClr val="tx1"/>
+                        </a:fontRef>
+                      </wps:style>
+                      <wps:bodyPr/>
+                    </wps:wsp>
+                  </a:graphicData>
+                </a:graphic>
+                <wp14:sizeRelH relativeFrom="margin">
+                  <wp14:pctWidth>0</wp14:pctWidth>
+                </wp14:sizeRelH>
+                <wp14:sizeRelV relativeFrom="margin">
+                  <wp14:pctHeight>0</wp14:pctHeight>
+                </wp14:sizeRelV>
+              </wp:anchor>
+            </w:drawing>
+          </mc:Choice>
+          <mc:Fallback>
+            <w:pict>
+              <v:line w14:anchorId="3F13B370" id="Straight Connector 2" o:spid="_x0000_s1026" style="position:absolute;z-index:251662336;visibility:visible;mso-wrap-style:square;mso-width-percent:0;mso-height-percent:0;mso-wrap-distance-left:9pt;mso-wrap-distance-top:0;mso-wrap-distance-right:9pt;mso-wrap-distance-bottom:0;mso-position-horizontal:absolute;mso-position-horizontal-relative:text;mso-position-vertical:absolute;mso-position-vertical-relative:text;mso-width-percent:0;mso-height-percent:0;mso-width-relative:margin;mso-height-relative:margin" from="20.4pt,10.8pt" to="36pt,30pt" o:gfxdata="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" strokecolor="black [3200]" strokeweight="1.5pt">
+                <v:stroke joinstyle="miter"/>
+              </v:line>
+            </w:pict>
+          </mc:Fallback>
+        </mc:AlternateContent>
+      </w:r>
+    </w:p>
+    <w:p>
+      <w:r>
+        <w:rPr>
+          <w:noProof/>
+        </w:rPr>
+        <mc:AlternateContent>
+          <mc:Choice Requires="wps">
+            <w:drawing>
+              <wp:anchor distT="45720" distB="45720" distL="114300" distR="114300" simplePos="0" relativeHeight="251674624" behindDoc="0" locked="0" layoutInCell="1" allowOverlap="1" wp14:anchorId="4D8EE7FA" wp14:editId="31F6F0F3">
+                <wp:simplePos x="0" y="0"/>
+                <wp:positionH relativeFrom="page">
+                  <wp:posOffset>777240</wp:posOffset>
+                </wp:positionH>
+                <wp:positionV relativeFrom="paragraph">
+                  <wp:posOffset>101600</wp:posOffset>
+                </wp:positionV>
+                <wp:extent cx="1417320" cy="433705"/>
+                <wp:effectExtent l="0" t="0" r="0" b="4445"/>
+                <wp:wrapSquare wrapText="bothSides"/>
+                <wp:docPr id="397145083" name="Text Box 2"/>
+                <wp:cNvGraphicFramePr>
+                  <a:graphicFrameLocks xmlns:a="http://schemas.openxmlformats.org/drawingml/2006/main"/>
+                </wp:cNvGraphicFramePr>
+                <a:graphic xmlns:a="http://schemas.openxmlformats.org/drawingml/2006/main">
+                  <a:graphicData uri="http://schemas.microsoft.com/office/word/2010/wordprocessingShape">
+                    <wps:wsp>
+                      <wps:cNvSpPr txBox="1">
+                        <a:spLocks noChangeArrowheads="1"/>
+                      </wps:cNvSpPr>
+                      <wps:spPr bwMode="auto">
+                        <a:xfrm>
+                          <a:off x="0" y="0"/>
+                          <a:ext cx="1417320" cy="433705"/>
+                        </a:xfrm>
+                        <a:prstGeom prst="rect">
+                          <a:avLst/>
+                        </a:prstGeom>
+                        <a:noFill/>
+                        <a:ln>
+                          <a:noFill/>
+                        </a:ln>
+                      </wps:spPr>
+                      <wps:style>
+                        <a:lnRef idx="0">
+                          <a:scrgbClr r="0" g="0" b="0"/>
+                        </a:lnRef>
+                        <a:fillRef idx="0">
+                          <a:scrgbClr r="0" g="0" b="0"/>
+                        </a:fillRef>
+                        <a:effectRef idx="0">
+                          <a:scrgbClr r="0" g="0" b="0"/>
+                        </a:effectRef>
+                        <a:fontRef idx="minor">
+                          <a:schemeClr val="dk1"/>
+                        </a:fontRef>
+                      </wps:style>
+                      <wps:txbx>
+                        <w:txbxContent>
+                          <w:p>
+                            <w:r>
+                              <w:t>Staff member</w:t>
+                            </w:r>
+                          </w:p>
+                        </w:txbxContent>
+                      </wps:txbx>
+                      <wps:bodyPr rot="0" vert="horz" wrap="square" lIns="91440" tIns="45720" rIns="91440" bIns="45720" anchor="t" anchorCtr="0">
+                        <a:noAutofit/>
+                      </wps:bodyPr>
+                    </wps:wsp>
+                  </a:graphicData>
+                </a:graphic>
+                <wp14:sizeRelH relativeFrom="margin">
+                  <wp14:pctWidth>0</wp14:pctWidth>
+                </wp14:sizeRelH>
+                <wp14:sizeRelV relativeFrom="margin">
+                  <wp14:pctHeight>0</wp14:pctHeight>
+                </wp14:sizeRelV>
+              </wp:anchor>
+            </w:drawing>
+          </mc:Choice>
+          <mc:Fallback>
+            <w:pict>
+              <v:shape w14:anchorId="4D8EE7FA" id="_x0000_s1027" type="#_x0000_t202" style="position:absolute;margin-left:61.2pt;margin-top:8pt;width:111.6pt;height:34.15pt;z-index:251674624;visibility:visible;mso-wrap-style:square;mso-width-percent:0;mso-height-percent:0;mso-wrap-distance-left:9pt;mso-wrap-distance-top:3.6pt;mso-wrap-distance-right:9pt;mso-wrap-distance-bottom:3.6pt;mso-position-horizontal:absolute;mso-position-horizontal-relative:page;mso-position-vertical:absolute;mso-position-vertical-relative:text;mso-width-percent:0;mso-height-percent:0;mso-width-relative:margin;mso-height-relative:margin;v-text-anchor:top" o:gfxdata="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" filled="f" stroked="f">
+                <v:textbox>
+                  <w:txbxContent>
+                    <w:p>
+                      <w:r>
+                        <w:t>Staff member</w:t>
+                      </w:r>
+                    </w:p>
+                  </w:txbxContent>
+                </v:textbox>
+                <w10:wrap type="square" anchorx="page"/>
+              </v:shape>
+            </w:pict>
+          </mc:Fallback>
+        </mc:AlternateContent>
+      </w:r>
+    </w:p>
+    <w:p/>
     <w:tbl>
       <w:tblPr>
         <w:tblW w:w="0" w:type="dxa"/>
@@ -22146,6 +22938,7 @@
               </w:rPr>
             </w:pPr>
             <w:r>
+              <w:lastRenderedPageBreak/>
               <w:t>The staff member selects specific area in facility and then affected space.</w:t>
             </w:r>
             <w:r>
@@ -22281,7 +23074,6 @@
                 <w:b/>
                 <w:bCs/>
               </w:rPr>
-              <w:lastRenderedPageBreak/>
               <w:t>Alternate Flow</w:t>
             </w:r>
             <w:r>
@@ -22633,6 +23425,7 @@
                 <w:b/>
                 <w:bCs/>
               </w:rPr>
+              <w:lastRenderedPageBreak/>
               <w:t>Post conditions</w:t>
             </w:r>
             <w:r>
@@ -22721,9 +23514,1088 @@
     <w:p>
       <w:pPr>
         <w:rPr>
-          <w:lang w:val="uk-UA"/>
+          <w:lang w:val="en-US"/>
         </w:rPr>
       </w:pPr>
+    </w:p>
+    <w:p>
+      <w:pPr>
+        <w:pStyle w:val="Heading1"/>
+        <w:rPr>
+          <w:lang w:val="en-US"/>
+        </w:rPr>
+      </w:pPr>
+      <w:r>
+        <w:rPr>
+          <w:lang w:val="en-US"/>
+        </w:rPr>
+        <w:t>Gherkin examples</w:t>
+      </w:r>
+      <w:r>
+        <w:rPr>
+          <w:lang w:val="en-US"/>
+        </w:rPr>
+        <w:t>:</w:t>
+      </w:r>
+    </w:p>
+    <w:p>
+      <w:pPr>
+        <w:rPr>
+          <w:lang w:val="en-US"/>
+        </w:rPr>
+      </w:pPr>
+      <w:r>
+        <w:rPr>
+          <w:lang w:val="en-US"/>
+        </w:rPr>
+        <w:t>1.</w:t>
+      </w:r>
+    </w:p>
+    <w:p>
+      <w:pPr>
+        <w:rPr>
+          <w:b/>
+          <w:bCs/>
+          <w:lang w:val="en-US"/>
+        </w:rPr>
+      </w:pPr>
+      <w:r>
+        <w:rPr>
+          <w:b/>
+          <w:bCs/>
+          <w:lang w:val="en-US"/>
+        </w:rPr>
+        <w:t>Feature: Record a space as unavailable without closing the whole facility</w:t>
+      </w:r>
+    </w:p>
+    <w:p>
+      <w:pPr>
+        <w:rPr>
+          <w:lang w:val="en-US"/>
+        </w:rPr>
+      </w:pPr>
+    </w:p>
+    <w:p>
+      <w:pPr>
+        <w:rPr>
+          <w:b/>
+          <w:bCs/>
+          <w:lang w:val="en-US"/>
+        </w:rPr>
+      </w:pPr>
+      <w:r>
+        <w:rPr>
+          <w:b/>
+          <w:bCs/>
+          <w:lang w:val="en-US"/>
+        </w:rPr>
+        <w:t>Background:</w:t>
+      </w:r>
+    </w:p>
+    <w:p>
+      <w:pPr>
+        <w:rPr>
+          <w:lang w:val="en-US"/>
+        </w:rPr>
+      </w:pPr>
+      <w:r>
+        <w:rPr>
+          <w:lang w:val="en-US"/>
+        </w:rPr>
+        <w:t xml:space="preserve">    Given </w:t>
+      </w:r>
+      <w:proofErr w:type="gramStart"/>
+      <w:r>
+        <w:rPr>
+          <w:lang w:val="en-US"/>
+        </w:rPr>
+        <w:t>a facility</w:t>
+      </w:r>
+      <w:proofErr w:type="gramEnd"/>
+      <w:r>
+        <w:rPr>
+          <w:lang w:val="en-US"/>
+        </w:rPr>
+        <w:t xml:space="preserve"> has a sports hall, training room and pitch and each of them can be booked</w:t>
+      </w:r>
+    </w:p>
+    <w:p>
+      <w:pPr>
+        <w:rPr>
+          <w:lang w:val="en-US"/>
+        </w:rPr>
+      </w:pPr>
+    </w:p>
+    <w:p>
+      <w:pPr>
+        <w:rPr>
+          <w:lang w:val="en-US"/>
+        </w:rPr>
+      </w:pPr>
+      <w:r>
+        <w:rPr>
+          <w:b/>
+          <w:bCs/>
+          <w:lang w:val="en-US"/>
+        </w:rPr>
+        <w:t xml:space="preserve">  Rule:</w:t>
+      </w:r>
+      <w:r>
+        <w:rPr>
+          <w:lang w:val="en-US"/>
+        </w:rPr>
+        <w:t xml:space="preserve"> Only the affected space becomes unavailable</w:t>
+      </w:r>
+    </w:p>
+    <w:p>
+      <w:pPr>
+        <w:rPr>
+          <w:lang w:val="en-US"/>
+        </w:rPr>
+      </w:pPr>
+    </w:p>
+    <w:p>
+      <w:pPr>
+        <w:rPr>
+          <w:b/>
+          <w:bCs/>
+          <w:i/>
+          <w:iCs/>
+          <w:lang w:val="en-US"/>
+        </w:rPr>
+      </w:pPr>
+      <w:r>
+        <w:rPr>
+          <w:lang w:val="en-US"/>
+        </w:rPr>
+        <w:t xml:space="preserve">    </w:t>
+      </w:r>
+      <w:proofErr w:type="gramStart"/>
+      <w:r>
+        <w:rPr>
+          <w:b/>
+          <w:bCs/>
+          <w:i/>
+          <w:iCs/>
+          <w:lang w:val="en-US"/>
+        </w:rPr>
+        <w:t>@FR1 @P1</w:t>
+      </w:r>
+      <w:proofErr w:type="gramEnd"/>
+    </w:p>
+    <w:p>
+      <w:pPr>
+        <w:rPr>
+          <w:lang w:val="en-US"/>
+        </w:rPr>
+      </w:pPr>
+      <w:r>
+        <w:rPr>
+          <w:lang w:val="en-US"/>
+        </w:rPr>
+        <w:t xml:space="preserve">    </w:t>
+      </w:r>
+      <w:r>
+        <w:rPr>
+          <w:b/>
+          <w:bCs/>
+          <w:lang w:val="en-US"/>
+        </w:rPr>
+        <w:t>Scenario:</w:t>
+      </w:r>
+      <w:r>
+        <w:rPr>
+          <w:lang w:val="en-US"/>
+        </w:rPr>
+        <w:t xml:space="preserve"> Maintenance restricts one selected space only</w:t>
+      </w:r>
+    </w:p>
+    <w:p>
+      <w:pPr>
+        <w:rPr>
+          <w:lang w:val="en-US"/>
+        </w:rPr>
+      </w:pPr>
+      <w:r>
+        <w:rPr>
+          <w:lang w:val="en-US"/>
+        </w:rPr>
+        <w:t xml:space="preserve">      </w:t>
+      </w:r>
+      <w:r>
+        <w:rPr>
+          <w:b/>
+          <w:bCs/>
+          <w:lang w:val="en-US"/>
+        </w:rPr>
+        <w:t>Given</w:t>
+      </w:r>
+      <w:r>
+        <w:rPr>
+          <w:lang w:val="en-US"/>
+        </w:rPr>
+        <w:t xml:space="preserve"> a staff member has been told that the sports hall will be out of service for maintenance from 09:00 to 17:00 on a stated date</w:t>
+      </w:r>
+    </w:p>
+    <w:p>
+      <w:pPr>
+        <w:rPr>
+          <w:lang w:val="en-US"/>
+        </w:rPr>
+      </w:pPr>
+      <w:r>
+        <w:rPr>
+          <w:lang w:val="en-US"/>
+        </w:rPr>
+        <w:t xml:space="preserve">     </w:t>
+      </w:r>
+      <w:r>
+        <w:rPr>
+          <w:b/>
+          <w:bCs/>
+          <w:lang w:val="en-US"/>
+        </w:rPr>
+        <w:t xml:space="preserve"> </w:t>
+      </w:r>
+      <w:proofErr w:type="gramStart"/>
+      <w:r>
+        <w:rPr>
+          <w:b/>
+          <w:bCs/>
+          <w:lang w:val="en-US"/>
+        </w:rPr>
+        <w:t>When</w:t>
+      </w:r>
+      <w:r>
+        <w:rPr>
+          <w:lang w:val="en-US"/>
+        </w:rPr>
+        <w:t xml:space="preserve">  staff</w:t>
+      </w:r>
+      <w:proofErr w:type="gramEnd"/>
+      <w:r>
+        <w:rPr>
+          <w:lang w:val="en-US"/>
+        </w:rPr>
+        <w:t xml:space="preserve"> member records the sports hall as unavailable for that date and time range with the reason "Maintenance"</w:t>
+      </w:r>
+    </w:p>
+    <w:p>
+      <w:pPr>
+        <w:rPr>
+          <w:lang w:val="en-US"/>
+        </w:rPr>
+      </w:pPr>
+      <w:r>
+        <w:rPr>
+          <w:b/>
+          <w:bCs/>
+          <w:lang w:val="en-US"/>
+        </w:rPr>
+        <w:t xml:space="preserve">      Then</w:t>
+      </w:r>
+      <w:r>
+        <w:rPr>
+          <w:lang w:val="en-US"/>
+        </w:rPr>
+        <w:t xml:space="preserve"> sports hall is shown as unavailable for that date/time range with the reason "Maintenance"</w:t>
+      </w:r>
+    </w:p>
+    <w:p>
+      <w:pPr>
+        <w:rPr>
+          <w:lang w:val="en-US"/>
+        </w:rPr>
+      </w:pPr>
+      <w:r>
+        <w:rPr>
+          <w:lang w:val="en-US"/>
+        </w:rPr>
+        <w:t xml:space="preserve">     </w:t>
+      </w:r>
+      <w:r>
+        <w:rPr>
+          <w:b/>
+          <w:bCs/>
+          <w:lang w:val="en-US"/>
+        </w:rPr>
+        <w:t xml:space="preserve"> And </w:t>
+      </w:r>
+      <w:r>
+        <w:rPr>
+          <w:lang w:val="en-US"/>
+        </w:rPr>
+        <w:t>a booking request for the sports hall within that date/time range cannot be accepted</w:t>
+      </w:r>
+    </w:p>
+    <w:p>
+      <w:pPr>
+        <w:rPr>
+          <w:lang w:val="en-US"/>
+        </w:rPr>
+      </w:pPr>
+      <w:r>
+        <w:rPr>
+          <w:b/>
+          <w:bCs/>
+          <w:lang w:val="en-US"/>
+        </w:rPr>
+        <w:t xml:space="preserve">      And</w:t>
+      </w:r>
+      <w:r>
+        <w:rPr>
+          <w:lang w:val="en-US"/>
+        </w:rPr>
+        <w:t xml:space="preserve"> the training room and the pitch can still be booked for the same range</w:t>
+      </w:r>
+    </w:p>
+    <w:p>
+      <w:pPr>
+        <w:rPr>
+          <w:lang w:val="en-US"/>
+        </w:rPr>
+      </w:pPr>
+    </w:p>
+    <w:p>
+      <w:pPr>
+        <w:rPr>
+          <w:lang w:val="en-US"/>
+        </w:rPr>
+      </w:pPr>
+      <w:r>
+        <w:rPr>
+          <w:lang w:val="en-US"/>
+        </w:rPr>
+        <w:lastRenderedPageBreak/>
+        <w:t xml:space="preserve">  </w:t>
+      </w:r>
+      <w:r>
+        <w:rPr>
+          <w:b/>
+          <w:bCs/>
+          <w:lang w:val="en-US"/>
+        </w:rPr>
+        <w:t>Rule:</w:t>
+      </w:r>
+      <w:r>
+        <w:rPr>
+          <w:lang w:val="en-US"/>
+        </w:rPr>
+        <w:t xml:space="preserve"> A restriction of space must have a date, time range and reason</w:t>
+      </w:r>
+    </w:p>
+    <w:p>
+      <w:pPr>
+        <w:rPr>
+          <w:lang w:val="en-US"/>
+        </w:rPr>
+      </w:pPr>
+    </w:p>
+    <w:p>
+      <w:pPr>
+        <w:rPr>
+          <w:b/>
+          <w:bCs/>
+          <w:i/>
+          <w:iCs/>
+          <w:lang w:val="en-US"/>
+        </w:rPr>
+      </w:pPr>
+      <w:r>
+        <w:rPr>
+          <w:lang w:val="en-US"/>
+        </w:rPr>
+        <w:t xml:space="preserve">    </w:t>
+      </w:r>
+      <w:proofErr w:type="gramStart"/>
+      <w:r>
+        <w:rPr>
+          <w:b/>
+          <w:bCs/>
+          <w:i/>
+          <w:iCs/>
+          <w:lang w:val="en-US"/>
+        </w:rPr>
+        <w:t>@FR1 @P1</w:t>
+      </w:r>
+      <w:proofErr w:type="gramEnd"/>
+    </w:p>
+    <w:p>
+      <w:pPr>
+        <w:rPr>
+          <w:lang w:val="en-US"/>
+        </w:rPr>
+      </w:pPr>
+      <w:r>
+        <w:rPr>
+          <w:b/>
+          <w:bCs/>
+          <w:lang w:val="en-US"/>
+        </w:rPr>
+        <w:t xml:space="preserve">    Scenario:</w:t>
+      </w:r>
+      <w:r>
+        <w:rPr>
+          <w:lang w:val="en-US"/>
+        </w:rPr>
+        <w:t xml:space="preserve"> Restriction of space without a reason is not recorded</w:t>
+      </w:r>
+    </w:p>
+    <w:p>
+      <w:pPr>
+        <w:rPr>
+          <w:lang w:val="en-US"/>
+        </w:rPr>
+      </w:pPr>
+      <w:r>
+        <w:rPr>
+          <w:lang w:val="en-US"/>
+        </w:rPr>
+        <w:t xml:space="preserve">     </w:t>
+      </w:r>
+      <w:r>
+        <w:rPr>
+          <w:b/>
+          <w:bCs/>
+          <w:lang w:val="en-US"/>
+        </w:rPr>
+        <w:t xml:space="preserve"> Given</w:t>
+      </w:r>
+      <w:r>
+        <w:rPr>
+          <w:lang w:val="en-US"/>
+        </w:rPr>
+        <w:t xml:space="preserve"> a staff member has been told that the training room will be out of service from 10:00 to 12:00 on </w:t>
+      </w:r>
+      <w:proofErr w:type="gramStart"/>
+      <w:r>
+        <w:rPr>
+          <w:lang w:val="en-US"/>
+        </w:rPr>
+        <w:t>a stated date</w:t>
+      </w:r>
+      <w:proofErr w:type="gramEnd"/>
+    </w:p>
+    <w:p>
+      <w:pPr>
+        <w:rPr>
+          <w:lang w:val="en-US"/>
+        </w:rPr>
+      </w:pPr>
+      <w:r>
+        <w:rPr>
+          <w:b/>
+          <w:bCs/>
+          <w:lang w:val="en-US"/>
+        </w:rPr>
+        <w:t xml:space="preserve">      And</w:t>
+      </w:r>
+      <w:r>
+        <w:rPr>
+          <w:lang w:val="en-US"/>
+        </w:rPr>
+        <w:t xml:space="preserve"> the reason for the restriction is not known</w:t>
+      </w:r>
+    </w:p>
+    <w:p>
+      <w:pPr>
+        <w:rPr>
+          <w:lang w:val="en-US"/>
+        </w:rPr>
+      </w:pPr>
+      <w:r>
+        <w:rPr>
+          <w:lang w:val="en-US"/>
+        </w:rPr>
+        <w:t xml:space="preserve">      </w:t>
+      </w:r>
+      <w:r>
+        <w:rPr>
+          <w:b/>
+          <w:bCs/>
+          <w:lang w:val="en-US"/>
+        </w:rPr>
+        <w:t>When</w:t>
+      </w:r>
+      <w:r>
+        <w:rPr>
+          <w:lang w:val="en-US"/>
+        </w:rPr>
+        <w:t xml:space="preserve"> staff </w:t>
+      </w:r>
+      <w:proofErr w:type="gramStart"/>
+      <w:r>
+        <w:rPr>
+          <w:lang w:val="en-US"/>
+        </w:rPr>
+        <w:t>member tries</w:t>
+      </w:r>
+      <w:proofErr w:type="gramEnd"/>
+      <w:r>
+        <w:rPr>
+          <w:lang w:val="en-US"/>
+        </w:rPr>
+        <w:t xml:space="preserve"> to record the training room as unavailable without a reason</w:t>
+      </w:r>
+    </w:p>
+    <w:p>
+      <w:pPr>
+        <w:rPr>
+          <w:lang w:val="en-US"/>
+        </w:rPr>
+      </w:pPr>
+      <w:r>
+        <w:rPr>
+          <w:b/>
+          <w:bCs/>
+          <w:lang w:val="en-US"/>
+        </w:rPr>
+        <w:t xml:space="preserve">      Then</w:t>
+      </w:r>
+      <w:r>
+        <w:rPr>
+          <w:lang w:val="en-US"/>
+        </w:rPr>
+        <w:t xml:space="preserve"> training room is not recorded as unavailable</w:t>
+      </w:r>
+    </w:p>
+    <w:p>
+      <w:pPr>
+        <w:rPr>
+          <w:lang w:val="en-US"/>
+        </w:rPr>
+      </w:pPr>
+      <w:r>
+        <w:rPr>
+          <w:lang w:val="en-US"/>
+        </w:rPr>
+        <w:t xml:space="preserve">     </w:t>
+      </w:r>
+      <w:r>
+        <w:rPr>
+          <w:b/>
+          <w:bCs/>
+          <w:lang w:val="en-US"/>
+        </w:rPr>
+        <w:t xml:space="preserve"> And</w:t>
+      </w:r>
+      <w:r>
+        <w:rPr>
+          <w:lang w:val="en-US"/>
+        </w:rPr>
+        <w:t xml:space="preserve"> the staff member must obtain the reason (maintenance, inspection or community event) from the maintenance officer before recording it</w:t>
+      </w:r>
+    </w:p>
+    <w:p>
+      <w:pPr>
+        <w:pStyle w:val="ListParagraph"/>
+        <w:numPr>
+          <w:ilvl w:val="0"/>
+          <w:numId w:val="5"/>
+        </w:numPr>
+        <w:rPr>
+          <w:lang w:val="en-US"/>
+        </w:rPr>
+      </w:pPr>
+    </w:p>
+    <w:p>
+      <w:pPr>
+        <w:rPr>
+          <w:b/>
+          <w:bCs/>
+          <w:lang w:val="en-US"/>
+        </w:rPr>
+      </w:pPr>
+      <w:r>
+        <w:rPr>
+          <w:b/>
+          <w:bCs/>
+          <w:lang w:val="en-US"/>
+        </w:rPr>
+        <w:t>Feature: Record setup time and reset time separately from the activity time and flag an overlap with another booking in the same space</w:t>
+      </w:r>
+    </w:p>
+    <w:p>
+      <w:pPr>
+        <w:rPr>
+          <w:lang w:val="en-US"/>
+        </w:rPr>
+      </w:pPr>
+    </w:p>
+    <w:p>
+      <w:pPr>
+        <w:rPr>
+          <w:b/>
+          <w:bCs/>
+          <w:i/>
+          <w:iCs/>
+          <w:lang w:val="en-US"/>
+        </w:rPr>
+      </w:pPr>
+      <w:r>
+        <w:rPr>
+          <w:b/>
+          <w:bCs/>
+          <w:i/>
+          <w:iCs/>
+          <w:lang w:val="en-US"/>
+        </w:rPr>
+        <w:t xml:space="preserve">  </w:t>
+      </w:r>
+      <w:proofErr w:type="gramStart"/>
+      <w:r>
+        <w:rPr>
+          <w:b/>
+          <w:bCs/>
+          <w:i/>
+          <w:iCs/>
+          <w:lang w:val="en-US"/>
+        </w:rPr>
+        <w:t>@FR6 @P6</w:t>
+      </w:r>
+      <w:proofErr w:type="gramEnd"/>
+    </w:p>
+    <w:p>
+      <w:pPr>
+        <w:rPr>
+          <w:lang w:val="en-US"/>
+        </w:rPr>
+      </w:pPr>
+      <w:r>
+        <w:rPr>
+          <w:lang w:val="en-US"/>
+        </w:rPr>
+        <w:t xml:space="preserve">  </w:t>
+      </w:r>
+      <w:r>
+        <w:rPr>
+          <w:b/>
+          <w:bCs/>
+          <w:lang w:val="en-US"/>
+        </w:rPr>
+        <w:t>Scenario:</w:t>
+      </w:r>
+      <w:r>
+        <w:rPr>
+          <w:lang w:val="en-US"/>
+        </w:rPr>
+        <w:t xml:space="preserve"> Booking that starts during another group's reset time is flagged</w:t>
+      </w:r>
+    </w:p>
+    <w:p>
+      <w:pPr>
+        <w:rPr>
+          <w:lang w:val="en-US"/>
+        </w:rPr>
+      </w:pPr>
+      <w:r>
+        <w:rPr>
+          <w:lang w:val="en-US"/>
+        </w:rPr>
+        <w:t xml:space="preserve">   </w:t>
+      </w:r>
+      <w:r>
+        <w:rPr>
+          <w:b/>
+          <w:bCs/>
+          <w:lang w:val="en-US"/>
+        </w:rPr>
+        <w:t xml:space="preserve"> Given</w:t>
+      </w:r>
+      <w:r>
+        <w:rPr>
+          <w:lang w:val="en-US"/>
+        </w:rPr>
+        <w:t xml:space="preserve"> a club has booked the sports hall from 12:00 to 15:00 on a stated date</w:t>
+      </w:r>
+    </w:p>
+    <w:p>
+      <w:pPr>
+        <w:rPr>
+          <w:lang w:val="en-US"/>
+        </w:rPr>
+      </w:pPr>
+      <w:r>
+        <w:rPr>
+          <w:lang w:val="en-US"/>
+        </w:rPr>
+        <w:t xml:space="preserve">    </w:t>
+      </w:r>
+      <w:r>
+        <w:rPr>
+          <w:b/>
+          <w:bCs/>
+          <w:lang w:val="en-US"/>
+        </w:rPr>
+        <w:t>And</w:t>
+      </w:r>
+      <w:r>
+        <w:rPr>
+          <w:lang w:val="en-US"/>
+        </w:rPr>
+        <w:t xml:space="preserve"> that booking has 30 minutes of reset time after the activity, so the hall is not free until 15:30</w:t>
+      </w:r>
+    </w:p>
+    <w:p>
+      <w:pPr>
+        <w:rPr>
+          <w:lang w:val="en-US"/>
+        </w:rPr>
+      </w:pPr>
+      <w:r>
+        <w:rPr>
+          <w:lang w:val="en-US"/>
+        </w:rPr>
+        <w:t xml:space="preserve">    </w:t>
+      </w:r>
+      <w:r>
+        <w:rPr>
+          <w:b/>
+          <w:bCs/>
+          <w:lang w:val="en-US"/>
+        </w:rPr>
+        <w:t>When</w:t>
+      </w:r>
+      <w:r>
+        <w:rPr>
+          <w:lang w:val="en-US"/>
+        </w:rPr>
+        <w:t xml:space="preserve"> a staff member records a second booking for the sports hall on the same date starting at 15:15</w:t>
+      </w:r>
+    </w:p>
+    <w:p>
+      <w:pPr>
+        <w:rPr>
+          <w:lang w:val="en-US"/>
+        </w:rPr>
+      </w:pPr>
+      <w:r>
+        <w:rPr>
+          <w:lang w:val="en-US"/>
+        </w:rPr>
+        <w:t xml:space="preserve">    </w:t>
+      </w:r>
+      <w:r>
+        <w:rPr>
+          <w:b/>
+          <w:bCs/>
+          <w:lang w:val="en-US"/>
+        </w:rPr>
+        <w:t>Then</w:t>
+      </w:r>
+      <w:r>
+        <w:rPr>
+          <w:lang w:val="en-US"/>
+        </w:rPr>
+        <w:t xml:space="preserve"> the second booking is flagged as overlapping the first booking's reset time</w:t>
+      </w:r>
+    </w:p>
+    <w:p>
+      <w:pPr>
+        <w:rPr>
+          <w:lang w:val="en-US"/>
+        </w:rPr>
+      </w:pPr>
+      <w:r>
+        <w:rPr>
+          <w:lang w:val="en-US"/>
+        </w:rPr>
+        <w:t xml:space="preserve">    </w:t>
+      </w:r>
+      <w:r>
+        <w:rPr>
+          <w:b/>
+          <w:bCs/>
+          <w:lang w:val="en-US"/>
+        </w:rPr>
+        <w:t>And</w:t>
+      </w:r>
+      <w:r>
+        <w:rPr>
+          <w:lang w:val="en-US"/>
+        </w:rPr>
+        <w:t xml:space="preserve"> the setup and reset time of the first booking is shown separately from its activity time</w:t>
+      </w:r>
+    </w:p>
+    <w:p>
+      <w:pPr>
+        <w:rPr>
+          <w:lang w:val="en-US"/>
+        </w:rPr>
+      </w:pPr>
+      <w:r>
+        <w:rPr>
+          <w:lang w:val="en-US"/>
+        </w:rPr>
+        <w:t xml:space="preserve">    </w:t>
+      </w:r>
+      <w:r>
+        <w:rPr>
+          <w:b/>
+          <w:bCs/>
+          <w:lang w:val="en-US"/>
+        </w:rPr>
+        <w:t xml:space="preserve">And </w:t>
+      </w:r>
+      <w:r>
+        <w:rPr>
+          <w:lang w:val="en-US"/>
+        </w:rPr>
+        <w:t>a booking for the sports hall starting at 15:30 is not flagged as an overlap</w:t>
+      </w:r>
+    </w:p>
+    <w:p>
+      <w:pPr>
+        <w:pStyle w:val="ListParagraph"/>
+        <w:numPr>
+          <w:ilvl w:val="0"/>
+          <w:numId w:val="5"/>
+        </w:numPr>
+        <w:rPr>
+          <w:lang w:val="en-US"/>
+        </w:rPr>
+      </w:pPr>
+    </w:p>
+    <w:p>
+      <w:pPr>
+        <w:rPr>
+          <w:b/>
+          <w:bCs/>
+          <w:lang w:val="en-US"/>
+        </w:rPr>
+      </w:pPr>
+      <w:r>
+        <w:rPr>
+          <w:b/>
+          <w:bCs/>
+          <w:lang w:val="en-US"/>
+        </w:rPr>
+        <w:t>Feature: Mark each booking as provisional or confirmed and link the dates of a recurring block</w:t>
+      </w:r>
+    </w:p>
+    <w:p>
+      <w:pPr>
+        <w:rPr>
+          <w:lang w:val="en-US"/>
+        </w:rPr>
+      </w:pPr>
+    </w:p>
+    <w:p>
+      <w:pPr>
+        <w:rPr>
+          <w:b/>
+          <w:bCs/>
+          <w:i/>
+          <w:iCs/>
+          <w:lang w:val="en-US"/>
+        </w:rPr>
+      </w:pPr>
+      <w:r>
+        <w:rPr>
+          <w:b/>
+          <w:bCs/>
+          <w:i/>
+          <w:iCs/>
+          <w:lang w:val="en-US"/>
+        </w:rPr>
+        <w:lastRenderedPageBreak/>
+        <w:t xml:space="preserve">  </w:t>
+      </w:r>
+      <w:proofErr w:type="gramStart"/>
+      <w:r>
+        <w:rPr>
+          <w:b/>
+          <w:bCs/>
+          <w:i/>
+          <w:iCs/>
+          <w:lang w:val="en-US"/>
+        </w:rPr>
+        <w:t>@FR7 @P5</w:t>
+      </w:r>
+      <w:proofErr w:type="gramEnd"/>
+    </w:p>
+    <w:p>
+      <w:pPr>
+        <w:rPr>
+          <w:lang w:val="en-US"/>
+        </w:rPr>
+      </w:pPr>
+      <w:r>
+        <w:rPr>
+          <w:lang w:val="en-US"/>
+        </w:rPr>
+        <w:t xml:space="preserve">  </w:t>
+      </w:r>
+      <w:r>
+        <w:rPr>
+          <w:b/>
+          <w:bCs/>
+          <w:lang w:val="en-US"/>
+        </w:rPr>
+        <w:t xml:space="preserve">Scenario: </w:t>
+      </w:r>
+      <w:r>
+        <w:rPr>
+          <w:lang w:val="en-US"/>
+        </w:rPr>
+        <w:t>Confirming one date of a recurring block leaves the other dates provisional</w:t>
+      </w:r>
+    </w:p>
+    <w:p>
+      <w:pPr>
+        <w:rPr>
+          <w:lang w:val="en-US"/>
+        </w:rPr>
+      </w:pPr>
+      <w:r>
+        <w:rPr>
+          <w:lang w:val="en-US"/>
+        </w:rPr>
+        <w:t xml:space="preserve">    </w:t>
+      </w:r>
+      <w:r>
+        <w:rPr>
+          <w:b/>
+          <w:bCs/>
+          <w:lang w:val="en-US"/>
+        </w:rPr>
+        <w:t>Given</w:t>
+      </w:r>
+      <w:r>
+        <w:rPr>
+          <w:lang w:val="en-US"/>
+        </w:rPr>
+        <w:t xml:space="preserve"> a school has requested a recurring block for the training room on four dates</w:t>
+      </w:r>
+    </w:p>
+    <w:p>
+      <w:pPr>
+        <w:rPr>
+          <w:lang w:val="en-US"/>
+        </w:rPr>
+      </w:pPr>
+      <w:r>
+        <w:rPr>
+          <w:lang w:val="en-US"/>
+        </w:rPr>
+        <w:t xml:space="preserve">    </w:t>
+      </w:r>
+      <w:r>
+        <w:rPr>
+          <w:b/>
+          <w:bCs/>
+          <w:lang w:val="en-US"/>
+        </w:rPr>
+        <w:t>And</w:t>
+      </w:r>
+      <w:r>
+        <w:rPr>
+          <w:lang w:val="en-US"/>
+        </w:rPr>
+        <w:t xml:space="preserve"> all four dates are recorded as provisional and linked as one block of bookings</w:t>
+      </w:r>
+    </w:p>
+    <w:p>
+      <w:pPr>
+        <w:rPr>
+          <w:lang w:val="en-US"/>
+        </w:rPr>
+      </w:pPr>
+      <w:r>
+        <w:rPr>
+          <w:lang w:val="en-US"/>
+        </w:rPr>
+        <w:t xml:space="preserve">    </w:t>
+      </w:r>
+      <w:r>
+        <w:rPr>
+          <w:b/>
+          <w:bCs/>
+          <w:lang w:val="en-US"/>
+        </w:rPr>
+        <w:t>When</w:t>
+      </w:r>
+      <w:r>
+        <w:rPr>
+          <w:lang w:val="en-US"/>
+        </w:rPr>
+        <w:t xml:space="preserve"> a staff member confirms the booking for the first date</w:t>
+      </w:r>
+    </w:p>
+    <w:p>
+      <w:pPr>
+        <w:rPr>
+          <w:lang w:val="en-US"/>
+        </w:rPr>
+      </w:pPr>
+      <w:r>
+        <w:rPr>
+          <w:lang w:val="en-US"/>
+        </w:rPr>
+        <w:t xml:space="preserve">    </w:t>
+      </w:r>
+      <w:r>
+        <w:rPr>
+          <w:b/>
+          <w:bCs/>
+          <w:lang w:val="en-US"/>
+        </w:rPr>
+        <w:t>Then</w:t>
+      </w:r>
+      <w:r>
+        <w:rPr>
+          <w:lang w:val="en-US"/>
+        </w:rPr>
+        <w:t xml:space="preserve"> the first date is shown as confirmed</w:t>
+      </w:r>
+    </w:p>
+    <w:p>
+      <w:pPr>
+        <w:rPr>
+          <w:lang w:val="en-US"/>
+        </w:rPr>
+      </w:pPr>
+      <w:r>
+        <w:rPr>
+          <w:lang w:val="en-US"/>
+        </w:rPr>
+        <w:t xml:space="preserve">    </w:t>
+      </w:r>
+      <w:r>
+        <w:rPr>
+          <w:b/>
+          <w:bCs/>
+          <w:lang w:val="en-US"/>
+        </w:rPr>
+        <w:t>And</w:t>
+      </w:r>
+      <w:r>
+        <w:rPr>
+          <w:lang w:val="en-US"/>
+        </w:rPr>
+        <w:t xml:space="preserve"> the other three dates are still shown as provisional</w:t>
+      </w:r>
+    </w:p>
+    <w:p>
+      <w:pPr>
+        <w:rPr>
+          <w:lang w:val="en-US"/>
+        </w:rPr>
+      </w:pPr>
+      <w:r>
+        <w:rPr>
+          <w:b/>
+          <w:bCs/>
+          <w:lang w:val="en-US"/>
+        </w:rPr>
+        <w:t xml:space="preserve">    And</w:t>
+      </w:r>
+      <w:r>
+        <w:rPr>
+          <w:lang w:val="en-US"/>
+        </w:rPr>
+        <w:t xml:space="preserve"> all four dates are still shown as part of the same block</w:t>
+      </w:r>
     </w:p>
     <w:sectPr>
       <w:pgSz w:w="11906" w:h="16838"/>
@@ -23689,7 +25561,7 @@
   <w:abstractNum w:abstractNumId="8" w15:restartNumberingAfterBreak="0">
     <w:nsid w:val="4E8A4D7D"/>
     <w:multiLevelType w:val="multilevel"/>
-    <w:tmpl w:val="E0F6D77A"/>
+    <w:tmpl w:val="E2685908"/>
     <w:lvl w:ilvl="0">
       <w:start w:val="1"/>
       <w:numFmt w:val="bullet"/>
@@ -23706,20 +25578,16 @@
         <w:sz w:val="20"/>
       </w:rPr>
     </w:lvl>
-    <w:lvl w:ilvl="1" w:tentative="1">
+    <w:lvl w:ilvl="1">
       <w:start w:val="1"/>
-      <w:numFmt w:val="bullet"/>
-      <w:lvlText w:val=""/>
+      <w:numFmt w:val="decimal"/>
+      <w:lvlText w:val="%2."/>
       <w:lvlJc w:val="left"/>
       <w:pPr>
-        <w:tabs>
-          <w:tab w:val="num" w:pos="1440"/>
-        </w:tabs>
         <w:ind w:left="1440" w:hanging="360"/>
       </w:pPr>
       <w:rPr>
-        <w:rFonts w:ascii="Symbol" w:hAnsi="Symbol" w:hint="default"/>
-        <w:sz w:val="20"/>
+        <w:rFonts w:hint="default"/>
       </w:rPr>
     </w:lvl>
     <w:lvl w:ilvl="2" w:tentative="1">

</xml_diff>

<commit_message>
Started creating user stories
Signed-off-by: Student Sofiia Fedchuk (TL_KCOMP_B_Y3) <t00264753@mymtu.ie>
</commit_message>
<xml_diff>
--- a/report/report.docx
+++ b/report/report.docx
@@ -719,16 +719,14 @@
               </w:rPr>
               <w:t xml:space="preserve">receive contradicting information </w:t>
             </w:r>
-            <w:proofErr w:type="gramStart"/>
-            <w:r>
-              <w:rPr>
-                <w:rFonts w:ascii="Times New Roman" w:eastAsia="Times New Roman" w:hAnsi="Times New Roman" w:cs="Times New Roman"/>
-                <w:sz w:val="28"/>
-                <w:szCs w:val="28"/>
-              </w:rPr>
-              <w:t>about  closure</w:t>
-            </w:r>
-            <w:proofErr w:type="gramEnd"/>
+            <w:r>
+              <w:rPr>
+                <w:rFonts w:ascii="Times New Roman" w:eastAsia="Times New Roman" w:hAnsi="Times New Roman" w:cs="Times New Roman"/>
+                <w:sz w:val="28"/>
+                <w:szCs w:val="28"/>
+              </w:rPr>
+              <w:t>about closure</w:t>
+            </w:r>
             <w:r>
               <w:rPr>
                 <w:rFonts w:ascii="Times New Roman" w:eastAsia="Times New Roman" w:hAnsi="Times New Roman" w:cs="Times New Roman"/>
@@ -23324,15 +23322,7 @@
               </w:rPr>
             </w:pPr>
             <w:r>
-              <w:t xml:space="preserve">If the date/time range or reason for restriction is missing, the restriction is not </w:t>
-            </w:r>
-            <w:proofErr w:type="gramStart"/>
-            <w:r>
-              <w:t>recorded</w:t>
-            </w:r>
-            <w:proofErr w:type="gramEnd"/>
-            <w:r>
-              <w:t xml:space="preserve"> and the staff member must obtain the detail first.</w:t>
+              <w:t>If the date/time range or reason for restriction is missing, the restriction is not recorded and the staff member must obtain the detail first.</w:t>
             </w:r>
             <w:r>
               <w:rPr>
@@ -23602,21 +23592,7 @@
         <w:rPr>
           <w:lang w:val="en-US"/>
         </w:rPr>
-        <w:t xml:space="preserve">    Given </w:t>
-      </w:r>
-      <w:proofErr w:type="gramStart"/>
-      <w:r>
-        <w:rPr>
-          <w:lang w:val="en-US"/>
-        </w:rPr>
-        <w:t>a facility</w:t>
-      </w:r>
-      <w:proofErr w:type="gramEnd"/>
-      <w:r>
-        <w:rPr>
-          <w:lang w:val="en-US"/>
-        </w:rPr>
-        <w:t xml:space="preserve"> has a sports hall, training room and pitch and each of them can be booked</w:t>
+        <w:t xml:space="preserve">    Given a facility has a sports hall, training room and pitch and each of them can be booked</w:t>
       </w:r>
     </w:p>
     <w:p>
@@ -23670,7 +23646,6 @@
         </w:rPr>
         <w:t xml:space="preserve">    </w:t>
       </w:r>
-      <w:proofErr w:type="gramStart"/>
       <w:r>
         <w:rPr>
           <w:b/>
@@ -23681,7 +23656,6 @@
         </w:rPr>
         <w:t>@FR1 @P1</w:t>
       </w:r>
-      <w:proofErr w:type="gramEnd"/>
     </w:p>
     <w:p>
       <w:pPr>
@@ -23907,7 +23881,6 @@
         </w:rPr>
         <w:t xml:space="preserve">    </w:t>
       </w:r>
-      <w:proofErr w:type="gramStart"/>
       <w:r>
         <w:rPr>
           <w:b/>
@@ -23918,7 +23891,6 @@
         </w:rPr>
         <w:t>@FR1 @P1</w:t>
       </w:r>
-      <w:proofErr w:type="gramEnd"/>
     </w:p>
     <w:p>
       <w:pPr>
@@ -23965,16 +23937,8 @@
         <w:rPr>
           <w:lang w:val="en-US"/>
         </w:rPr>
-        <w:t xml:space="preserve"> a staff member has been told that the training room will be out of service from 10:00 to 12:00 on </w:t>
-      </w:r>
-      <w:proofErr w:type="gramStart"/>
-      <w:r>
-        <w:rPr>
-          <w:lang w:val="en-US"/>
-        </w:rPr>
-        <w:t>a stated date</w:t>
-      </w:r>
-      <w:proofErr w:type="gramEnd"/>
+        <w:t xml:space="preserve"> a staff member has been told that the training room will be out of service from 10:00 to 12:00 on a stated date</w:t>
+      </w:r>
     </w:p>
     <w:p>
       <w:pPr>
@@ -24021,21 +23985,7 @@
         <w:rPr>
           <w:lang w:val="en-US"/>
         </w:rPr>
-        <w:t xml:space="preserve"> staff </w:t>
-      </w:r>
-      <w:proofErr w:type="gramStart"/>
-      <w:r>
-        <w:rPr>
-          <w:lang w:val="en-US"/>
-        </w:rPr>
-        <w:t>member tries</w:t>
-      </w:r>
-      <w:proofErr w:type="gramEnd"/>
-      <w:r>
-        <w:rPr>
-          <w:lang w:val="en-US"/>
-        </w:rPr>
-        <w:t xml:space="preserve"> to record the training room as unavailable without a reason</w:t>
+        <w:t xml:space="preserve"> staff member tries to record the training room as unavailable without a reason</w:t>
       </w:r>
     </w:p>
     <w:p>
@@ -24140,20 +24090,8 @@
           <w:iCs/>
           <w:lang w:val="en-US"/>
         </w:rPr>
-        <w:t xml:space="preserve">  </w:t>
-      </w:r>
-      <w:proofErr w:type="gramStart"/>
-      <w:r>
-        <w:rPr>
-          <w:b/>
-          <w:bCs/>
-          <w:i/>
-          <w:iCs/>
-          <w:lang w:val="en-US"/>
-        </w:rPr>
-        <w:t>@FR6 @P6</w:t>
-      </w:r>
-      <w:proofErr w:type="gramEnd"/>
+        <w:t xml:space="preserve">  @FR6 @P6</w:t>
+      </w:r>
     </w:p>
     <w:p>
       <w:pPr>
@@ -24399,20 +24337,8 @@
           <w:lang w:val="en-US"/>
         </w:rPr>
         <w:lastRenderedPageBreak/>
-        <w:t xml:space="preserve">  </w:t>
-      </w:r>
-      <w:proofErr w:type="gramStart"/>
-      <w:r>
-        <w:rPr>
-          <w:b/>
-          <w:bCs/>
-          <w:i/>
-          <w:iCs/>
-          <w:lang w:val="en-US"/>
-        </w:rPr>
-        <w:t>@FR7 @P5</w:t>
-      </w:r>
-      <w:proofErr w:type="gramEnd"/>
+        <w:t xml:space="preserve">  @FR7 @P5</w:t>
+      </w:r>
     </w:p>
     <w:p>
       <w:pPr>
@@ -24596,6 +24522,686 @@
         </w:rPr>
         <w:t xml:space="preserve"> all four dates are still shown as part of the same block</w:t>
       </w:r>
+    </w:p>
+    <w:p>
+      <w:pPr>
+        <w:rPr>
+          <w:lang w:val="en-US"/>
+        </w:rPr>
+      </w:pPr>
+    </w:p>
+    <w:p>
+      <w:pPr>
+        <w:pStyle w:val="Heading1"/>
+        <w:rPr>
+          <w:lang w:val="en-US"/>
+        </w:rPr>
+      </w:pPr>
+      <w:r>
+        <w:rPr>
+          <w:lang w:val="en-US"/>
+        </w:rPr>
+        <w:t>User stories:</w:t>
+      </w:r>
+    </w:p>
+    <w:p>
+      <w:pPr>
+        <w:pStyle w:val="Heading2"/>
+        <w:rPr>
+          <w:lang w:val="en-US"/>
+        </w:rPr>
+      </w:pPr>
+      <w:r>
+        <w:rPr>
+          <w:lang w:val="en-US"/>
+        </w:rPr>
+        <w:t>User story 1:</w:t>
+      </w:r>
+    </w:p>
+    <w:p>
+      <w:pPr>
+        <w:rPr>
+          <w:lang w:val="en-US"/>
+        </w:rPr>
+      </w:pPr>
+      <w:r>
+        <w:rPr>
+          <w:lang w:val="en-US"/>
+        </w:rPr>
+        <w:t xml:space="preserve">001 </w:t>
+      </w:r>
+      <w:r>
+        <w:rPr>
+          <w:lang w:val="en-US"/>
+        </w:rPr>
+        <w:t>– Book available space in facility</w:t>
+      </w:r>
+    </w:p>
+    <w:p>
+      <w:pPr>
+        <w:rPr>
+          <w:lang w:val="en-US"/>
+        </w:rPr>
+      </w:pPr>
+      <w:r>
+        <w:rPr>
+          <w:lang w:val="en-US"/>
+        </w:rPr>
+        <w:t xml:space="preserve">As </w:t>
+      </w:r>
+      <w:r>
+        <w:rPr>
+          <w:lang w:val="en-US"/>
+        </w:rPr>
+        <w:t xml:space="preserve">a </w:t>
+      </w:r>
+      <w:r>
+        <w:rPr>
+          <w:lang w:val="en-US"/>
+        </w:rPr>
+        <w:t>group we</w:t>
+      </w:r>
+      <w:r>
+        <w:rPr>
+          <w:lang w:val="en-US"/>
+        </w:rPr>
+        <w:t xml:space="preserve"> want </w:t>
+      </w:r>
+      <w:r>
+        <w:rPr>
+          <w:lang w:val="en-US"/>
+        </w:rPr>
+        <w:t>to book available space in facility in specific time frame and for specific date</w:t>
+      </w:r>
+      <w:r>
+        <w:rPr>
+          <w:lang w:val="en-US"/>
+        </w:rPr>
+        <w:t xml:space="preserve">, so that </w:t>
+      </w:r>
+      <w:r>
+        <w:rPr>
+          <w:lang w:val="en-US"/>
+        </w:rPr>
+        <w:t>we can perform sport activities in this space</w:t>
+      </w:r>
+      <w:r>
+        <w:rPr>
+          <w:lang w:val="en-US"/>
+        </w:rPr>
+        <w:t>.</w:t>
+      </w:r>
+    </w:p>
+    <w:p>
+      <w:pPr>
+        <w:rPr>
+          <w:lang w:val="en-US"/>
+        </w:rPr>
+      </w:pPr>
+      <w:r>
+        <w:rPr>
+          <w:lang w:val="en-US"/>
+        </w:rPr>
+        <w:t>Business value:</w:t>
+      </w:r>
+      <w:r>
+        <w:rPr>
+          <w:lang w:val="en-US"/>
+        </w:rPr>
+        <w:t xml:space="preserve"> </w:t>
+      </w:r>
+      <w:r>
+        <w:t>Groups can get a space for their activity without clashing with another group’s booking or</w:t>
+      </w:r>
+      <w:r>
+        <w:t xml:space="preserve"> booking unavailable space</w:t>
+      </w:r>
+      <w:r>
+        <w:t>. Staff process requests against records they can trust, so fewer bookings overlap.</w:t>
+      </w:r>
+    </w:p>
+    <w:p>
+      <w:pPr>
+        <w:rPr>
+          <w:lang w:val="en-US"/>
+        </w:rPr>
+      </w:pPr>
+      <w:r>
+        <w:rPr>
+          <w:lang w:val="en-US"/>
+        </w:rPr>
+        <w:t>Stakeholder goal:</w:t>
+      </w:r>
+      <w:r>
+        <w:t xml:space="preserve"> </w:t>
+      </w:r>
+      <w:r>
+        <w:t>Request a booking of a space and receive a decision and confirmation of the booking</w:t>
+      </w:r>
+    </w:p>
+    <w:p>
+      <w:pPr>
+        <w:rPr>
+          <w:lang w:val="en-US"/>
+        </w:rPr>
+      </w:pPr>
+      <w:r>
+        <w:rPr>
+          <w:lang w:val="en-US"/>
+        </w:rPr>
+        <w:t>Related to:</w:t>
+      </w:r>
+    </w:p>
+    <w:p>
+      <w:pPr>
+        <w:rPr>
+          <w:lang w:val="en-US"/>
+        </w:rPr>
+      </w:pPr>
+      <w:proofErr w:type="spellStart"/>
+      <w:r>
+        <w:rPr>
+          <w:lang w:val="en-US"/>
+        </w:rPr>
+        <w:t>MoSCoW</w:t>
+      </w:r>
+      <w:proofErr w:type="spellEnd"/>
+      <w:r>
+        <w:rPr>
+          <w:lang w:val="en-US"/>
+        </w:rPr>
+        <w:t>:</w:t>
+      </w:r>
+      <w:r>
+        <w:rPr>
+          <w:lang w:val="en-US"/>
+        </w:rPr>
+        <w:t xml:space="preserve"> Must</w:t>
+      </w:r>
+    </w:p>
+    <w:p>
+      <w:pPr>
+        <w:rPr>
+          <w:lang w:val="en-US"/>
+        </w:rPr>
+      </w:pPr>
+      <w:r>
+        <w:rPr>
+          <w:lang w:val="en-US"/>
+        </w:rPr>
+        <w:t>Acceptance criteria:</w:t>
+      </w:r>
+    </w:p>
+    <w:p>
+      <w:pPr>
+        <w:pStyle w:val="Heading2"/>
+        <w:rPr>
+          <w:lang w:val="en-US"/>
+        </w:rPr>
+      </w:pPr>
+      <w:r>
+        <w:rPr>
+          <w:lang w:val="en-US"/>
+        </w:rPr>
+        <w:t>User story 2:</w:t>
+      </w:r>
+    </w:p>
+    <w:p>
+      <w:pPr>
+        <w:rPr>
+          <w:lang w:val="en-US"/>
+        </w:rPr>
+      </w:pPr>
+      <w:r>
+        <w:rPr>
+          <w:lang w:val="en-US"/>
+        </w:rPr>
+        <w:t>00</w:t>
+      </w:r>
+      <w:r>
+        <w:rPr>
+          <w:lang w:val="en-US"/>
+        </w:rPr>
+        <w:t>2</w:t>
+      </w:r>
+      <w:r>
+        <w:rPr>
+          <w:lang w:val="en-US"/>
+        </w:rPr>
+        <w:t xml:space="preserve"> – Book available </w:t>
+      </w:r>
+      <w:r>
+        <w:rPr>
+          <w:lang w:val="en-US"/>
+        </w:rPr>
+        <w:t>equipment</w:t>
+      </w:r>
+      <w:r>
+        <w:rPr>
+          <w:lang w:val="en-US"/>
+        </w:rPr>
+        <w:t xml:space="preserve"> in facility</w:t>
+      </w:r>
+    </w:p>
+    <w:p>
+      <w:pPr>
+        <w:rPr>
+          <w:lang w:val="en-US"/>
+        </w:rPr>
+      </w:pPr>
+      <w:r>
+        <w:rPr>
+          <w:lang w:val="en-US"/>
+        </w:rPr>
+        <w:t xml:space="preserve">As a </w:t>
+      </w:r>
+      <w:r>
+        <w:rPr>
+          <w:lang w:val="en-US"/>
+        </w:rPr>
+        <w:t>group we</w:t>
+      </w:r>
+      <w:r>
+        <w:rPr>
+          <w:lang w:val="en-US"/>
+        </w:rPr>
+        <w:t xml:space="preserve"> want </w:t>
+      </w:r>
+      <w:r>
+        <w:rPr>
+          <w:lang w:val="en-US"/>
+        </w:rPr>
+        <w:t xml:space="preserve">to book </w:t>
+      </w:r>
+      <w:r>
+        <w:rPr>
+          <w:lang w:val="en-US"/>
+        </w:rPr>
+        <w:t>equipment</w:t>
+      </w:r>
+      <w:r>
+        <w:rPr>
+          <w:lang w:val="en-US"/>
+        </w:rPr>
+        <w:t xml:space="preserve"> in facility in specific time frame and for specific date</w:t>
+      </w:r>
+      <w:r>
+        <w:rPr>
+          <w:lang w:val="en-US"/>
+        </w:rPr>
+        <w:t xml:space="preserve">, so that </w:t>
+      </w:r>
+      <w:r>
+        <w:rPr>
+          <w:lang w:val="en-US"/>
+        </w:rPr>
+        <w:t>we can perform sport activities</w:t>
+      </w:r>
+      <w:r>
+        <w:rPr>
+          <w:lang w:val="en-US"/>
+        </w:rPr>
+        <w:t xml:space="preserve"> with this equipment</w:t>
+      </w:r>
+      <w:r>
+        <w:rPr>
+          <w:lang w:val="en-US"/>
+        </w:rPr>
+        <w:t xml:space="preserve"> in this space</w:t>
+      </w:r>
+      <w:r>
+        <w:rPr>
+          <w:lang w:val="en-US"/>
+        </w:rPr>
+        <w:t>.</w:t>
+      </w:r>
+    </w:p>
+    <w:p>
+      <w:pPr>
+        <w:rPr>
+          <w:lang w:val="en-US"/>
+        </w:rPr>
+      </w:pPr>
+      <w:r>
+        <w:rPr>
+          <w:lang w:val="en-US"/>
+        </w:rPr>
+        <w:t xml:space="preserve">Business value: </w:t>
+      </w:r>
+      <w:r>
+        <w:t xml:space="preserve">Groups can get </w:t>
+      </w:r>
+      <w:r>
+        <w:t>equipment</w:t>
+      </w:r>
+      <w:r>
+        <w:t xml:space="preserve"> for their activity without </w:t>
+      </w:r>
+      <w:r>
+        <w:t xml:space="preserve">booking unavailable </w:t>
+      </w:r>
+      <w:proofErr w:type="spellStart"/>
+      <w:r>
+        <w:t>euipment</w:t>
+      </w:r>
+      <w:proofErr w:type="spellEnd"/>
+      <w:r>
+        <w:t>. Staff process requests against records they can trust.</w:t>
+      </w:r>
+    </w:p>
+    <w:p>
+      <w:pPr>
+        <w:rPr>
+          <w:lang w:val="en-US"/>
+        </w:rPr>
+      </w:pPr>
+      <w:r>
+        <w:rPr>
+          <w:lang w:val="en-US"/>
+        </w:rPr>
+        <w:lastRenderedPageBreak/>
+        <w:t>Stakeholder goal:</w:t>
+      </w:r>
+      <w:r>
+        <w:t xml:space="preserve"> Request a booking of </w:t>
+      </w:r>
+      <w:r>
+        <w:rPr>
+          <w:lang w:val="en-US"/>
+        </w:rPr>
+        <w:t>equipment</w:t>
+      </w:r>
+      <w:r>
+        <w:t xml:space="preserve"> </w:t>
+      </w:r>
+      <w:r>
+        <w:t>and receive a decision and confirmation of the booking</w:t>
+      </w:r>
+    </w:p>
+    <w:p>
+      <w:pPr>
+        <w:rPr>
+          <w:lang w:val="en-US"/>
+        </w:rPr>
+      </w:pPr>
+      <w:r>
+        <w:rPr>
+          <w:lang w:val="en-US"/>
+        </w:rPr>
+        <w:t>Related to:</w:t>
+      </w:r>
+    </w:p>
+    <w:p>
+      <w:pPr>
+        <w:rPr>
+          <w:lang w:val="en-US"/>
+        </w:rPr>
+      </w:pPr>
+      <w:proofErr w:type="spellStart"/>
+      <w:r>
+        <w:rPr>
+          <w:lang w:val="en-US"/>
+        </w:rPr>
+        <w:t>MoSCoW</w:t>
+      </w:r>
+      <w:proofErr w:type="spellEnd"/>
+      <w:r>
+        <w:rPr>
+          <w:lang w:val="en-US"/>
+        </w:rPr>
+        <w:t>: Must</w:t>
+      </w:r>
+    </w:p>
+    <w:p>
+      <w:pPr>
+        <w:rPr>
+          <w:lang w:val="en-US"/>
+        </w:rPr>
+      </w:pPr>
+      <w:r>
+        <w:rPr>
+          <w:lang w:val="en-US"/>
+        </w:rPr>
+        <w:t>Acceptance criteria:</w:t>
+      </w:r>
+    </w:p>
+    <w:p>
+      <w:pPr>
+        <w:pStyle w:val="Heading2"/>
+        <w:rPr>
+          <w:lang w:val="en-US"/>
+        </w:rPr>
+      </w:pPr>
+      <w:r>
+        <w:rPr>
+          <w:lang w:val="en-US"/>
+        </w:rPr>
+        <w:t>User story 3:</w:t>
+      </w:r>
+    </w:p>
+    <w:p>
+      <w:pPr>
+        <w:rPr>
+          <w:lang w:val="en-US"/>
+        </w:rPr>
+      </w:pPr>
+      <w:r>
+        <w:rPr>
+          <w:lang w:val="en-US"/>
+        </w:rPr>
+        <w:t>00</w:t>
+      </w:r>
+      <w:r>
+        <w:rPr>
+          <w:lang w:val="en-US"/>
+        </w:rPr>
+        <w:t>3</w:t>
+      </w:r>
+      <w:r>
+        <w:rPr>
+          <w:lang w:val="en-US"/>
+        </w:rPr>
+        <w:t xml:space="preserve"> – </w:t>
+      </w:r>
+      <w:r>
+        <w:rPr>
+          <w:lang w:val="en-US"/>
+        </w:rPr>
+        <w:t>Record</w:t>
+      </w:r>
+      <w:r>
+        <w:rPr>
+          <w:lang w:val="en-US"/>
+        </w:rPr>
+        <w:t xml:space="preserve"> </w:t>
+      </w:r>
+      <w:r>
+        <w:rPr>
+          <w:lang w:val="en-US"/>
+        </w:rPr>
+        <w:t>una</w:t>
+      </w:r>
+      <w:r>
+        <w:rPr>
+          <w:lang w:val="en-US"/>
+        </w:rPr>
+        <w:t>vailable space in facility</w:t>
+      </w:r>
+    </w:p>
+    <w:p>
+      <w:pPr>
+        <w:rPr>
+          <w:lang w:val="en-US"/>
+        </w:rPr>
+      </w:pPr>
+      <w:r>
+        <w:rPr>
+          <w:lang w:val="en-US"/>
+        </w:rPr>
+        <w:t xml:space="preserve">As a </w:t>
+      </w:r>
+      <w:r>
+        <w:rPr>
+          <w:lang w:val="en-US"/>
+        </w:rPr>
+        <w:t>staff member</w:t>
+      </w:r>
+      <w:r>
+        <w:rPr>
+          <w:lang w:val="en-US"/>
+        </w:rPr>
+        <w:t xml:space="preserve"> </w:t>
+      </w:r>
+      <w:r>
+        <w:rPr>
+          <w:lang w:val="en-US"/>
+        </w:rPr>
+        <w:t xml:space="preserve">I </w:t>
+      </w:r>
+      <w:r>
+        <w:rPr>
+          <w:lang w:val="en-US"/>
+        </w:rPr>
+        <w:t xml:space="preserve">want </w:t>
+      </w:r>
+      <w:r>
+        <w:rPr>
+          <w:lang w:val="en-US"/>
+        </w:rPr>
+        <w:t xml:space="preserve">to </w:t>
+      </w:r>
+      <w:r>
+        <w:rPr>
+          <w:lang w:val="en-US"/>
+        </w:rPr>
+        <w:t>record</w:t>
+      </w:r>
+      <w:r>
+        <w:rPr>
+          <w:lang w:val="en-US"/>
+        </w:rPr>
+        <w:t xml:space="preserve"> </w:t>
+      </w:r>
+      <w:r>
+        <w:rPr>
+          <w:lang w:val="en-US"/>
+        </w:rPr>
+        <w:t>un</w:t>
+      </w:r>
+      <w:r>
+        <w:rPr>
+          <w:lang w:val="en-US"/>
+        </w:rPr>
+        <w:t>available space in facility in specific time frame and for specific date</w:t>
+      </w:r>
+      <w:r>
+        <w:rPr>
+          <w:lang w:val="en-US"/>
+        </w:rPr>
+        <w:t xml:space="preserve">, so that </w:t>
+      </w:r>
+      <w:r>
+        <w:rPr>
+          <w:lang w:val="en-US"/>
+        </w:rPr>
+        <w:t>maintenance, inspection or community event can be performed</w:t>
+      </w:r>
+      <w:r>
+        <w:rPr>
+          <w:lang w:val="en-US"/>
+        </w:rPr>
+        <w:t>.</w:t>
+      </w:r>
+    </w:p>
+    <w:p>
+      <w:pPr>
+        <w:rPr>
+          <w:lang w:val="en-US"/>
+        </w:rPr>
+      </w:pPr>
+      <w:r>
+        <w:rPr>
+          <w:lang w:val="en-US"/>
+        </w:rPr>
+        <w:t xml:space="preserve">Business value: </w:t>
+      </w:r>
+    </w:p>
+    <w:p>
+      <w:pPr>
+        <w:rPr>
+          <w:lang w:val="en-US"/>
+        </w:rPr>
+      </w:pPr>
+      <w:r>
+        <w:rPr>
+          <w:lang w:val="en-US"/>
+        </w:rPr>
+        <w:t>Stakeholder goal:</w:t>
+      </w:r>
+      <w:r>
+        <w:t xml:space="preserve"> </w:t>
+      </w:r>
+    </w:p>
+    <w:p>
+      <w:pPr>
+        <w:rPr>
+          <w:lang w:val="en-US"/>
+        </w:rPr>
+      </w:pPr>
+      <w:r>
+        <w:rPr>
+          <w:lang w:val="en-US"/>
+        </w:rPr>
+        <w:t>Related to:</w:t>
+      </w:r>
+    </w:p>
+    <w:p>
+      <w:pPr>
+        <w:rPr>
+          <w:lang w:val="en-US"/>
+        </w:rPr>
+      </w:pPr>
+      <w:proofErr w:type="spellStart"/>
+      <w:r>
+        <w:rPr>
+          <w:lang w:val="en-US"/>
+        </w:rPr>
+        <w:t>MoSCoW</w:t>
+      </w:r>
+      <w:proofErr w:type="spellEnd"/>
+      <w:r>
+        <w:rPr>
+          <w:lang w:val="en-US"/>
+        </w:rPr>
+        <w:t>: Must</w:t>
+      </w:r>
+    </w:p>
+    <w:p>
+      <w:pPr>
+        <w:rPr>
+          <w:lang w:val="en-US"/>
+        </w:rPr>
+      </w:pPr>
+      <w:r>
+        <w:rPr>
+          <w:lang w:val="en-US"/>
+        </w:rPr>
+        <w:t>Acceptance criteria:</w:t>
+      </w:r>
+    </w:p>
+    <w:p>
+      <w:pPr>
+        <w:rPr>
+          <w:lang w:val="en-US"/>
+        </w:rPr>
+      </w:pPr>
+    </w:p>
+    <w:p>
+      <w:pPr>
+        <w:rPr>
+          <w:lang w:val="en-US"/>
+        </w:rPr>
+      </w:pPr>
     </w:p>
     <w:sectPr>
       <w:pgSz w:w="11906" w:h="16838"/>

</xml_diff>

<commit_message>
Finished writing user stories
Signed-off-by: Student Sofiia Fedchuk (TL_KCOMP_B_Y3) <t00264753@mymtu.ie>
</commit_message>
<xml_diff>
--- a/report/report.docx
+++ b/report/report.docx
@@ -14144,7 +14144,13 @@
               <w:t>he facility booking arrangements of Kerry Community Sports Partnership</w:t>
             </w:r>
             <w:r>
-              <w:t xml:space="preserve"> shall allow staff to record a single space or equipment as unavailable for a date and/or time range with a reason (</w:t>
+              <w:t xml:space="preserve"> shall allow staff to record a single space</w:t>
+            </w:r>
+            <w:r>
+              <w:t xml:space="preserve"> </w:t>
+            </w:r>
+            <w:r>
+              <w:t>as unavailable for a date and/or time range with a reason (</w:t>
             </w:r>
             <w:r>
               <w:t>maintenance, inspection or community event</w:t>
@@ -14247,7 +14253,13 @@
             </w:r>
             <w:r>
               <w:lastRenderedPageBreak/>
-              <w:t>bookings and unavailable spaces.</w:t>
+              <w:t>bookings and unavailable spaces</w:t>
+            </w:r>
+            <w:r>
+              <w:t xml:space="preserve"> and equipment</w:t>
+            </w:r>
+            <w:r>
+              <w:t>.</w:t>
             </w:r>
           </w:p>
         </w:tc>
@@ -16015,7 +16027,7 @@
               </w:rPr>
             </w:pPr>
             <w:r>
-              <w:t>BR1 - When one space, changing room, entrance or equipment is unavailable, the rest of the site remains available. </w:t>
+              <w:t>BR1 - When one space, changing room, entrance is unavailable, the rest of the site remains available. </w:t>
             </w:r>
             <w:r>
               <w:rPr>
@@ -24561,20 +24573,42 @@
     <w:p>
       <w:pPr>
         <w:rPr>
+          <w:b/>
+          <w:bCs/>
           <w:lang w:val="en-US"/>
         </w:rPr>
       </w:pPr>
       <w:r>
         <w:rPr>
+          <w:b/>
+          <w:bCs/>
           <w:lang w:val="en-US"/>
         </w:rPr>
         <w:t xml:space="preserve">001 </w:t>
       </w:r>
       <w:r>
         <w:rPr>
+          <w:b/>
+          <w:bCs/>
           <w:lang w:val="en-US"/>
         </w:rPr>
-        <w:t>– Book available space in facility</w:t>
+        <w:t>– Book available space</w:t>
+      </w:r>
+      <w:r>
+        <w:rPr>
+          <w:b/>
+          <w:bCs/>
+          <w:lang w:val="en-US"/>
+        </w:rPr>
+        <w:t xml:space="preserve"> with available equipment included</w:t>
+      </w:r>
+      <w:r>
+        <w:rPr>
+          <w:b/>
+          <w:bCs/>
+          <w:lang w:val="en-US"/>
+        </w:rPr>
+        <w:t xml:space="preserve"> in facility</w:t>
       </w:r>
     </w:p>
     <w:p>
@@ -24611,7 +24645,19 @@
         <w:rPr>
           <w:lang w:val="en-US"/>
         </w:rPr>
-        <w:t>to book available space in facility in specific time frame and for specific date</w:t>
+        <w:t>to book available space in facility</w:t>
+      </w:r>
+      <w:r>
+        <w:rPr>
+          <w:lang w:val="en-US"/>
+        </w:rPr>
+        <w:t xml:space="preserve"> for</w:t>
+      </w:r>
+      <w:r>
+        <w:rPr>
+          <w:lang w:val="en-US"/>
+        </w:rPr>
+        <w:t xml:space="preserve"> specific time frame and date</w:t>
       </w:r>
       <w:r>
         <w:rPr>
@@ -24640,6 +24686,8 @@
       </w:pPr>
       <w:r>
         <w:rPr>
+          <w:b/>
+          <w:bCs/>
           <w:lang w:val="en-US"/>
         </w:rPr>
         <w:t>Business value:</w:t>
@@ -24668,28 +24716,65 @@
       </w:pPr>
       <w:r>
         <w:rPr>
+          <w:b/>
+          <w:bCs/>
           <w:lang w:val="en-US"/>
         </w:rPr>
         <w:t>Stakeholder goal:</w:t>
       </w:r>
       <w:r>
-        <w:t xml:space="preserve"> </w:t>
-      </w:r>
-      <w:r>
-        <w:t>Request a booking of a space and receive a decision and confirmation of the booking</w:t>
+        <w:t xml:space="preserve"> Request a booking of a space and receive a decision and confirmation of the booking</w:t>
       </w:r>
     </w:p>
     <w:p>
       <w:pPr>
         <w:rPr>
+          <w:b/>
+          <w:bCs/>
           <w:lang w:val="en-US"/>
         </w:rPr>
       </w:pPr>
       <w:r>
         <w:rPr>
+          <w:b/>
+          <w:bCs/>
           <w:lang w:val="en-US"/>
         </w:rPr>
         <w:t>Related to:</w:t>
+      </w:r>
+      <w:r>
+        <w:rPr>
+          <w:b/>
+          <w:bCs/>
+          <w:lang w:val="en-US"/>
+        </w:rPr>
+        <w:t xml:space="preserve"> </w:t>
+      </w:r>
+      <w:r>
+        <w:rPr>
+          <w:lang w:val="en-US"/>
+        </w:rPr>
+        <w:t>U</w:t>
+      </w:r>
+      <w:r>
+        <w:rPr>
+          <w:lang w:val="en-US"/>
+        </w:rPr>
+        <w:t>4</w:t>
+      </w:r>
+      <w:r>
+        <w:rPr>
+          <w:b/>
+          <w:bCs/>
+          <w:lang w:val="en-US"/>
+        </w:rPr>
+        <w:t xml:space="preserve">; </w:t>
+      </w:r>
+      <w:r>
+        <w:rPr>
+          <w:lang w:val="en-US"/>
+        </w:rPr>
+        <w:t>P1, P3, P5, P6</w:t>
       </w:r>
     </w:p>
     <w:p>
@@ -24701,6 +24786,8 @@
       <w:proofErr w:type="spellStart"/>
       <w:r>
         <w:rPr>
+          <w:b/>
+          <w:bCs/>
           <w:lang w:val="en-US"/>
         </w:rPr>
         <w:t>MoSCoW</w:t>
@@ -24708,6 +24795,8 @@
       <w:proofErr w:type="spellEnd"/>
       <w:r>
         <w:rPr>
+          <w:b/>
+          <w:bCs/>
           <w:lang w:val="en-US"/>
         </w:rPr>
         <w:t>:</w:t>
@@ -24722,11 +24811,15 @@
     <w:p>
       <w:pPr>
         <w:rPr>
+          <w:b/>
+          <w:bCs/>
           <w:lang w:val="en-US"/>
         </w:rPr>
       </w:pPr>
       <w:r>
         <w:rPr>
+          <w:b/>
+          <w:bCs/>
           <w:lang w:val="en-US"/>
         </w:rPr>
         <w:t>Acceptance criteria:</w:t>
@@ -24734,387 +24827,266 @@
     </w:p>
     <w:p>
       <w:pPr>
-        <w:pStyle w:val="Heading2"/>
-        <w:rPr>
-          <w:lang w:val="en-US"/>
-        </w:rPr>
-      </w:pPr>
-      <w:r>
-        <w:rPr>
-          <w:lang w:val="en-US"/>
-        </w:rPr>
-        <w:t>User story 2:</w:t>
+        <w:numPr>
+          <w:ilvl w:val="0"/>
+          <w:numId w:val="16"/>
+        </w:numPr>
+        <w:rPr>
+          <w:lang w:val="en-IE"/>
+        </w:rPr>
+      </w:pPr>
+      <w:r>
+        <w:rPr>
+          <w:lang w:val="en-IE"/>
+        </w:rPr>
+        <w:t xml:space="preserve">A request includes </w:t>
+      </w:r>
+      <w:r>
+        <w:t>organisation or group, activity, participant numbers, dates, times, preferred space, equipment and setup</w:t>
+      </w:r>
+      <w:r>
+        <w:t xml:space="preserve"> and reset</w:t>
+      </w:r>
+      <w:r>
+        <w:t xml:space="preserve"> needs</w:t>
+      </w:r>
+      <w:r>
+        <w:rPr>
+          <w:lang w:val="en-IE"/>
+        </w:rPr>
+        <w:t>.</w:t>
       </w:r>
     </w:p>
     <w:p>
       <w:pPr>
-        <w:rPr>
-          <w:lang w:val="en-US"/>
-        </w:rPr>
-      </w:pPr>
-      <w:r>
-        <w:rPr>
-          <w:lang w:val="en-US"/>
-        </w:rPr>
-        <w:t>00</w:t>
-      </w:r>
-      <w:r>
-        <w:rPr>
-          <w:lang w:val="en-US"/>
-        </w:rPr>
-        <w:t>2</w:t>
-      </w:r>
-      <w:r>
-        <w:rPr>
-          <w:lang w:val="en-US"/>
-        </w:rPr>
-        <w:t xml:space="preserve"> – Book available </w:t>
-      </w:r>
-      <w:r>
-        <w:rPr>
-          <w:lang w:val="en-US"/>
-        </w:rPr>
-        <w:t>equipment</w:t>
-      </w:r>
-      <w:r>
-        <w:rPr>
-          <w:lang w:val="en-US"/>
-        </w:rPr>
-        <w:t xml:space="preserve"> in facility</w:t>
+        <w:numPr>
+          <w:ilvl w:val="0"/>
+          <w:numId w:val="16"/>
+        </w:numPr>
+        <w:rPr>
+          <w:lang w:val="en-IE"/>
+        </w:rPr>
+      </w:pPr>
+      <w:r>
+        <w:rPr>
+          <w:lang w:val="en-IE"/>
+        </w:rPr>
+        <w:t xml:space="preserve">A space that is </w:t>
+      </w:r>
+      <w:r>
+        <w:rPr>
+          <w:lang w:val="en-IE"/>
+        </w:rPr>
+        <w:t>available</w:t>
+      </w:r>
+      <w:r>
+        <w:rPr>
+          <w:lang w:val="en-IE"/>
+        </w:rPr>
+        <w:t xml:space="preserve"> for the requested date and time can be booked.</w:t>
       </w:r>
     </w:p>
     <w:p>
       <w:pPr>
-        <w:rPr>
-          <w:lang w:val="en-US"/>
-        </w:rPr>
-      </w:pPr>
-      <w:r>
-        <w:rPr>
-          <w:lang w:val="en-US"/>
-        </w:rPr>
-        <w:t xml:space="preserve">As a </w:t>
-      </w:r>
-      <w:r>
-        <w:rPr>
-          <w:lang w:val="en-US"/>
-        </w:rPr>
-        <w:t>group we</w:t>
-      </w:r>
-      <w:r>
-        <w:rPr>
-          <w:lang w:val="en-US"/>
-        </w:rPr>
-        <w:t xml:space="preserve"> want </w:t>
-      </w:r>
-      <w:r>
-        <w:rPr>
-          <w:lang w:val="en-US"/>
-        </w:rPr>
-        <w:t xml:space="preserve">to book </w:t>
-      </w:r>
-      <w:r>
-        <w:rPr>
-          <w:lang w:val="en-US"/>
-        </w:rPr>
-        <w:t>equipment</w:t>
-      </w:r>
-      <w:r>
-        <w:rPr>
-          <w:lang w:val="en-US"/>
-        </w:rPr>
-        <w:t xml:space="preserve"> in facility in specific time frame and for specific date</w:t>
-      </w:r>
-      <w:r>
-        <w:rPr>
-          <w:lang w:val="en-US"/>
-        </w:rPr>
-        <w:t xml:space="preserve">, so that </w:t>
-      </w:r>
-      <w:r>
-        <w:rPr>
-          <w:lang w:val="en-US"/>
-        </w:rPr>
-        <w:t>we can perform sport activities</w:t>
-      </w:r>
-      <w:r>
-        <w:rPr>
-          <w:lang w:val="en-US"/>
-        </w:rPr>
-        <w:t xml:space="preserve"> with this equipment</w:t>
-      </w:r>
-      <w:r>
-        <w:rPr>
-          <w:lang w:val="en-US"/>
-        </w:rPr>
-        <w:t xml:space="preserve"> in this space</w:t>
-      </w:r>
-      <w:r>
-        <w:rPr>
-          <w:lang w:val="en-US"/>
-        </w:rPr>
-        <w:t>.</w:t>
+        <w:numPr>
+          <w:ilvl w:val="0"/>
+          <w:numId w:val="16"/>
+        </w:numPr>
+        <w:rPr>
+          <w:lang w:val="en-IE"/>
+        </w:rPr>
+      </w:pPr>
+      <w:r>
+        <w:rPr>
+          <w:lang w:val="en-IE"/>
+        </w:rPr>
+        <w:t>A space that is already booked or recorded as unavailable</w:t>
+      </w:r>
+      <w:r>
+        <w:rPr>
+          <w:lang w:val="en-IE"/>
+        </w:rPr>
+        <w:t xml:space="preserve"> </w:t>
+      </w:r>
+      <w:r>
+        <w:rPr>
+          <w:lang w:val="en-IE"/>
+        </w:rPr>
+        <w:t>for any part of the requested time cannot be booked.</w:t>
       </w:r>
     </w:p>
     <w:p>
       <w:pPr>
-        <w:rPr>
-          <w:lang w:val="en-US"/>
-        </w:rPr>
-      </w:pPr>
-      <w:r>
-        <w:rPr>
-          <w:lang w:val="en-US"/>
-        </w:rPr>
-        <w:t xml:space="preserve">Business value: </w:t>
-      </w:r>
-      <w:r>
-        <w:t xml:space="preserve">Groups can get </w:t>
-      </w:r>
-      <w:r>
-        <w:t>equipment</w:t>
-      </w:r>
-      <w:r>
-        <w:t xml:space="preserve"> for their activity without </w:t>
-      </w:r>
-      <w:r>
-        <w:t xml:space="preserve">booking unavailable </w:t>
-      </w:r>
-      <w:proofErr w:type="spellStart"/>
-      <w:r>
-        <w:t>euipment</w:t>
-      </w:r>
-      <w:proofErr w:type="spellEnd"/>
-      <w:r>
-        <w:t>. Staff process requests against records they can trust.</w:t>
+        <w:numPr>
+          <w:ilvl w:val="0"/>
+          <w:numId w:val="16"/>
+        </w:numPr>
+        <w:rPr>
+          <w:lang w:val="en-IE"/>
+        </w:rPr>
+      </w:pPr>
+      <w:r>
+        <w:rPr>
+          <w:lang w:val="en-IE"/>
+        </w:rPr>
+        <w:t xml:space="preserve">A request that starts during another booking’s setup or </w:t>
+      </w:r>
+      <w:proofErr w:type="gramStart"/>
+      <w:r>
+        <w:rPr>
+          <w:lang w:val="en-IE"/>
+        </w:rPr>
+        <w:t>reset</w:t>
+      </w:r>
+      <w:proofErr w:type="gramEnd"/>
+      <w:r>
+        <w:rPr>
+          <w:lang w:val="en-IE"/>
+        </w:rPr>
+        <w:t xml:space="preserve"> time is flagged as overlapping</w:t>
+      </w:r>
+      <w:r>
+        <w:rPr>
+          <w:lang w:val="en-IE"/>
+        </w:rPr>
+        <w:t>.</w:t>
       </w:r>
     </w:p>
     <w:p>
       <w:pPr>
-        <w:rPr>
-          <w:lang w:val="en-US"/>
-        </w:rPr>
-      </w:pPr>
-      <w:r>
-        <w:rPr>
-          <w:lang w:val="en-US"/>
-        </w:rPr>
+        <w:numPr>
+          <w:ilvl w:val="0"/>
+          <w:numId w:val="16"/>
+        </w:numPr>
+        <w:rPr>
+          <w:lang w:val="en-IE"/>
+        </w:rPr>
+      </w:pPr>
+      <w:r>
         <w:lastRenderedPageBreak/>
-        <w:t>Stakeholder goal:</w:t>
-      </w:r>
-      <w:r>
-        <w:t xml:space="preserve"> Request a booking of </w:t>
-      </w:r>
-      <w:r>
-        <w:rPr>
-          <w:lang w:val="en-US"/>
-        </w:rPr>
-        <w:t>equipment</w:t>
-      </w:r>
-      <w:r>
-        <w:t xml:space="preserve"> </w:t>
-      </w:r>
-      <w:r>
-        <w:t>and receive a decision and confirmation of the booking</w:t>
+        <w:t xml:space="preserve">When two or more requests compete for the same space and </w:t>
+      </w:r>
+      <w:r>
+        <w:t>date/</w:t>
+      </w:r>
+      <w:r>
+        <w:t>time</w:t>
+      </w:r>
+      <w:r>
+        <w:t xml:space="preserve"> range</w:t>
+      </w:r>
+      <w:r>
+        <w:t>, staff are shown the priority level of each reques</w:t>
+      </w:r>
+      <w:r>
+        <w:t>t.</w:t>
       </w:r>
     </w:p>
     <w:p>
       <w:pPr>
-        <w:rPr>
-          <w:lang w:val="en-US"/>
-        </w:rPr>
-      </w:pPr>
-      <w:r>
-        <w:rPr>
-          <w:lang w:val="en-US"/>
-        </w:rPr>
-        <w:t>Related to:</w:t>
+        <w:numPr>
+          <w:ilvl w:val="0"/>
+          <w:numId w:val="16"/>
+        </w:numPr>
+        <w:rPr>
+          <w:lang w:val="en-IE"/>
+        </w:rPr>
+      </w:pPr>
+      <w:r>
+        <w:t xml:space="preserve">A request that is held as provisional does not stop a request with higher priority from </w:t>
+      </w:r>
+      <w:r>
+        <w:t>taking timeslot.</w:t>
       </w:r>
     </w:p>
     <w:p>
       <w:pPr>
-        <w:rPr>
-          <w:lang w:val="en-US"/>
-        </w:rPr>
-      </w:pPr>
-      <w:proofErr w:type="spellStart"/>
-      <w:r>
-        <w:rPr>
-          <w:lang w:val="en-US"/>
-        </w:rPr>
-        <w:t>MoSCoW</w:t>
-      </w:r>
-      <w:proofErr w:type="spellEnd"/>
-      <w:r>
-        <w:rPr>
-          <w:lang w:val="en-US"/>
-        </w:rPr>
-        <w:t>: Must</w:t>
+        <w:numPr>
+          <w:ilvl w:val="0"/>
+          <w:numId w:val="16"/>
+        </w:numPr>
+        <w:rPr>
+          <w:lang w:val="en-IE"/>
+        </w:rPr>
+      </w:pPr>
+      <w:r>
+        <w:rPr>
+          <w:lang w:val="en-IE"/>
+        </w:rPr>
+        <w:t>The group is told the outcome of the request</w:t>
+      </w:r>
+      <w:r>
+        <w:rPr>
+          <w:lang w:val="en-IE"/>
+        </w:rPr>
+        <w:t xml:space="preserve"> and receive email confirmation with details about </w:t>
+      </w:r>
+      <w:r>
+        <w:t>space, equipment and access arrangements</w:t>
+      </w:r>
+      <w:r>
+        <w:rPr>
+          <w:lang w:val="en-IE"/>
+        </w:rPr>
+        <w:t>.</w:t>
       </w:r>
     </w:p>
     <w:p>
       <w:pPr>
-        <w:rPr>
-          <w:lang w:val="en-US"/>
-        </w:rPr>
-      </w:pPr>
-      <w:r>
-        <w:rPr>
-          <w:lang w:val="en-US"/>
-        </w:rPr>
-        <w:t>Acceptance criteria:</w:t>
+        <w:numPr>
+          <w:ilvl w:val="0"/>
+          <w:numId w:val="16"/>
+        </w:numPr>
+        <w:rPr>
+          <w:lang w:val="en-IE"/>
+        </w:rPr>
+      </w:pPr>
+      <w:r>
+        <w:rPr>
+          <w:lang w:val="en-IE"/>
+        </w:rPr>
+        <w:t>Other spaces of the facility remain available for booking when one space is booked.</w:t>
       </w:r>
     </w:p>
     <w:p>
       <w:pPr>
-        <w:pStyle w:val="Heading2"/>
-        <w:rPr>
-          <w:lang w:val="en-US"/>
-        </w:rPr>
-      </w:pPr>
-      <w:r>
-        <w:rPr>
-          <w:lang w:val="en-US"/>
-        </w:rPr>
-        <w:t>User story 3:</w:t>
+        <w:numPr>
+          <w:ilvl w:val="0"/>
+          <w:numId w:val="16"/>
+        </w:numPr>
+        <w:rPr>
+          <w:lang w:val="en-IE"/>
+        </w:rPr>
+      </w:pPr>
+      <w:r>
+        <w:t>Requested equipment that is stored at another site, under repair or reserved for another activity is shown to staff as unavailable and is not included in the booking.</w:t>
       </w:r>
     </w:p>
     <w:p>
       <w:pPr>
-        <w:rPr>
-          <w:lang w:val="en-US"/>
-        </w:rPr>
-      </w:pPr>
-      <w:r>
-        <w:rPr>
-          <w:lang w:val="en-US"/>
-        </w:rPr>
-        <w:t>00</w:t>
-      </w:r>
-      <w:r>
-        <w:rPr>
-          <w:lang w:val="en-US"/>
-        </w:rPr>
-        <w:t>3</w:t>
-      </w:r>
-      <w:r>
-        <w:rPr>
-          <w:lang w:val="en-US"/>
-        </w:rPr>
-        <w:t xml:space="preserve"> – </w:t>
-      </w:r>
-      <w:r>
-        <w:rPr>
-          <w:lang w:val="en-US"/>
-        </w:rPr>
-        <w:t>Record</w:t>
-      </w:r>
-      <w:r>
-        <w:rPr>
-          <w:lang w:val="en-US"/>
-        </w:rPr>
-        <w:t xml:space="preserve"> </w:t>
-      </w:r>
-      <w:r>
-        <w:rPr>
-          <w:lang w:val="en-US"/>
-        </w:rPr>
-        <w:t>una</w:t>
-      </w:r>
-      <w:r>
-        <w:rPr>
-          <w:lang w:val="en-US"/>
-        </w:rPr>
-        <w:t>vailable space in facility</w:t>
+        <w:numPr>
+          <w:ilvl w:val="0"/>
+          <w:numId w:val="16"/>
+        </w:numPr>
+        <w:rPr>
+          <w:lang w:val="en-IE"/>
+        </w:rPr>
+      </w:pPr>
+      <w:r>
+        <w:t>Requested equipment that is available at the requested time (not stored at another site, under repair or reserved for another activity) can be included in the booking.</w:t>
       </w:r>
     </w:p>
     <w:p>
       <w:pPr>
-        <w:rPr>
-          <w:lang w:val="en-US"/>
-        </w:rPr>
-      </w:pPr>
-      <w:r>
-        <w:rPr>
-          <w:lang w:val="en-US"/>
-        </w:rPr>
-        <w:t xml:space="preserve">As a </w:t>
-      </w:r>
-      <w:r>
-        <w:rPr>
-          <w:lang w:val="en-US"/>
-        </w:rPr>
-        <w:t>staff member</w:t>
-      </w:r>
-      <w:r>
-        <w:rPr>
-          <w:lang w:val="en-US"/>
-        </w:rPr>
-        <w:t xml:space="preserve"> </w:t>
-      </w:r>
-      <w:r>
-        <w:rPr>
-          <w:lang w:val="en-US"/>
-        </w:rPr>
-        <w:t xml:space="preserve">I </w:t>
-      </w:r>
-      <w:r>
-        <w:rPr>
-          <w:lang w:val="en-US"/>
-        </w:rPr>
-        <w:t xml:space="preserve">want </w:t>
-      </w:r>
-      <w:r>
-        <w:rPr>
-          <w:lang w:val="en-US"/>
-        </w:rPr>
-        <w:t xml:space="preserve">to </w:t>
-      </w:r>
-      <w:r>
-        <w:rPr>
-          <w:lang w:val="en-US"/>
-        </w:rPr>
-        <w:t>record</w:t>
-      </w:r>
-      <w:r>
-        <w:rPr>
-          <w:lang w:val="en-US"/>
-        </w:rPr>
-        <w:t xml:space="preserve"> </w:t>
-      </w:r>
-      <w:r>
-        <w:rPr>
-          <w:lang w:val="en-US"/>
-        </w:rPr>
-        <w:t>un</w:t>
-      </w:r>
-      <w:r>
-        <w:rPr>
-          <w:lang w:val="en-US"/>
-        </w:rPr>
-        <w:t>available space in facility in specific time frame and for specific date</w:t>
-      </w:r>
-      <w:r>
-        <w:rPr>
-          <w:lang w:val="en-US"/>
-        </w:rPr>
-        <w:t xml:space="preserve">, so that </w:t>
-      </w:r>
-      <w:r>
-        <w:rPr>
-          <w:lang w:val="en-US"/>
-        </w:rPr>
-        <w:t>maintenance, inspection or community event can be performed</w:t>
-      </w:r>
-      <w:r>
-        <w:rPr>
-          <w:lang w:val="en-US"/>
-        </w:rPr>
-        <w:t>.</w:t>
-      </w:r>
+        <w:ind w:left="720"/>
+        <w:rPr>
+          <w:lang w:val="en-IE"/>
+        </w:rPr>
+      </w:pPr>
     </w:p>
     <w:p>
       <w:pPr>
+        <w:pStyle w:val="Heading2"/>
         <w:rPr>
           <w:lang w:val="en-US"/>
         </w:rPr>
@@ -25123,23 +25095,32 @@
         <w:rPr>
           <w:lang w:val="en-US"/>
         </w:rPr>
-        <w:t xml:space="preserve">Business value: </w:t>
+        <w:t>User story 2:</w:t>
       </w:r>
     </w:p>
     <w:p>
       <w:pPr>
         <w:rPr>
+          <w:b/>
+          <w:bCs/>
           <w:lang w:val="en-US"/>
         </w:rPr>
       </w:pPr>
       <w:r>
         <w:rPr>
+          <w:b/>
+          <w:bCs/>
           <w:lang w:val="en-US"/>
         </w:rPr>
-        <w:t>Stakeholder goal:</w:t>
-      </w:r>
-      <w:r>
-        <w:t xml:space="preserve"> </w:t>
+        <w:t>002 – Record unavailable equipment</w:t>
+      </w:r>
+      <w:r>
+        <w:rPr>
+          <w:b/>
+          <w:bCs/>
+          <w:lang w:val="en-US"/>
+        </w:rPr>
+        <w:t xml:space="preserve"> in facility</w:t>
       </w:r>
     </w:p>
     <w:p>
@@ -25152,7 +25133,91 @@
         <w:rPr>
           <w:lang w:val="en-US"/>
         </w:rPr>
-        <w:t>Related to:</w:t>
+        <w:t xml:space="preserve">As a </w:t>
+      </w:r>
+      <w:r>
+        <w:rPr>
+          <w:lang w:val="en-US"/>
+        </w:rPr>
+        <w:t xml:space="preserve">staff member I </w:t>
+      </w:r>
+      <w:r>
+        <w:rPr>
+          <w:lang w:val="en-US"/>
+        </w:rPr>
+        <w:t xml:space="preserve">want </w:t>
+      </w:r>
+      <w:r>
+        <w:rPr>
+          <w:lang w:val="en-US"/>
+        </w:rPr>
+        <w:t xml:space="preserve">to record unavailable </w:t>
+      </w:r>
+      <w:r>
+        <w:rPr>
+          <w:lang w:val="en-US"/>
+        </w:rPr>
+        <w:t>equipment</w:t>
+      </w:r>
+      <w:r>
+        <w:rPr>
+          <w:lang w:val="en-US"/>
+        </w:rPr>
+        <w:t xml:space="preserve"> in facility </w:t>
+      </w:r>
+      <w:r>
+        <w:rPr>
+          <w:lang w:val="en-US"/>
+        </w:rPr>
+        <w:t xml:space="preserve">for </w:t>
+      </w:r>
+      <w:r>
+        <w:rPr>
+          <w:lang w:val="en-US"/>
+        </w:rPr>
+        <w:t>specific time frame and</w:t>
+      </w:r>
+      <w:r>
+        <w:rPr>
+          <w:lang w:val="en-US"/>
+        </w:rPr>
+        <w:t xml:space="preserve"> </w:t>
+      </w:r>
+      <w:r>
+        <w:rPr>
+          <w:lang w:val="en-US"/>
+        </w:rPr>
+        <w:t>date</w:t>
+      </w:r>
+      <w:r>
+        <w:rPr>
+          <w:lang w:val="en-US"/>
+        </w:rPr>
+        <w:t>, so that</w:t>
+      </w:r>
+      <w:r>
+        <w:rPr>
+          <w:lang w:val="en-US"/>
+        </w:rPr>
+        <w:t xml:space="preserve"> equipment </w:t>
+      </w:r>
+      <w:r>
+        <w:rPr>
+          <w:lang w:val="en-US"/>
+        </w:rPr>
+        <w:t>is</w:t>
+      </w:r>
+      <w:r>
+        <w:t xml:space="preserve"> not included in any booking for that time</w:t>
+      </w:r>
+      <w:r>
+        <w:t xml:space="preserve"> date</w:t>
+      </w:r>
+      <w:r>
+        <w:rPr>
+          <w:lang w:val="en-US"/>
+        </w:rPr>
+        <w:t>.</w:t>
       </w:r>
     </w:p>
     <w:p>
@@ -25161,32 +25226,729 @@
           <w:lang w:val="en-US"/>
         </w:rPr>
       </w:pPr>
-      <w:proofErr w:type="spellStart"/>
-      <w:r>
-        <w:rPr>
+      <w:r>
+        <w:rPr>
+          <w:b/>
+          <w:bCs/>
           <w:lang w:val="en-US"/>
         </w:rPr>
-        <w:t>MoSCoW</w:t>
-      </w:r>
-      <w:proofErr w:type="spellEnd"/>
+        <w:t>Business value:</w:t>
+      </w:r>
       <w:r>
         <w:rPr>
           <w:lang w:val="en-US"/>
         </w:rPr>
-        <w:t>: Must</w:t>
+        <w:t xml:space="preserve"> </w:t>
+      </w:r>
+      <w:r>
+        <w:t>Groups are not promised equipment that is stored at another site, under repair or reserved for another activity. Staff can see which equipment is unavailable when they process a request, so fewer bookings are accepted that cannot go ahead as planned.</w:t>
       </w:r>
     </w:p>
     <w:p>
       <w:pPr>
         <w:rPr>
+          <w:b/>
+          <w:bCs/>
           <w:lang w:val="en-US"/>
         </w:rPr>
       </w:pPr>
       <w:r>
         <w:rPr>
+          <w:b/>
+          <w:bCs/>
           <w:lang w:val="en-US"/>
         </w:rPr>
+        <w:t>Stakeholder goal</w:t>
+      </w:r>
+      <w:proofErr w:type="gramStart"/>
+      <w:r>
+        <w:rPr>
+          <w:b/>
+          <w:bCs/>
+          <w:lang w:val="en-US"/>
+        </w:rPr>
+        <w:t>:</w:t>
+      </w:r>
+      <w:r>
+        <w:rPr>
+          <w:b/>
+          <w:bCs/>
+        </w:rPr>
+        <w:t xml:space="preserve"> </w:t>
+      </w:r>
+      <w:r>
+        <w:rPr>
+          <w:b/>
+          <w:bCs/>
+        </w:rPr>
+        <w:t xml:space="preserve"> </w:t>
+      </w:r>
+      <w:r>
+        <w:t>Staff</w:t>
+      </w:r>
+      <w:proofErr w:type="gramEnd"/>
+      <w:r>
+        <w:t xml:space="preserve"> member: view equipment location, repair status and reservations</w:t>
+      </w:r>
+      <w:r>
+        <w:t>.</w:t>
+      </w:r>
+    </w:p>
+    <w:p>
+      <w:r>
+        <w:rPr>
+          <w:b/>
+          <w:bCs/>
+          <w:lang w:val="en-US"/>
+        </w:rPr>
+        <w:t>Related to:</w:t>
+      </w:r>
+      <w:r>
+        <w:rPr>
+          <w:b/>
+          <w:bCs/>
+          <w:lang w:val="en-US"/>
+        </w:rPr>
+        <w:t xml:space="preserve"> </w:t>
+      </w:r>
+      <w:r>
+        <w:rPr>
+          <w:lang w:val="en-US"/>
+        </w:rPr>
+        <w:t xml:space="preserve">U2, U3; </w:t>
+      </w:r>
+      <w:r>
+        <w:t xml:space="preserve">FR8; </w:t>
+      </w:r>
+    </w:p>
+    <w:p>
+      <w:pPr>
+        <w:rPr>
+          <w:lang w:val="en-US"/>
+        </w:rPr>
+      </w:pPr>
+      <w:proofErr w:type="spellStart"/>
+      <w:r>
+        <w:rPr>
+          <w:b/>
+          <w:bCs/>
+          <w:lang w:val="en-US"/>
+        </w:rPr>
+        <w:t>MoSCoW</w:t>
+      </w:r>
+      <w:proofErr w:type="spellEnd"/>
+      <w:r>
+        <w:rPr>
+          <w:b/>
+          <w:bCs/>
+          <w:lang w:val="en-US"/>
+        </w:rPr>
+        <w:t>:</w:t>
+      </w:r>
+      <w:r>
+        <w:rPr>
+          <w:lang w:val="en-US"/>
+        </w:rPr>
+        <w:t xml:space="preserve"> Must</w:t>
+      </w:r>
+    </w:p>
+    <w:p>
+      <w:pPr>
+        <w:rPr>
+          <w:b/>
+          <w:bCs/>
+          <w:lang w:val="en-US"/>
+        </w:rPr>
+      </w:pPr>
+      <w:r>
+        <w:rPr>
+          <w:b/>
+          <w:bCs/>
+          <w:lang w:val="en-US"/>
+        </w:rPr>
         <w:t>Acceptance criteria:</w:t>
+      </w:r>
+    </w:p>
+    <w:p>
+      <w:pPr>
+        <w:numPr>
+          <w:ilvl w:val="0"/>
+          <w:numId w:val="18"/>
+        </w:numPr>
+        <w:rPr>
+          <w:lang w:val="en-IE"/>
+        </w:rPr>
+      </w:pPr>
+      <w:r>
+        <w:rPr>
+          <w:lang w:val="en-IE"/>
+        </w:rPr>
+        <w:t>A staff member can record a single equipment item as unavailable for a stated date and time range.</w:t>
+      </w:r>
+    </w:p>
+    <w:p>
+      <w:pPr>
+        <w:numPr>
+          <w:ilvl w:val="0"/>
+          <w:numId w:val="18"/>
+        </w:numPr>
+        <w:rPr>
+          <w:lang w:val="en-IE"/>
+        </w:rPr>
+      </w:pPr>
+      <w:r>
+        <w:rPr>
+          <w:lang w:val="en-IE"/>
+        </w:rPr>
+        <w:t>Each record has a reason: stored at another site, under repair or reserved for another activity.</w:t>
+      </w:r>
+    </w:p>
+    <w:p>
+      <w:pPr>
+        <w:numPr>
+          <w:ilvl w:val="0"/>
+          <w:numId w:val="18"/>
+        </w:numPr>
+        <w:rPr>
+          <w:lang w:val="en-IE"/>
+        </w:rPr>
+      </w:pPr>
+      <w:r>
+        <w:rPr>
+          <w:lang w:val="en-IE"/>
+        </w:rPr>
+        <w:t>A record without a date, a time range or a reason is not recorded.</w:t>
+      </w:r>
+    </w:p>
+    <w:p>
+      <w:pPr>
+        <w:numPr>
+          <w:ilvl w:val="0"/>
+          <w:numId w:val="18"/>
+        </w:numPr>
+        <w:rPr>
+          <w:lang w:val="en-IE"/>
+        </w:rPr>
+      </w:pPr>
+      <w:r>
+        <w:rPr>
+          <w:lang w:val="en-IE"/>
+        </w:rPr>
+        <w:lastRenderedPageBreak/>
+        <w:t>A record whose end is before its start is not recorded.</w:t>
+      </w:r>
+    </w:p>
+    <w:p>
+      <w:pPr>
+        <w:numPr>
+          <w:ilvl w:val="0"/>
+          <w:numId w:val="18"/>
+        </w:numPr>
+        <w:rPr>
+          <w:lang w:val="en-IE"/>
+        </w:rPr>
+      </w:pPr>
+      <w:r>
+        <w:t>The equipment’s location, repair status and reservations are shown to staff when equipment is requested</w:t>
+      </w:r>
+      <w:r>
+        <w:t>.</w:t>
+      </w:r>
+    </w:p>
+    <w:p>
+      <w:pPr>
+        <w:rPr>
+          <w:lang w:val="en-US"/>
+        </w:rPr>
+      </w:pPr>
+    </w:p>
+    <w:p>
+      <w:pPr>
+        <w:pStyle w:val="Heading2"/>
+        <w:rPr>
+          <w:lang w:val="en-US"/>
+        </w:rPr>
+      </w:pPr>
+      <w:r>
+        <w:rPr>
+          <w:lang w:val="en-US"/>
+        </w:rPr>
+        <w:t>User story 3:</w:t>
+      </w:r>
+    </w:p>
+    <w:p>
+      <w:pPr>
+        <w:rPr>
+          <w:b/>
+          <w:bCs/>
+          <w:lang w:val="en-US"/>
+        </w:rPr>
+      </w:pPr>
+      <w:r>
+        <w:rPr>
+          <w:b/>
+          <w:bCs/>
+          <w:lang w:val="en-US"/>
+        </w:rPr>
+        <w:t xml:space="preserve">003 – Record </w:t>
+      </w:r>
+      <w:r>
+        <w:rPr>
+          <w:b/>
+          <w:bCs/>
+          <w:lang w:val="en-US"/>
+        </w:rPr>
+        <w:t>una</w:t>
+      </w:r>
+      <w:r>
+        <w:rPr>
+          <w:b/>
+          <w:bCs/>
+          <w:lang w:val="en-US"/>
+        </w:rPr>
+        <w:t>vailable space in facility</w:t>
+      </w:r>
+    </w:p>
+    <w:p>
+      <w:pPr>
+        <w:rPr>
+          <w:lang w:val="en-US"/>
+        </w:rPr>
+      </w:pPr>
+      <w:r>
+        <w:rPr>
+          <w:lang w:val="en-US"/>
+        </w:rPr>
+        <w:t xml:space="preserve">As a </w:t>
+      </w:r>
+      <w:r>
+        <w:rPr>
+          <w:lang w:val="en-US"/>
+        </w:rPr>
+        <w:t>staff member</w:t>
+      </w:r>
+      <w:r>
+        <w:rPr>
+          <w:lang w:val="en-US"/>
+        </w:rPr>
+        <w:t xml:space="preserve"> </w:t>
+      </w:r>
+      <w:r>
+        <w:rPr>
+          <w:lang w:val="en-US"/>
+        </w:rPr>
+        <w:t xml:space="preserve">I </w:t>
+      </w:r>
+      <w:r>
+        <w:rPr>
+          <w:lang w:val="en-US"/>
+        </w:rPr>
+        <w:t xml:space="preserve">want </w:t>
+      </w:r>
+      <w:r>
+        <w:rPr>
+          <w:lang w:val="en-US"/>
+        </w:rPr>
+        <w:t xml:space="preserve">to </w:t>
+      </w:r>
+      <w:r>
+        <w:rPr>
+          <w:lang w:val="en-US"/>
+        </w:rPr>
+        <w:t>record</w:t>
+      </w:r>
+      <w:r>
+        <w:rPr>
+          <w:lang w:val="en-US"/>
+        </w:rPr>
+        <w:t xml:space="preserve"> </w:t>
+      </w:r>
+      <w:r>
+        <w:rPr>
+          <w:lang w:val="en-US"/>
+        </w:rPr>
+        <w:t>un</w:t>
+      </w:r>
+      <w:r>
+        <w:rPr>
+          <w:lang w:val="en-US"/>
+        </w:rPr>
+        <w:t xml:space="preserve">available space in facility </w:t>
+      </w:r>
+      <w:r>
+        <w:rPr>
+          <w:lang w:val="en-US"/>
+        </w:rPr>
+        <w:t>for</w:t>
+      </w:r>
+      <w:r>
+        <w:rPr>
+          <w:lang w:val="en-US"/>
+        </w:rPr>
+        <w:t xml:space="preserve"> specific time frame and date</w:t>
+      </w:r>
+      <w:r>
+        <w:rPr>
+          <w:lang w:val="en-US"/>
+        </w:rPr>
+        <w:t xml:space="preserve">, so that </w:t>
+      </w:r>
+      <w:r>
+        <w:rPr>
+          <w:lang w:val="en-US"/>
+        </w:rPr>
+        <w:t>maintenance, inspection or community event can be performed</w:t>
+      </w:r>
+      <w:r>
+        <w:rPr>
+          <w:lang w:val="en-US"/>
+        </w:rPr>
+        <w:t>.</w:t>
+      </w:r>
+    </w:p>
+    <w:p>
+      <w:pPr>
+        <w:rPr>
+          <w:lang w:val="en-US"/>
+        </w:rPr>
+      </w:pPr>
+      <w:r>
+        <w:rPr>
+          <w:b/>
+          <w:bCs/>
+          <w:lang w:val="en-US"/>
+        </w:rPr>
+        <w:t>Business value:</w:t>
+      </w:r>
+      <w:r>
+        <w:rPr>
+          <w:lang w:val="en-US"/>
+        </w:rPr>
+        <w:t xml:space="preserve"> </w:t>
+      </w:r>
+      <w:r>
+        <w:t>Only the affected space is taken out of service, so the rest of the facility stays open for groups to book. Staff stop accepting bookings for a space that is out of service, which reduces cancellations and relocations at short notice.</w:t>
+      </w:r>
+    </w:p>
+    <w:p>
+      <w:pPr>
+        <w:rPr>
+          <w:b/>
+          <w:bCs/>
+          <w:lang w:val="en-US"/>
+        </w:rPr>
+      </w:pPr>
+      <w:r>
+        <w:rPr>
+          <w:b/>
+          <w:bCs/>
+          <w:lang w:val="en-US"/>
+        </w:rPr>
+        <w:t>Stakeholder goal:</w:t>
+      </w:r>
+      <w:r>
+        <w:rPr>
+          <w:b/>
+          <w:bCs/>
+        </w:rPr>
+        <w:t xml:space="preserve"> </w:t>
+      </w:r>
+      <w:r>
+        <w:rPr>
+          <w:b/>
+          <w:bCs/>
+        </w:rPr>
+        <w:t xml:space="preserve">  </w:t>
+      </w:r>
+      <w:r>
+        <w:t>S</w:t>
+      </w:r>
+      <w:r>
+        <w:t>taff member: mark the affected area as unavailable without closing whole site. Maintenance officer: have maintenance recorded as restricting only the affected area</w:t>
+      </w:r>
+      <w:r>
+        <w:t>.</w:t>
+      </w:r>
+    </w:p>
+    <w:p>
+      <w:pPr>
+        <w:rPr>
+          <w:b/>
+          <w:bCs/>
+          <w:lang w:val="en-US"/>
+        </w:rPr>
+      </w:pPr>
+      <w:r>
+        <w:rPr>
+          <w:b/>
+          <w:bCs/>
+          <w:lang w:val="en-US"/>
+        </w:rPr>
+        <w:t>Related to</w:t>
+      </w:r>
+      <w:r>
+        <w:rPr>
+          <w:b/>
+          <w:bCs/>
+          <w:lang w:val="en-US"/>
+        </w:rPr>
+        <w:t>:</w:t>
+      </w:r>
+      <w:r>
+        <w:rPr>
+          <w:b/>
+          <w:bCs/>
+          <w:lang w:val="en-US"/>
+        </w:rPr>
+        <w:t xml:space="preserve"> </w:t>
+      </w:r>
+      <w:r>
+        <w:rPr>
+          <w:lang w:val="en-US"/>
+        </w:rPr>
+        <w:t>U1</w:t>
+      </w:r>
+      <w:r>
+        <w:rPr>
+          <w:lang w:val="en-US"/>
+        </w:rPr>
+        <w:t>, U</w:t>
+      </w:r>
+      <w:r>
+        <w:rPr>
+          <w:lang w:val="en-US"/>
+        </w:rPr>
+        <w:t>3; FR</w:t>
+      </w:r>
+      <w:r>
+        <w:rPr>
+          <w:lang w:val="en-US"/>
+        </w:rPr>
+        <w:t xml:space="preserve">1, FR2; C2; </w:t>
+      </w:r>
+    </w:p>
+    <w:p>
+      <w:pPr>
+        <w:rPr>
+          <w:lang w:val="en-US"/>
+        </w:rPr>
+      </w:pPr>
+      <w:proofErr w:type="spellStart"/>
+      <w:r>
+        <w:rPr>
+          <w:b/>
+          <w:bCs/>
+          <w:lang w:val="en-US"/>
+        </w:rPr>
+        <w:t>MoSCoW</w:t>
+      </w:r>
+      <w:proofErr w:type="spellEnd"/>
+      <w:r>
+        <w:rPr>
+          <w:b/>
+          <w:bCs/>
+          <w:lang w:val="en-US"/>
+        </w:rPr>
+        <w:t>:</w:t>
+      </w:r>
+      <w:r>
+        <w:rPr>
+          <w:lang w:val="en-US"/>
+        </w:rPr>
+        <w:t xml:space="preserve"> Must</w:t>
+      </w:r>
+    </w:p>
+    <w:p>
+      <w:pPr>
+        <w:rPr>
+          <w:b/>
+          <w:bCs/>
+          <w:lang w:val="en-US"/>
+        </w:rPr>
+      </w:pPr>
+      <w:r>
+        <w:rPr>
+          <w:b/>
+          <w:bCs/>
+          <w:lang w:val="en-US"/>
+        </w:rPr>
+        <w:t>Acceptance criteria:</w:t>
+      </w:r>
+    </w:p>
+    <w:p>
+      <w:pPr>
+        <w:numPr>
+          <w:ilvl w:val="0"/>
+          <w:numId w:val="17"/>
+        </w:numPr>
+        <w:rPr>
+          <w:lang w:val="en-IE"/>
+        </w:rPr>
+      </w:pPr>
+      <w:r>
+        <w:rPr>
+          <w:lang w:val="en-IE"/>
+        </w:rPr>
+        <w:t>A staff member can record a single space as unavailable for a stated date and time range.</w:t>
+      </w:r>
+    </w:p>
+    <w:p>
+      <w:pPr>
+        <w:numPr>
+          <w:ilvl w:val="0"/>
+          <w:numId w:val="17"/>
+        </w:numPr>
+        <w:rPr>
+          <w:lang w:val="en-IE"/>
+        </w:rPr>
+      </w:pPr>
+      <w:r>
+        <w:rPr>
+          <w:lang w:val="en-IE"/>
+        </w:rPr>
+        <w:t>Each restriction has a reason: maintenance, inspection or community event.</w:t>
+      </w:r>
+    </w:p>
+    <w:p>
+      <w:pPr>
+        <w:numPr>
+          <w:ilvl w:val="0"/>
+          <w:numId w:val="17"/>
+        </w:numPr>
+        <w:rPr>
+          <w:lang w:val="en-IE"/>
+        </w:rPr>
+      </w:pPr>
+      <w:r>
+        <w:rPr>
+          <w:lang w:val="en-IE"/>
+        </w:rPr>
+        <w:t>A restriction without a date, a time range or a reason is not recorded.</w:t>
+      </w:r>
+    </w:p>
+    <w:p>
+      <w:pPr>
+        <w:numPr>
+          <w:ilvl w:val="0"/>
+          <w:numId w:val="17"/>
+        </w:numPr>
+        <w:rPr>
+          <w:lang w:val="en-US"/>
+        </w:rPr>
+      </w:pPr>
+      <w:r>
+        <w:rPr>
+          <w:lang w:val="en-IE"/>
+        </w:rPr>
+        <w:t>A restriction whose end is before its start is not recorded</w:t>
+      </w:r>
+      <w:r>
+        <w:rPr>
+          <w:lang w:val="en-IE"/>
+        </w:rPr>
+        <w:t>.</w:t>
+      </w:r>
+    </w:p>
+    <w:p>
+      <w:pPr>
+        <w:numPr>
+          <w:ilvl w:val="0"/>
+          <w:numId w:val="17"/>
+        </w:numPr>
+        <w:rPr>
+          <w:lang w:val="en-US"/>
+        </w:rPr>
+      </w:pPr>
+      <w:r>
+        <w:t>Only the selected space becomes unavailable. The other spaces of the same facility can still be booked for the</w:t>
+      </w:r>
+      <w:r>
+        <w:t xml:space="preserve"> same</w:t>
+      </w:r>
+      <w:r>
+        <w:t xml:space="preserve"> </w:t>
+      </w:r>
+      <w:r>
+        <w:t>date/time</w:t>
+      </w:r>
+      <w:r>
+        <w:t xml:space="preserve"> range</w:t>
+      </w:r>
+      <w:r>
+        <w:t>.</w:t>
+      </w:r>
+    </w:p>
+    <w:p>
+      <w:pPr>
+        <w:numPr>
+          <w:ilvl w:val="0"/>
+          <w:numId w:val="17"/>
+        </w:numPr>
+        <w:rPr>
+          <w:lang w:val="en-US"/>
+        </w:rPr>
+      </w:pPr>
+      <w:r>
+        <w:t xml:space="preserve">A booking request for </w:t>
+      </w:r>
+      <w:r>
+        <w:t xml:space="preserve">unavailable </w:t>
+      </w:r>
+      <w:r>
+        <w:t>space cannot be accepted.</w:t>
+      </w:r>
+    </w:p>
+    <w:p>
+      <w:pPr>
+        <w:numPr>
+          <w:ilvl w:val="0"/>
+          <w:numId w:val="17"/>
+        </w:numPr>
+        <w:rPr>
+          <w:lang w:val="en-US"/>
+        </w:rPr>
+      </w:pPr>
+      <w:r>
+        <w:t xml:space="preserve">The </w:t>
+      </w:r>
+      <w:r>
+        <w:t>unavailability of space</w:t>
+      </w:r>
+      <w:r>
+        <w:t xml:space="preserve"> is shown </w:t>
+      </w:r>
+      <w:r>
+        <w:t>for staff in one view</w:t>
+      </w:r>
+      <w:r>
+        <w:t xml:space="preserve">, so staff can see which spaces are </w:t>
+      </w:r>
+      <w:r>
+        <w:t>available</w:t>
+      </w:r>
+      <w:r>
+        <w:t xml:space="preserve"> without checking </w:t>
+      </w:r>
+      <w:r>
+        <w:t>multiple</w:t>
+      </w:r>
+      <w:r>
+        <w:t xml:space="preserve"> calendar</w:t>
+      </w:r>
+      <w:r>
+        <w:t>s</w:t>
+      </w:r>
+      <w:r>
+        <w:t>, spreadsheet</w:t>
+      </w:r>
+      <w:r>
+        <w:t>s</w:t>
+      </w:r>
+      <w:r>
+        <w:t xml:space="preserve"> or message</w:t>
+      </w:r>
+      <w:r>
+        <w:t>s.</w:t>
       </w:r>
     </w:p>
     <w:p>
@@ -25564,6 +26326,119 @@
     </w:lvl>
   </w:abstractNum>
   <w:abstractNum w:abstractNumId="3" w15:restartNumberingAfterBreak="0">
+    <w:nsid w:val="0BD52356"/>
+    <w:multiLevelType w:val="multilevel"/>
+    <w:tmpl w:val="92789B3E"/>
+    <w:lvl w:ilvl="0">
+      <w:start w:val="1"/>
+      <w:numFmt w:val="decimal"/>
+      <w:lvlText w:val="%1."/>
+      <w:lvlJc w:val="left"/>
+      <w:pPr>
+        <w:tabs>
+          <w:tab w:val="num" w:pos="720"/>
+        </w:tabs>
+        <w:ind w:left="720" w:hanging="360"/>
+      </w:pPr>
+    </w:lvl>
+    <w:lvl w:ilvl="1" w:tentative="1">
+      <w:start w:val="1"/>
+      <w:numFmt w:val="decimal"/>
+      <w:lvlText w:val="%2."/>
+      <w:lvlJc w:val="left"/>
+      <w:pPr>
+        <w:tabs>
+          <w:tab w:val="num" w:pos="1440"/>
+        </w:tabs>
+        <w:ind w:left="1440" w:hanging="360"/>
+      </w:pPr>
+    </w:lvl>
+    <w:lvl w:ilvl="2" w:tentative="1">
+      <w:start w:val="1"/>
+      <w:numFmt w:val="decimal"/>
+      <w:lvlText w:val="%3."/>
+      <w:lvlJc w:val="left"/>
+      <w:pPr>
+        <w:tabs>
+          <w:tab w:val="num" w:pos="2160"/>
+        </w:tabs>
+        <w:ind w:left="2160" w:hanging="360"/>
+      </w:pPr>
+    </w:lvl>
+    <w:lvl w:ilvl="3" w:tentative="1">
+      <w:start w:val="1"/>
+      <w:numFmt w:val="decimal"/>
+      <w:lvlText w:val="%4."/>
+      <w:lvlJc w:val="left"/>
+      <w:pPr>
+        <w:tabs>
+          <w:tab w:val="num" w:pos="2880"/>
+        </w:tabs>
+        <w:ind w:left="2880" w:hanging="360"/>
+      </w:pPr>
+    </w:lvl>
+    <w:lvl w:ilvl="4" w:tentative="1">
+      <w:start w:val="1"/>
+      <w:numFmt w:val="decimal"/>
+      <w:lvlText w:val="%5."/>
+      <w:lvlJc w:val="left"/>
+      <w:pPr>
+        <w:tabs>
+          <w:tab w:val="num" w:pos="3600"/>
+        </w:tabs>
+        <w:ind w:left="3600" w:hanging="360"/>
+      </w:pPr>
+    </w:lvl>
+    <w:lvl w:ilvl="5" w:tentative="1">
+      <w:start w:val="1"/>
+      <w:numFmt w:val="decimal"/>
+      <w:lvlText w:val="%6."/>
+      <w:lvlJc w:val="left"/>
+      <w:pPr>
+        <w:tabs>
+          <w:tab w:val="num" w:pos="4320"/>
+        </w:tabs>
+        <w:ind w:left="4320" w:hanging="360"/>
+      </w:pPr>
+    </w:lvl>
+    <w:lvl w:ilvl="6" w:tentative="1">
+      <w:start w:val="1"/>
+      <w:numFmt w:val="decimal"/>
+      <w:lvlText w:val="%7."/>
+      <w:lvlJc w:val="left"/>
+      <w:pPr>
+        <w:tabs>
+          <w:tab w:val="num" w:pos="5040"/>
+        </w:tabs>
+        <w:ind w:left="5040" w:hanging="360"/>
+      </w:pPr>
+    </w:lvl>
+    <w:lvl w:ilvl="7" w:tentative="1">
+      <w:start w:val="1"/>
+      <w:numFmt w:val="decimal"/>
+      <w:lvlText w:val="%8."/>
+      <w:lvlJc w:val="left"/>
+      <w:pPr>
+        <w:tabs>
+          <w:tab w:val="num" w:pos="5760"/>
+        </w:tabs>
+        <w:ind w:left="5760" w:hanging="360"/>
+      </w:pPr>
+    </w:lvl>
+    <w:lvl w:ilvl="8" w:tentative="1">
+      <w:start w:val="1"/>
+      <w:numFmt w:val="decimal"/>
+      <w:lvlText w:val="%9."/>
+      <w:lvlJc w:val="left"/>
+      <w:pPr>
+        <w:tabs>
+          <w:tab w:val="num" w:pos="6480"/>
+        </w:tabs>
+        <w:ind w:left="6480" w:hanging="360"/>
+      </w:pPr>
+    </w:lvl>
+  </w:abstractNum>
+  <w:abstractNum w:abstractNumId="4" w15:restartNumberingAfterBreak="0">
     <w:nsid w:val="1A82283C"/>
     <w:multiLevelType w:val="multilevel"/>
     <w:tmpl w:val="6A2C94E8"/>
@@ -25712,7 +26587,7 @@
       </w:rPr>
     </w:lvl>
   </w:abstractNum>
-  <w:abstractNum w:abstractNumId="4" w15:restartNumberingAfterBreak="0">
+  <w:abstractNum w:abstractNumId="5" w15:restartNumberingAfterBreak="0">
     <w:nsid w:val="1D1627DE"/>
     <w:multiLevelType w:val="hybridMultilevel"/>
     <w:tmpl w:val="4D0893F6"/>
@@ -25825,7 +26700,7 @@
       </w:rPr>
     </w:lvl>
   </w:abstractNum>
-  <w:abstractNum w:abstractNumId="5" w15:restartNumberingAfterBreak="0">
+  <w:abstractNum w:abstractNumId="6" w15:restartNumberingAfterBreak="0">
     <w:nsid w:val="30A27A3C"/>
     <w:multiLevelType w:val="multilevel"/>
     <w:tmpl w:val="3A1E100C"/>
@@ -25938,7 +26813,7 @@
       </w:pPr>
     </w:lvl>
   </w:abstractNum>
-  <w:abstractNum w:abstractNumId="6" w15:restartNumberingAfterBreak="0">
+  <w:abstractNum w:abstractNumId="7" w15:restartNumberingAfterBreak="0">
     <w:nsid w:val="35412C18"/>
     <w:multiLevelType w:val="multilevel"/>
     <w:tmpl w:val="93245EB4"/>
@@ -26051,7 +26926,120 @@
       </w:pPr>
     </w:lvl>
   </w:abstractNum>
-  <w:abstractNum w:abstractNumId="7" w15:restartNumberingAfterBreak="0">
+  <w:abstractNum w:abstractNumId="8" w15:restartNumberingAfterBreak="0">
+    <w:nsid w:val="3B3112E7"/>
+    <w:multiLevelType w:val="multilevel"/>
+    <w:tmpl w:val="A23A19A4"/>
+    <w:lvl w:ilvl="0">
+      <w:start w:val="1"/>
+      <w:numFmt w:val="decimal"/>
+      <w:lvlText w:val="%1."/>
+      <w:lvlJc w:val="left"/>
+      <w:pPr>
+        <w:tabs>
+          <w:tab w:val="num" w:pos="720"/>
+        </w:tabs>
+        <w:ind w:left="720" w:hanging="360"/>
+      </w:pPr>
+    </w:lvl>
+    <w:lvl w:ilvl="1" w:tentative="1">
+      <w:start w:val="1"/>
+      <w:numFmt w:val="decimal"/>
+      <w:lvlText w:val="%2."/>
+      <w:lvlJc w:val="left"/>
+      <w:pPr>
+        <w:tabs>
+          <w:tab w:val="num" w:pos="1440"/>
+        </w:tabs>
+        <w:ind w:left="1440" w:hanging="360"/>
+      </w:pPr>
+    </w:lvl>
+    <w:lvl w:ilvl="2" w:tentative="1">
+      <w:start w:val="1"/>
+      <w:numFmt w:val="decimal"/>
+      <w:lvlText w:val="%3."/>
+      <w:lvlJc w:val="left"/>
+      <w:pPr>
+        <w:tabs>
+          <w:tab w:val="num" w:pos="2160"/>
+        </w:tabs>
+        <w:ind w:left="2160" w:hanging="360"/>
+      </w:pPr>
+    </w:lvl>
+    <w:lvl w:ilvl="3" w:tentative="1">
+      <w:start w:val="1"/>
+      <w:numFmt w:val="decimal"/>
+      <w:lvlText w:val="%4."/>
+      <w:lvlJc w:val="left"/>
+      <w:pPr>
+        <w:tabs>
+          <w:tab w:val="num" w:pos="2880"/>
+        </w:tabs>
+        <w:ind w:left="2880" w:hanging="360"/>
+      </w:pPr>
+    </w:lvl>
+    <w:lvl w:ilvl="4" w:tentative="1">
+      <w:start w:val="1"/>
+      <w:numFmt w:val="decimal"/>
+      <w:lvlText w:val="%5."/>
+      <w:lvlJc w:val="left"/>
+      <w:pPr>
+        <w:tabs>
+          <w:tab w:val="num" w:pos="3600"/>
+        </w:tabs>
+        <w:ind w:left="3600" w:hanging="360"/>
+      </w:pPr>
+    </w:lvl>
+    <w:lvl w:ilvl="5" w:tentative="1">
+      <w:start w:val="1"/>
+      <w:numFmt w:val="decimal"/>
+      <w:lvlText w:val="%6."/>
+      <w:lvlJc w:val="left"/>
+      <w:pPr>
+        <w:tabs>
+          <w:tab w:val="num" w:pos="4320"/>
+        </w:tabs>
+        <w:ind w:left="4320" w:hanging="360"/>
+      </w:pPr>
+    </w:lvl>
+    <w:lvl w:ilvl="6" w:tentative="1">
+      <w:start w:val="1"/>
+      <w:numFmt w:val="decimal"/>
+      <w:lvlText w:val="%7."/>
+      <w:lvlJc w:val="left"/>
+      <w:pPr>
+        <w:tabs>
+          <w:tab w:val="num" w:pos="5040"/>
+        </w:tabs>
+        <w:ind w:left="5040" w:hanging="360"/>
+      </w:pPr>
+    </w:lvl>
+    <w:lvl w:ilvl="7" w:tentative="1">
+      <w:start w:val="1"/>
+      <w:numFmt w:val="decimal"/>
+      <w:lvlText w:val="%8."/>
+      <w:lvlJc w:val="left"/>
+      <w:pPr>
+        <w:tabs>
+          <w:tab w:val="num" w:pos="5760"/>
+        </w:tabs>
+        <w:ind w:left="5760" w:hanging="360"/>
+      </w:pPr>
+    </w:lvl>
+    <w:lvl w:ilvl="8" w:tentative="1">
+      <w:start w:val="1"/>
+      <w:numFmt w:val="decimal"/>
+      <w:lvlText w:val="%9."/>
+      <w:lvlJc w:val="left"/>
+      <w:pPr>
+        <w:tabs>
+          <w:tab w:val="num" w:pos="6480"/>
+        </w:tabs>
+        <w:ind w:left="6480" w:hanging="360"/>
+      </w:pPr>
+    </w:lvl>
+  </w:abstractNum>
+  <w:abstractNum w:abstractNumId="9" w15:restartNumberingAfterBreak="0">
     <w:nsid w:val="4A3D435B"/>
     <w:multiLevelType w:val="multilevel"/>
     <w:tmpl w:val="9328C7E8"/>
@@ -26164,7 +27152,7 @@
       </w:pPr>
     </w:lvl>
   </w:abstractNum>
-  <w:abstractNum w:abstractNumId="8" w15:restartNumberingAfterBreak="0">
+  <w:abstractNum w:abstractNumId="10" w15:restartNumberingAfterBreak="0">
     <w:nsid w:val="4E8A4D7D"/>
     <w:multiLevelType w:val="multilevel"/>
     <w:tmpl w:val="E2685908"/>
@@ -26309,7 +27297,7 @@
       </w:rPr>
     </w:lvl>
   </w:abstractNum>
-  <w:abstractNum w:abstractNumId="9" w15:restartNumberingAfterBreak="0">
+  <w:abstractNum w:abstractNumId="11" w15:restartNumberingAfterBreak="0">
     <w:nsid w:val="4ED57530"/>
     <w:multiLevelType w:val="multilevel"/>
     <w:tmpl w:val="12E2DC1E"/>
@@ -26458,7 +27446,7 @@
       </w:rPr>
     </w:lvl>
   </w:abstractNum>
-  <w:abstractNum w:abstractNumId="10" w15:restartNumberingAfterBreak="0">
+  <w:abstractNum w:abstractNumId="12" w15:restartNumberingAfterBreak="0">
     <w:nsid w:val="58A153AA"/>
     <w:multiLevelType w:val="multilevel"/>
     <w:tmpl w:val="EFD4339E"/>
@@ -26571,7 +27559,7 @@
       </w:pPr>
     </w:lvl>
   </w:abstractNum>
-  <w:abstractNum w:abstractNumId="11" w15:restartNumberingAfterBreak="0">
+  <w:abstractNum w:abstractNumId="13" w15:restartNumberingAfterBreak="0">
     <w:nsid w:val="69B92D51"/>
     <w:multiLevelType w:val="hybridMultilevel"/>
     <w:tmpl w:val="C67E6928"/>
@@ -26660,7 +27648,7 @@
       </w:pPr>
     </w:lvl>
   </w:abstractNum>
-  <w:abstractNum w:abstractNumId="12" w15:restartNumberingAfterBreak="0">
+  <w:abstractNum w:abstractNumId="14" w15:restartNumberingAfterBreak="0">
     <w:nsid w:val="6A285327"/>
     <w:multiLevelType w:val="multilevel"/>
     <w:tmpl w:val="7100858A"/>
@@ -26809,7 +27797,7 @@
       </w:rPr>
     </w:lvl>
   </w:abstractNum>
-  <w:abstractNum w:abstractNumId="13" w15:restartNumberingAfterBreak="0">
+  <w:abstractNum w:abstractNumId="15" w15:restartNumberingAfterBreak="0">
     <w:nsid w:val="6BAFC6A3"/>
     <w:multiLevelType w:val="hybridMultilevel"/>
     <w:tmpl w:val="D7FA3EF8"/>
@@ -26922,7 +27910,7 @@
       </w:rPr>
     </w:lvl>
   </w:abstractNum>
-  <w:abstractNum w:abstractNumId="14" w15:restartNumberingAfterBreak="0">
+  <w:abstractNum w:abstractNumId="16" w15:restartNumberingAfterBreak="0">
     <w:nsid w:val="72BC6B69"/>
     <w:multiLevelType w:val="multilevel"/>
     <w:tmpl w:val="D27801C6"/>
@@ -27071,50 +28059,172 @@
       </w:rPr>
     </w:lvl>
   </w:abstractNum>
+  <w:abstractNum w:abstractNumId="17" w15:restartNumberingAfterBreak="0">
+    <w:nsid w:val="7AB957F6"/>
+    <w:multiLevelType w:val="multilevel"/>
+    <w:tmpl w:val="5D2CD67A"/>
+    <w:lvl w:ilvl="0">
+      <w:start w:val="1"/>
+      <w:numFmt w:val="decimal"/>
+      <w:lvlText w:val="%1."/>
+      <w:lvlJc w:val="left"/>
+      <w:pPr>
+        <w:tabs>
+          <w:tab w:val="num" w:pos="720"/>
+        </w:tabs>
+        <w:ind w:left="720" w:hanging="360"/>
+      </w:pPr>
+    </w:lvl>
+    <w:lvl w:ilvl="1" w:tentative="1">
+      <w:start w:val="1"/>
+      <w:numFmt w:val="decimal"/>
+      <w:lvlText w:val="%2."/>
+      <w:lvlJc w:val="left"/>
+      <w:pPr>
+        <w:tabs>
+          <w:tab w:val="num" w:pos="1440"/>
+        </w:tabs>
+        <w:ind w:left="1440" w:hanging="360"/>
+      </w:pPr>
+    </w:lvl>
+    <w:lvl w:ilvl="2" w:tentative="1">
+      <w:start w:val="1"/>
+      <w:numFmt w:val="decimal"/>
+      <w:lvlText w:val="%3."/>
+      <w:lvlJc w:val="left"/>
+      <w:pPr>
+        <w:tabs>
+          <w:tab w:val="num" w:pos="2160"/>
+        </w:tabs>
+        <w:ind w:left="2160" w:hanging="360"/>
+      </w:pPr>
+    </w:lvl>
+    <w:lvl w:ilvl="3" w:tentative="1">
+      <w:start w:val="1"/>
+      <w:numFmt w:val="decimal"/>
+      <w:lvlText w:val="%4."/>
+      <w:lvlJc w:val="left"/>
+      <w:pPr>
+        <w:tabs>
+          <w:tab w:val="num" w:pos="2880"/>
+        </w:tabs>
+        <w:ind w:left="2880" w:hanging="360"/>
+      </w:pPr>
+    </w:lvl>
+    <w:lvl w:ilvl="4" w:tentative="1">
+      <w:start w:val="1"/>
+      <w:numFmt w:val="decimal"/>
+      <w:lvlText w:val="%5."/>
+      <w:lvlJc w:val="left"/>
+      <w:pPr>
+        <w:tabs>
+          <w:tab w:val="num" w:pos="3600"/>
+        </w:tabs>
+        <w:ind w:left="3600" w:hanging="360"/>
+      </w:pPr>
+    </w:lvl>
+    <w:lvl w:ilvl="5" w:tentative="1">
+      <w:start w:val="1"/>
+      <w:numFmt w:val="decimal"/>
+      <w:lvlText w:val="%6."/>
+      <w:lvlJc w:val="left"/>
+      <w:pPr>
+        <w:tabs>
+          <w:tab w:val="num" w:pos="4320"/>
+        </w:tabs>
+        <w:ind w:left="4320" w:hanging="360"/>
+      </w:pPr>
+    </w:lvl>
+    <w:lvl w:ilvl="6" w:tentative="1">
+      <w:start w:val="1"/>
+      <w:numFmt w:val="decimal"/>
+      <w:lvlText w:val="%7."/>
+      <w:lvlJc w:val="left"/>
+      <w:pPr>
+        <w:tabs>
+          <w:tab w:val="num" w:pos="5040"/>
+        </w:tabs>
+        <w:ind w:left="5040" w:hanging="360"/>
+      </w:pPr>
+    </w:lvl>
+    <w:lvl w:ilvl="7" w:tentative="1">
+      <w:start w:val="1"/>
+      <w:numFmt w:val="decimal"/>
+      <w:lvlText w:val="%8."/>
+      <w:lvlJc w:val="left"/>
+      <w:pPr>
+        <w:tabs>
+          <w:tab w:val="num" w:pos="5760"/>
+        </w:tabs>
+        <w:ind w:left="5760" w:hanging="360"/>
+      </w:pPr>
+    </w:lvl>
+    <w:lvl w:ilvl="8" w:tentative="1">
+      <w:start w:val="1"/>
+      <w:numFmt w:val="decimal"/>
+      <w:lvlText w:val="%9."/>
+      <w:lvlJc w:val="left"/>
+      <w:pPr>
+        <w:tabs>
+          <w:tab w:val="num" w:pos="6480"/>
+        </w:tabs>
+        <w:ind w:left="6480" w:hanging="360"/>
+      </w:pPr>
+    </w:lvl>
+  </w:abstractNum>
   <w:num w:numId="1" w16cid:durableId="1988513788">
-    <w:abstractNumId w:val="13"/>
+    <w:abstractNumId w:val="15"/>
   </w:num>
   <w:num w:numId="2" w16cid:durableId="1954048636">
-    <w:abstractNumId w:val="4"/>
+    <w:abstractNumId w:val="5"/>
   </w:num>
   <w:num w:numId="3" w16cid:durableId="798063922">
     <w:abstractNumId w:val="1"/>
   </w:num>
   <w:num w:numId="4" w16cid:durableId="1256355102">
-    <w:abstractNumId w:val="11"/>
+    <w:abstractNumId w:val="13"/>
   </w:num>
   <w:num w:numId="5" w16cid:durableId="1333290582">
-    <w:abstractNumId w:val="6"/>
+    <w:abstractNumId w:val="7"/>
   </w:num>
   <w:num w:numId="6" w16cid:durableId="1175876586">
-    <w:abstractNumId w:val="7"/>
+    <w:abstractNumId w:val="9"/>
   </w:num>
   <w:num w:numId="7" w16cid:durableId="1862891778">
-    <w:abstractNumId w:val="5"/>
+    <w:abstractNumId w:val="6"/>
   </w:num>
   <w:num w:numId="8" w16cid:durableId="190148220">
     <w:abstractNumId w:val="2"/>
   </w:num>
   <w:num w:numId="9" w16cid:durableId="1578441775">
-    <w:abstractNumId w:val="10"/>
+    <w:abstractNumId w:val="12"/>
   </w:num>
   <w:num w:numId="10" w16cid:durableId="1059524348">
-    <w:abstractNumId w:val="12"/>
+    <w:abstractNumId w:val="14"/>
   </w:num>
   <w:num w:numId="11" w16cid:durableId="2132630933">
     <w:abstractNumId w:val="0"/>
   </w:num>
   <w:num w:numId="12" w16cid:durableId="684596052">
-    <w:abstractNumId w:val="14"/>
+    <w:abstractNumId w:val="16"/>
   </w:num>
   <w:num w:numId="13" w16cid:durableId="1996295090">
+    <w:abstractNumId w:val="4"/>
+  </w:num>
+  <w:num w:numId="14" w16cid:durableId="281544832">
+    <w:abstractNumId w:val="10"/>
+  </w:num>
+  <w:num w:numId="15" w16cid:durableId="180553793">
+    <w:abstractNumId w:val="11"/>
+  </w:num>
+  <w:num w:numId="16" w16cid:durableId="1200480">
     <w:abstractNumId w:val="3"/>
   </w:num>
-  <w:num w:numId="14" w16cid:durableId="281544832">
+  <w:num w:numId="17" w16cid:durableId="311645926">
     <w:abstractNumId w:val="8"/>
   </w:num>
-  <w:num w:numId="15" w16cid:durableId="180553793">
-    <w:abstractNumId w:val="9"/>
+  <w:num w:numId="18" w16cid:durableId="1400909432">
+    <w:abstractNumId w:val="17"/>
   </w:num>
 </w:numbering>
 </file>

</xml_diff>